<commit_message>
feat: add selforganized committees special rules to documents #BKDO-2475
</commit_message>
<xml_diff>
--- a/src/Bk.APG.Api/Templates/Appendix_FederalCouncil_French.docx
+++ b/src/Bk.APG.Api/Templates/Appendix_FederalCouncil_French.docx
@@ -134,16 +134,7 @@
           <w:szCs w:val="24"/>
           <w:lang w:val="fr-CH"/>
         </w:rPr>
-        <w:t>Ber</w:t>
-      </w:r>
-      <w:r>
-        <w:rPr>
-          <w:rFonts w:ascii="Times New Roman" w:hAnsi="Times New Roman"/>
-          <w:noProof/>
-          <w:szCs w:val="24"/>
-          <w:lang w:val="fr-CH"/>
-        </w:rPr>
-        <w:t>ne</w:t>
+        <w:t>Bern</w:t>
       </w:r>
       <w:r>
         <w:rPr>
@@ -350,7 +341,7 @@
       <w:pPr>
         <w:pStyle w:val="Verzeichnis1"/>
         <w:rPr>
-          <w:rFonts w:ascii="Times New Roman" w:eastAsiaTheme="minorEastAsia" w:hAnsi="Times New Roman" w:cs="Times New Roman"/>
+          <w:rFonts w:eastAsiaTheme="minorEastAsia" w:cstheme="minorBidi"/>
           <w:b w:val="0"/>
           <w:bCs w:val="0"/>
           <w:noProof/>
@@ -384,7 +375,7 @@
         </w:rPr>
         <w:fldChar w:fldCharType="separate"/>
       </w:r>
-      <w:hyperlink w:anchor="_Toc209680927" w:history="1">
+      <w:hyperlink w:anchor="_Toc228517438" w:history="1">
         <w:r>
           <w:rPr>
             <w:rStyle w:val="Hyperlink"/>
@@ -395,7 +386,7 @@
         </w:r>
         <w:r>
           <w:rPr>
-            <w:rFonts w:ascii="Times New Roman" w:eastAsiaTheme="minorEastAsia" w:hAnsi="Times New Roman" w:cs="Times New Roman"/>
+            <w:rFonts w:eastAsiaTheme="minorEastAsia" w:cstheme="minorBidi"/>
             <w:b w:val="0"/>
             <w:bCs w:val="0"/>
             <w:noProof/>
@@ -411,12 +402,12 @@
             <w:rStyle w:val="Hyperlink"/>
             <w:rFonts w:ascii="Times New Roman" w:hAnsi="Times New Roman" w:cs="Times New Roman"/>
             <w:noProof/>
-          </w:rPr>
-          <w:t>Aufgehobene oder zusammengefasste Gremien</w:t>
-        </w:r>
-        <w:r>
-          <w:rPr>
-            <w:rFonts w:ascii="Times New Roman" w:hAnsi="Times New Roman" w:cs="Times New Roman"/>
+            <w:lang w:val="fr-CH"/>
+          </w:rPr>
+          <w:t>Organes dissous ou regroupés</w:t>
+        </w:r>
+        <w:r>
+          <w:rPr>
             <w:noProof/>
             <w:webHidden/>
           </w:rPr>
@@ -424,7 +415,6 @@
         </w:r>
         <w:r>
           <w:rPr>
-            <w:rFonts w:ascii="Times New Roman" w:hAnsi="Times New Roman" w:cs="Times New Roman"/>
             <w:noProof/>
             <w:webHidden/>
           </w:rPr>
@@ -432,22 +422,19 @@
         </w:r>
         <w:r>
           <w:rPr>
-            <w:rFonts w:ascii="Times New Roman" w:hAnsi="Times New Roman" w:cs="Times New Roman"/>
-            <w:noProof/>
-            <w:webHidden/>
-          </w:rPr>
-          <w:instrText xml:space="preserve"> PAGEREF _Toc209680927 \h </w:instrText>
-        </w:r>
-        <w:r>
-          <w:rPr>
-            <w:rFonts w:ascii="Times New Roman" w:hAnsi="Times New Roman" w:cs="Times New Roman"/>
-            <w:noProof/>
-            <w:webHidden/>
-          </w:rPr>
-        </w:r>
-        <w:r>
-          <w:rPr>
-            <w:rFonts w:ascii="Times New Roman" w:hAnsi="Times New Roman" w:cs="Times New Roman"/>
+            <w:noProof/>
+            <w:webHidden/>
+          </w:rPr>
+          <w:instrText xml:space="preserve"> PAGEREF _Toc228517438 \h </w:instrText>
+        </w:r>
+        <w:r>
+          <w:rPr>
+            <w:noProof/>
+            <w:webHidden/>
+          </w:rPr>
+        </w:r>
+        <w:r>
+          <w:rPr>
             <w:noProof/>
             <w:webHidden/>
           </w:rPr>
@@ -455,7 +442,6 @@
         </w:r>
         <w:r>
           <w:rPr>
-            <w:rFonts w:ascii="Times New Roman" w:hAnsi="Times New Roman" w:cs="Times New Roman"/>
             <w:noProof/>
             <w:webHidden/>
           </w:rPr>
@@ -463,7 +449,6 @@
         </w:r>
         <w:r>
           <w:rPr>
-            <w:rFonts w:ascii="Times New Roman" w:hAnsi="Times New Roman" w:cs="Times New Roman"/>
             <w:noProof/>
             <w:webHidden/>
           </w:rPr>
@@ -479,7 +464,7 @@
           <w:tab w:val="right" w:leader="dot" w:pos="9061"/>
         </w:tabs>
         <w:rPr>
-          <w:rFonts w:ascii="Times New Roman" w:eastAsiaTheme="minorEastAsia" w:hAnsi="Times New Roman" w:cs="Times New Roman"/>
+          <w:rFonts w:eastAsiaTheme="minorEastAsia" w:cstheme="minorBidi"/>
           <w:i w:val="0"/>
           <w:iCs w:val="0"/>
           <w:noProof/>
@@ -489,18 +474,19 @@
           <w14:ligatures w14:val="standardContextual"/>
         </w:rPr>
       </w:pPr>
-      <w:hyperlink w:anchor="_Toc209680928" w:history="1">
+      <w:hyperlink w:anchor="_Toc228517439" w:history="1">
         <w:r>
           <w:rPr>
             <w:rStyle w:val="Hyperlink"/>
             <w:rFonts w:ascii="Times New Roman" w:hAnsi="Times New Roman" w:cs="Times New Roman"/>
             <w:noProof/>
+            <w:lang w:val="fr-CH"/>
           </w:rPr>
           <w:t>1.1</w:t>
         </w:r>
         <w:r>
           <w:rPr>
-            <w:rFonts w:ascii="Times New Roman" w:eastAsiaTheme="minorEastAsia" w:hAnsi="Times New Roman" w:cs="Times New Roman"/>
+            <w:rFonts w:eastAsiaTheme="minorEastAsia" w:cstheme="minorBidi"/>
             <w:i w:val="0"/>
             <w:iCs w:val="0"/>
             <w:noProof/>
@@ -516,20 +502,12 @@
             <w:rStyle w:val="Hyperlink"/>
             <w:rFonts w:ascii="Times New Roman" w:hAnsi="Times New Roman" w:cs="Times New Roman"/>
             <w:noProof/>
-          </w:rPr>
-          <w:t>Domaine de compétence</w:t>
-        </w:r>
-        <w:r>
-          <w:rPr>
-            <w:rStyle w:val="Hyperlink"/>
-            <w:rFonts w:ascii="Times New Roman" w:hAnsi="Times New Roman" w:cs="Times New Roman"/>
-            <w:noProof/>
-          </w:rPr>
-          <w:t xml:space="preserve"> &lt;&lt;[department.name]&gt;&gt;</w:t>
-        </w:r>
-        <w:r>
-          <w:rPr>
-            <w:rFonts w:ascii="Times New Roman" w:hAnsi="Times New Roman" w:cs="Times New Roman"/>
+            <w:lang w:val="fr-CH"/>
+          </w:rPr>
+          <w:t>Domaine de compétence &lt;&lt;[department.name]&gt;&gt;</w:t>
+        </w:r>
+        <w:r>
+          <w:rPr>
             <w:noProof/>
             <w:webHidden/>
           </w:rPr>
@@ -537,7 +515,6 @@
         </w:r>
         <w:r>
           <w:rPr>
-            <w:rFonts w:ascii="Times New Roman" w:hAnsi="Times New Roman" w:cs="Times New Roman"/>
             <w:noProof/>
             <w:webHidden/>
           </w:rPr>
@@ -545,22 +522,19 @@
         </w:r>
         <w:r>
           <w:rPr>
-            <w:rFonts w:ascii="Times New Roman" w:hAnsi="Times New Roman" w:cs="Times New Roman"/>
-            <w:noProof/>
-            <w:webHidden/>
-          </w:rPr>
-          <w:instrText xml:space="preserve"> PAGEREF _Toc209680928 \h </w:instrText>
-        </w:r>
-        <w:r>
-          <w:rPr>
-            <w:rFonts w:ascii="Times New Roman" w:hAnsi="Times New Roman" w:cs="Times New Roman"/>
-            <w:noProof/>
-            <w:webHidden/>
-          </w:rPr>
-        </w:r>
-        <w:r>
-          <w:rPr>
-            <w:rFonts w:ascii="Times New Roman" w:hAnsi="Times New Roman" w:cs="Times New Roman"/>
+            <w:noProof/>
+            <w:webHidden/>
+          </w:rPr>
+          <w:instrText xml:space="preserve"> PAGEREF _Toc228517439 \h </w:instrText>
+        </w:r>
+        <w:r>
+          <w:rPr>
+            <w:noProof/>
+            <w:webHidden/>
+          </w:rPr>
+        </w:r>
+        <w:r>
+          <w:rPr>
             <w:noProof/>
             <w:webHidden/>
           </w:rPr>
@@ -568,7 +542,6 @@
         </w:r>
         <w:r>
           <w:rPr>
-            <w:rFonts w:ascii="Times New Roman" w:hAnsi="Times New Roman" w:cs="Times New Roman"/>
             <w:noProof/>
             <w:webHidden/>
           </w:rPr>
@@ -576,7 +549,6 @@
         </w:r>
         <w:r>
           <w:rPr>
-            <w:rFonts w:ascii="Times New Roman" w:hAnsi="Times New Roman" w:cs="Times New Roman"/>
             <w:noProof/>
             <w:webHidden/>
           </w:rPr>
@@ -588,7 +560,7 @@
       <w:pPr>
         <w:pStyle w:val="Verzeichnis1"/>
         <w:rPr>
-          <w:rFonts w:ascii="Times New Roman" w:eastAsiaTheme="minorEastAsia" w:hAnsi="Times New Roman" w:cs="Times New Roman"/>
+          <w:rFonts w:eastAsiaTheme="minorEastAsia" w:cstheme="minorBidi"/>
           <w:b w:val="0"/>
           <w:bCs w:val="0"/>
           <w:noProof/>
@@ -598,18 +570,19 @@
           <w14:ligatures w14:val="standardContextual"/>
         </w:rPr>
       </w:pPr>
-      <w:hyperlink w:anchor="_Toc209680929" w:history="1">
+      <w:hyperlink w:anchor="_Toc228517440" w:history="1">
         <w:r>
           <w:rPr>
             <w:rStyle w:val="Hyperlink"/>
             <w:rFonts w:ascii="Times New Roman" w:hAnsi="Times New Roman" w:cs="Times New Roman"/>
             <w:noProof/>
+            <w:lang w:val="fr-CH"/>
           </w:rPr>
           <w:t>2</w:t>
         </w:r>
         <w:r>
           <w:rPr>
-            <w:rFonts w:ascii="Times New Roman" w:eastAsiaTheme="minorEastAsia" w:hAnsi="Times New Roman" w:cs="Times New Roman"/>
+            <w:rFonts w:eastAsiaTheme="minorEastAsia" w:cstheme="minorBidi"/>
             <w:b w:val="0"/>
             <w:bCs w:val="0"/>
             <w:noProof/>
@@ -625,12 +598,12 @@
             <w:rStyle w:val="Hyperlink"/>
             <w:rFonts w:ascii="Times New Roman" w:hAnsi="Times New Roman" w:cs="Times New Roman"/>
             <w:noProof/>
-          </w:rPr>
-          <w:t>Umfang der Gesamterneuerungswahlen und erfasste Gremien</w:t>
-        </w:r>
-        <w:r>
-          <w:rPr>
-            <w:rFonts w:ascii="Times New Roman" w:hAnsi="Times New Roman" w:cs="Times New Roman"/>
+            <w:lang w:val="fr-CH"/>
+          </w:rPr>
+          <w:t>Organes dont les membres ont été nommés à l’occasion du renouvellement intégral</w:t>
+        </w:r>
+        <w:r>
+          <w:rPr>
             <w:noProof/>
             <w:webHidden/>
           </w:rPr>
@@ -638,7 +611,6 @@
         </w:r>
         <w:r>
           <w:rPr>
-            <w:rFonts w:ascii="Times New Roman" w:hAnsi="Times New Roman" w:cs="Times New Roman"/>
             <w:noProof/>
             <w:webHidden/>
           </w:rPr>
@@ -646,22 +618,19 @@
         </w:r>
         <w:r>
           <w:rPr>
-            <w:rFonts w:ascii="Times New Roman" w:hAnsi="Times New Roman" w:cs="Times New Roman"/>
-            <w:noProof/>
-            <w:webHidden/>
-          </w:rPr>
-          <w:instrText xml:space="preserve"> PAGEREF _Toc209680929 \h </w:instrText>
-        </w:r>
-        <w:r>
-          <w:rPr>
-            <w:rFonts w:ascii="Times New Roman" w:hAnsi="Times New Roman" w:cs="Times New Roman"/>
-            <w:noProof/>
-            <w:webHidden/>
-          </w:rPr>
-        </w:r>
-        <w:r>
-          <w:rPr>
-            <w:rFonts w:ascii="Times New Roman" w:hAnsi="Times New Roman" w:cs="Times New Roman"/>
+            <w:noProof/>
+            <w:webHidden/>
+          </w:rPr>
+          <w:instrText xml:space="preserve"> PAGEREF _Toc228517440 \h </w:instrText>
+        </w:r>
+        <w:r>
+          <w:rPr>
+            <w:noProof/>
+            <w:webHidden/>
+          </w:rPr>
+        </w:r>
+        <w:r>
+          <w:rPr>
             <w:noProof/>
             <w:webHidden/>
           </w:rPr>
@@ -669,7 +638,6 @@
         </w:r>
         <w:r>
           <w:rPr>
-            <w:rFonts w:ascii="Times New Roman" w:hAnsi="Times New Roman" w:cs="Times New Roman"/>
             <w:noProof/>
             <w:webHidden/>
           </w:rPr>
@@ -677,7 +645,6 @@
         </w:r>
         <w:r>
           <w:rPr>
-            <w:rFonts w:ascii="Times New Roman" w:hAnsi="Times New Roman" w:cs="Times New Roman"/>
             <w:noProof/>
             <w:webHidden/>
           </w:rPr>
@@ -693,7 +660,7 @@
           <w:tab w:val="right" w:leader="dot" w:pos="9061"/>
         </w:tabs>
         <w:rPr>
-          <w:rFonts w:ascii="Times New Roman" w:eastAsiaTheme="minorEastAsia" w:hAnsi="Times New Roman" w:cs="Times New Roman"/>
+          <w:rFonts w:eastAsiaTheme="minorEastAsia" w:cstheme="minorBidi"/>
           <w:i w:val="0"/>
           <w:iCs w:val="0"/>
           <w:noProof/>
@@ -703,18 +670,19 @@
           <w14:ligatures w14:val="standardContextual"/>
         </w:rPr>
       </w:pPr>
-      <w:hyperlink w:anchor="_Toc209680930" w:history="1">
+      <w:hyperlink w:anchor="_Toc228517441" w:history="1">
         <w:r>
           <w:rPr>
             <w:rStyle w:val="Hyperlink"/>
             <w:rFonts w:ascii="Times New Roman" w:hAnsi="Times New Roman" w:cs="Times New Roman"/>
             <w:noProof/>
+            <w:lang w:val="fr-CH"/>
           </w:rPr>
           <w:t>2.1</w:t>
         </w:r>
         <w:r>
           <w:rPr>
-            <w:rFonts w:ascii="Times New Roman" w:eastAsiaTheme="minorEastAsia" w:hAnsi="Times New Roman" w:cs="Times New Roman"/>
+            <w:rFonts w:eastAsiaTheme="minorEastAsia" w:cstheme="minorBidi"/>
             <w:i w:val="0"/>
             <w:iCs w:val="0"/>
             <w:noProof/>
@@ -730,20 +698,12 @@
             <w:rStyle w:val="Hyperlink"/>
             <w:rFonts w:ascii="Times New Roman" w:hAnsi="Times New Roman" w:cs="Times New Roman"/>
             <w:noProof/>
-          </w:rPr>
-          <w:t>Domaine de compétence</w:t>
-        </w:r>
-        <w:r>
-          <w:rPr>
-            <w:rStyle w:val="Hyperlink"/>
-            <w:rFonts w:ascii="Times New Roman" w:hAnsi="Times New Roman" w:cs="Times New Roman"/>
-            <w:noProof/>
-          </w:rPr>
-          <w:t xml:space="preserve"> &lt;&lt;[department.name]&gt;&gt;</w:t>
-        </w:r>
-        <w:r>
-          <w:rPr>
-            <w:rFonts w:ascii="Times New Roman" w:hAnsi="Times New Roman" w:cs="Times New Roman"/>
+            <w:lang w:val="fr-CH"/>
+          </w:rPr>
+          <w:t>Domaine de compétence &lt;&lt;[department.name]&gt;&gt;</w:t>
+        </w:r>
+        <w:r>
+          <w:rPr>
             <w:noProof/>
             <w:webHidden/>
           </w:rPr>
@@ -751,7 +711,6 @@
         </w:r>
         <w:r>
           <w:rPr>
-            <w:rFonts w:ascii="Times New Roman" w:hAnsi="Times New Roman" w:cs="Times New Roman"/>
             <w:noProof/>
             <w:webHidden/>
           </w:rPr>
@@ -759,22 +718,19 @@
         </w:r>
         <w:r>
           <w:rPr>
-            <w:rFonts w:ascii="Times New Roman" w:hAnsi="Times New Roman" w:cs="Times New Roman"/>
-            <w:noProof/>
-            <w:webHidden/>
-          </w:rPr>
-          <w:instrText xml:space="preserve"> PAGEREF _Toc209680930 \h </w:instrText>
-        </w:r>
-        <w:r>
-          <w:rPr>
-            <w:rFonts w:ascii="Times New Roman" w:hAnsi="Times New Roman" w:cs="Times New Roman"/>
-            <w:noProof/>
-            <w:webHidden/>
-          </w:rPr>
-        </w:r>
-        <w:r>
-          <w:rPr>
-            <w:rFonts w:ascii="Times New Roman" w:hAnsi="Times New Roman" w:cs="Times New Roman"/>
+            <w:noProof/>
+            <w:webHidden/>
+          </w:rPr>
+          <w:instrText xml:space="preserve"> PAGEREF _Toc228517441 \h </w:instrText>
+        </w:r>
+        <w:r>
+          <w:rPr>
+            <w:noProof/>
+            <w:webHidden/>
+          </w:rPr>
+        </w:r>
+        <w:r>
+          <w:rPr>
             <w:noProof/>
             <w:webHidden/>
           </w:rPr>
@@ -782,7 +738,6 @@
         </w:r>
         <w:r>
           <w:rPr>
-            <w:rFonts w:ascii="Times New Roman" w:hAnsi="Times New Roman" w:cs="Times New Roman"/>
             <w:noProof/>
             <w:webHidden/>
           </w:rPr>
@@ -790,7 +745,6 @@
         </w:r>
         <w:r>
           <w:rPr>
-            <w:rFonts w:ascii="Times New Roman" w:hAnsi="Times New Roman" w:cs="Times New Roman"/>
             <w:noProof/>
             <w:webHidden/>
           </w:rPr>
@@ -802,7 +756,7 @@
       <w:pPr>
         <w:pStyle w:val="Verzeichnis1"/>
         <w:rPr>
-          <w:rFonts w:ascii="Times New Roman" w:eastAsiaTheme="minorEastAsia" w:hAnsi="Times New Roman" w:cs="Times New Roman"/>
+          <w:rFonts w:eastAsiaTheme="minorEastAsia" w:cstheme="minorBidi"/>
           <w:b w:val="0"/>
           <w:bCs w:val="0"/>
           <w:noProof/>
@@ -812,18 +766,19 @@
           <w14:ligatures w14:val="standardContextual"/>
         </w:rPr>
       </w:pPr>
-      <w:hyperlink w:anchor="_Toc209680931" w:history="1">
+      <w:hyperlink w:anchor="_Toc228517442" w:history="1">
         <w:r>
           <w:rPr>
             <w:rStyle w:val="Hyperlink"/>
             <w:rFonts w:ascii="Times New Roman" w:hAnsi="Times New Roman" w:cs="Times New Roman"/>
             <w:noProof/>
+            <w:lang w:val="fr-CH"/>
           </w:rPr>
           <w:t>3</w:t>
         </w:r>
         <w:r>
           <w:rPr>
-            <w:rFonts w:ascii="Times New Roman" w:eastAsiaTheme="minorEastAsia" w:hAnsi="Times New Roman" w:cs="Times New Roman"/>
+            <w:rFonts w:eastAsiaTheme="minorEastAsia" w:cstheme="minorBidi"/>
             <w:b w:val="0"/>
             <w:bCs w:val="0"/>
             <w:noProof/>
@@ -839,12 +794,12 @@
             <w:rStyle w:val="Hyperlink"/>
             <w:rFonts w:ascii="Times New Roman" w:hAnsi="Times New Roman" w:cs="Times New Roman"/>
             <w:noProof/>
-          </w:rPr>
-          <w:t>Nichtbestellung einzelner Gremien</w:t>
-        </w:r>
-        <w:r>
-          <w:rPr>
-            <w:rFonts w:ascii="Times New Roman" w:hAnsi="Times New Roman" w:cs="Times New Roman"/>
+            <w:lang w:val="fr-CH"/>
+          </w:rPr>
+          <w:t>Organes dont les membres n’ont pas été nommés ou ont été nommés plus tard</w:t>
+        </w:r>
+        <w:r>
+          <w:rPr>
             <w:noProof/>
             <w:webHidden/>
           </w:rPr>
@@ -852,7 +807,6 @@
         </w:r>
         <w:r>
           <w:rPr>
-            <w:rFonts w:ascii="Times New Roman" w:hAnsi="Times New Roman" w:cs="Times New Roman"/>
             <w:noProof/>
             <w:webHidden/>
           </w:rPr>
@@ -860,22 +814,19 @@
         </w:r>
         <w:r>
           <w:rPr>
-            <w:rFonts w:ascii="Times New Roman" w:hAnsi="Times New Roman" w:cs="Times New Roman"/>
-            <w:noProof/>
-            <w:webHidden/>
-          </w:rPr>
-          <w:instrText xml:space="preserve"> PAGEREF _Toc209680931 \h </w:instrText>
-        </w:r>
-        <w:r>
-          <w:rPr>
-            <w:rFonts w:ascii="Times New Roman" w:hAnsi="Times New Roman" w:cs="Times New Roman"/>
-            <w:noProof/>
-            <w:webHidden/>
-          </w:rPr>
-        </w:r>
-        <w:r>
-          <w:rPr>
-            <w:rFonts w:ascii="Times New Roman" w:hAnsi="Times New Roman" w:cs="Times New Roman"/>
+            <w:noProof/>
+            <w:webHidden/>
+          </w:rPr>
+          <w:instrText xml:space="preserve"> PAGEREF _Toc228517442 \h </w:instrText>
+        </w:r>
+        <w:r>
+          <w:rPr>
+            <w:noProof/>
+            <w:webHidden/>
+          </w:rPr>
+        </w:r>
+        <w:r>
+          <w:rPr>
             <w:noProof/>
             <w:webHidden/>
           </w:rPr>
@@ -883,7 +834,6 @@
         </w:r>
         <w:r>
           <w:rPr>
-            <w:rFonts w:ascii="Times New Roman" w:hAnsi="Times New Roman" w:cs="Times New Roman"/>
             <w:noProof/>
             <w:webHidden/>
           </w:rPr>
@@ -891,7 +841,6 @@
         </w:r>
         <w:r>
           <w:rPr>
-            <w:rFonts w:ascii="Times New Roman" w:hAnsi="Times New Roman" w:cs="Times New Roman"/>
             <w:noProof/>
             <w:webHidden/>
           </w:rPr>
@@ -907,7 +856,7 @@
           <w:tab w:val="right" w:leader="dot" w:pos="9061"/>
         </w:tabs>
         <w:rPr>
-          <w:rFonts w:ascii="Times New Roman" w:eastAsiaTheme="minorEastAsia" w:hAnsi="Times New Roman" w:cs="Times New Roman"/>
+          <w:rFonts w:eastAsiaTheme="minorEastAsia" w:cstheme="minorBidi"/>
           <w:i w:val="0"/>
           <w:iCs w:val="0"/>
           <w:noProof/>
@@ -917,18 +866,19 @@
           <w14:ligatures w14:val="standardContextual"/>
         </w:rPr>
       </w:pPr>
-      <w:hyperlink w:anchor="_Toc209680932" w:history="1">
+      <w:hyperlink w:anchor="_Toc228517443" w:history="1">
         <w:r>
           <w:rPr>
             <w:rStyle w:val="Hyperlink"/>
             <w:rFonts w:ascii="Times New Roman" w:hAnsi="Times New Roman" w:cs="Times New Roman"/>
             <w:noProof/>
+            <w:lang w:val="fr-CH"/>
           </w:rPr>
           <w:t>3.1</w:t>
         </w:r>
         <w:r>
           <w:rPr>
-            <w:rFonts w:ascii="Times New Roman" w:eastAsiaTheme="minorEastAsia" w:hAnsi="Times New Roman" w:cs="Times New Roman"/>
+            <w:rFonts w:eastAsiaTheme="minorEastAsia" w:cstheme="minorBidi"/>
             <w:i w:val="0"/>
             <w:iCs w:val="0"/>
             <w:noProof/>
@@ -944,67 +894,2518 @@
             <w:rStyle w:val="Hyperlink"/>
             <w:rFonts w:ascii="Times New Roman" w:hAnsi="Times New Roman" w:cs="Times New Roman"/>
             <w:noProof/>
-          </w:rPr>
-          <w:t>Domaine de compétence</w:t>
-        </w:r>
+            <w:lang w:val="fr-CH"/>
+          </w:rPr>
+          <w:t>Domaine de compétence &lt;&lt;[department.name]&gt;&gt;</w:t>
+        </w:r>
+        <w:r>
+          <w:rPr>
+            <w:noProof/>
+            <w:webHidden/>
+          </w:rPr>
+          <w:tab/>
+        </w:r>
+        <w:r>
+          <w:rPr>
+            <w:noProof/>
+            <w:webHidden/>
+          </w:rPr>
+          <w:fldChar w:fldCharType="begin"/>
+        </w:r>
+        <w:r>
+          <w:rPr>
+            <w:noProof/>
+            <w:webHidden/>
+          </w:rPr>
+          <w:instrText xml:space="preserve"> PAGEREF _Toc228517443 \h </w:instrText>
+        </w:r>
+        <w:r>
+          <w:rPr>
+            <w:noProof/>
+            <w:webHidden/>
+          </w:rPr>
+        </w:r>
+        <w:r>
+          <w:rPr>
+            <w:noProof/>
+            <w:webHidden/>
+          </w:rPr>
+          <w:fldChar w:fldCharType="separate"/>
+        </w:r>
+        <w:r>
+          <w:rPr>
+            <w:noProof/>
+            <w:webHidden/>
+          </w:rPr>
+          <w:t>2</w:t>
+        </w:r>
+        <w:r>
+          <w:rPr>
+            <w:noProof/>
+            <w:webHidden/>
+          </w:rPr>
+          <w:fldChar w:fldCharType="end"/>
+        </w:r>
+      </w:hyperlink>
+    </w:p>
+    <w:p>
+      <w:pPr>
+        <w:pStyle w:val="Verzeichnis1"/>
+        <w:rPr>
+          <w:rFonts w:eastAsiaTheme="minorEastAsia" w:cstheme="minorBidi"/>
+          <w:b w:val="0"/>
+          <w:bCs w:val="0"/>
+          <w:noProof/>
+          <w:kern w:val="2"/>
+          <w:sz w:val="24"/>
+          <w:szCs w:val="24"/>
+          <w14:ligatures w14:val="standardContextual"/>
+        </w:rPr>
+      </w:pPr>
+      <w:hyperlink w:anchor="_Toc228517444" w:history="1">
         <w:r>
           <w:rPr>
             <w:rStyle w:val="Hyperlink"/>
             <w:rFonts w:ascii="Times New Roman" w:hAnsi="Times New Roman" w:cs="Times New Roman"/>
             <w:noProof/>
           </w:rPr>
-          <w:t xml:space="preserve"> &lt;&lt;[department.name]&gt;&gt;</w:t>
-        </w:r>
-        <w:r>
-          <w:rPr>
+          <w:t>4</w:t>
+        </w:r>
+        <w:r>
+          <w:rPr>
+            <w:rFonts w:eastAsiaTheme="minorEastAsia" w:cstheme="minorBidi"/>
+            <w:b w:val="0"/>
+            <w:bCs w:val="0"/>
+            <w:noProof/>
+            <w:kern w:val="2"/>
+            <w:sz w:val="24"/>
+            <w:szCs w:val="24"/>
+            <w14:ligatures w14:val="standardContextual"/>
+          </w:rPr>
+          <w:tab/>
+        </w:r>
+        <w:r>
+          <w:rPr>
+            <w:rStyle w:val="Hyperlink"/>
             <w:rFonts w:ascii="Times New Roman" w:hAnsi="Times New Roman" w:cs="Times New Roman"/>
             <w:noProof/>
+          </w:rPr>
+          <w:t>Vacances</w:t>
+        </w:r>
+        <w:r>
+          <w:rPr>
+            <w:noProof/>
             <w:webHidden/>
           </w:rPr>
           <w:tab/>
         </w:r>
         <w:r>
           <w:rPr>
+            <w:noProof/>
+            <w:webHidden/>
+          </w:rPr>
+          <w:fldChar w:fldCharType="begin"/>
+        </w:r>
+        <w:r>
+          <w:rPr>
+            <w:noProof/>
+            <w:webHidden/>
+          </w:rPr>
+          <w:instrText xml:space="preserve"> PAGEREF _Toc228517444 \h </w:instrText>
+        </w:r>
+        <w:r>
+          <w:rPr>
+            <w:noProof/>
+            <w:webHidden/>
+          </w:rPr>
+        </w:r>
+        <w:r>
+          <w:rPr>
+            <w:noProof/>
+            <w:webHidden/>
+          </w:rPr>
+          <w:fldChar w:fldCharType="separate"/>
+        </w:r>
+        <w:r>
+          <w:rPr>
+            <w:noProof/>
+            <w:webHidden/>
+          </w:rPr>
+          <w:t>3</w:t>
+        </w:r>
+        <w:r>
+          <w:rPr>
+            <w:noProof/>
+            <w:webHidden/>
+          </w:rPr>
+          <w:fldChar w:fldCharType="end"/>
+        </w:r>
+      </w:hyperlink>
+    </w:p>
+    <w:p>
+      <w:pPr>
+        <w:pStyle w:val="Verzeichnis2"/>
+        <w:tabs>
+          <w:tab w:val="left" w:pos="960"/>
+          <w:tab w:val="right" w:leader="dot" w:pos="9061"/>
+        </w:tabs>
+        <w:rPr>
+          <w:rFonts w:eastAsiaTheme="minorEastAsia" w:cstheme="minorBidi"/>
+          <w:i w:val="0"/>
+          <w:iCs w:val="0"/>
+          <w:noProof/>
+          <w:kern w:val="2"/>
+          <w:sz w:val="24"/>
+          <w:szCs w:val="24"/>
+          <w14:ligatures w14:val="standardContextual"/>
+        </w:rPr>
+      </w:pPr>
+      <w:hyperlink w:anchor="_Toc228517445" w:history="1">
+        <w:r>
+          <w:rPr>
+            <w:rStyle w:val="Hyperlink"/>
             <w:rFonts w:ascii="Times New Roman" w:hAnsi="Times New Roman" w:cs="Times New Roman"/>
             <w:noProof/>
+            <w:lang w:val="fr-CH"/>
+          </w:rPr>
+          <w:t>4.1</w:t>
+        </w:r>
+        <w:r>
+          <w:rPr>
+            <w:rFonts w:eastAsiaTheme="minorEastAsia" w:cstheme="minorBidi"/>
+            <w:i w:val="0"/>
+            <w:iCs w:val="0"/>
+            <w:noProof/>
+            <w:kern w:val="2"/>
+            <w:sz w:val="24"/>
+            <w:szCs w:val="24"/>
+            <w14:ligatures w14:val="standardContextual"/>
+          </w:rPr>
+          <w:tab/>
+        </w:r>
+        <w:r>
+          <w:rPr>
+            <w:rStyle w:val="Hyperlink"/>
+            <w:rFonts w:ascii="Times New Roman" w:hAnsi="Times New Roman" w:cs="Times New Roman"/>
+            <w:noProof/>
+            <w:lang w:val="fr-CH"/>
+          </w:rPr>
+          <w:t>Domaine de compétence &lt;&lt;[department.name]&gt;&gt;</w:t>
+        </w:r>
+        <w:r>
+          <w:rPr>
+            <w:noProof/>
+            <w:webHidden/>
+          </w:rPr>
+          <w:tab/>
+        </w:r>
+        <w:r>
+          <w:rPr>
+            <w:noProof/>
             <w:webHidden/>
           </w:rPr>
           <w:fldChar w:fldCharType="begin"/>
         </w:r>
         <w:r>
           <w:rPr>
+            <w:noProof/>
+            <w:webHidden/>
+          </w:rPr>
+          <w:instrText xml:space="preserve"> PAGEREF _Toc228517445 \h </w:instrText>
+        </w:r>
+        <w:r>
+          <w:rPr>
+            <w:noProof/>
+            <w:webHidden/>
+          </w:rPr>
+        </w:r>
+        <w:r>
+          <w:rPr>
+            <w:noProof/>
+            <w:webHidden/>
+          </w:rPr>
+          <w:fldChar w:fldCharType="separate"/>
+        </w:r>
+        <w:r>
+          <w:rPr>
+            <w:noProof/>
+            <w:webHidden/>
+          </w:rPr>
+          <w:t>3</w:t>
+        </w:r>
+        <w:r>
+          <w:rPr>
+            <w:noProof/>
+            <w:webHidden/>
+          </w:rPr>
+          <w:fldChar w:fldCharType="end"/>
+        </w:r>
+      </w:hyperlink>
+    </w:p>
+    <w:p>
+      <w:pPr>
+        <w:pStyle w:val="Verzeichnis1"/>
+        <w:rPr>
+          <w:rFonts w:eastAsiaTheme="minorEastAsia" w:cstheme="minorBidi"/>
+          <w:b w:val="0"/>
+          <w:bCs w:val="0"/>
+          <w:noProof/>
+          <w:kern w:val="2"/>
+          <w:sz w:val="24"/>
+          <w:szCs w:val="24"/>
+          <w14:ligatures w14:val="standardContextual"/>
+        </w:rPr>
+      </w:pPr>
+      <w:hyperlink w:anchor="_Toc228517446" w:history="1">
+        <w:r>
+          <w:rPr>
+            <w:rStyle w:val="Hyperlink"/>
             <w:rFonts w:ascii="Times New Roman" w:hAnsi="Times New Roman" w:cs="Times New Roman"/>
             <w:noProof/>
-            <w:webHidden/>
-          </w:rPr>
-          <w:instrText xml:space="preserve"> PAGEREF _Toc209680932 \h </w:instrText>
-        </w:r>
-        <w:r>
-          <w:rPr>
+            <w:lang w:val="fr-CH"/>
+          </w:rPr>
+          <w:t>5</w:t>
+        </w:r>
+        <w:r>
+          <w:rPr>
+            <w:rFonts w:eastAsiaTheme="minorEastAsia" w:cstheme="minorBidi"/>
+            <w:b w:val="0"/>
+            <w:bCs w:val="0"/>
+            <w:noProof/>
+            <w:kern w:val="2"/>
+            <w:sz w:val="24"/>
+            <w:szCs w:val="24"/>
+            <w14:ligatures w14:val="standardContextual"/>
+          </w:rPr>
+          <w:tab/>
+        </w:r>
+        <w:r>
+          <w:rPr>
+            <w:rStyle w:val="Hyperlink"/>
             <w:rFonts w:ascii="Times New Roman" w:hAnsi="Times New Roman" w:cs="Times New Roman"/>
             <w:noProof/>
-            <w:webHidden/>
-          </w:rPr>
-        </w:r>
-        <w:r>
-          <w:rPr>
+            <w:lang w:val="fr-CH"/>
+          </w:rPr>
+          <w:t>Nominations ne correspondant pas à la période de fonction</w:t>
+        </w:r>
+        <w:r>
+          <w:rPr>
+            <w:noProof/>
+            <w:webHidden/>
+          </w:rPr>
+          <w:tab/>
+        </w:r>
+        <w:r>
+          <w:rPr>
+            <w:noProof/>
+            <w:webHidden/>
+          </w:rPr>
+          <w:fldChar w:fldCharType="begin"/>
+        </w:r>
+        <w:r>
+          <w:rPr>
+            <w:noProof/>
+            <w:webHidden/>
+          </w:rPr>
+          <w:instrText xml:space="preserve"> PAGEREF _Toc228517446 \h </w:instrText>
+        </w:r>
+        <w:r>
+          <w:rPr>
+            <w:noProof/>
+            <w:webHidden/>
+          </w:rPr>
+        </w:r>
+        <w:r>
+          <w:rPr>
+            <w:noProof/>
+            <w:webHidden/>
+          </w:rPr>
+          <w:fldChar w:fldCharType="separate"/>
+        </w:r>
+        <w:r>
+          <w:rPr>
+            <w:noProof/>
+            <w:webHidden/>
+          </w:rPr>
+          <w:t>3</w:t>
+        </w:r>
+        <w:r>
+          <w:rPr>
+            <w:noProof/>
+            <w:webHidden/>
+          </w:rPr>
+          <w:fldChar w:fldCharType="end"/>
+        </w:r>
+      </w:hyperlink>
+    </w:p>
+    <w:p>
+      <w:pPr>
+        <w:pStyle w:val="Verzeichnis2"/>
+        <w:tabs>
+          <w:tab w:val="left" w:pos="960"/>
+          <w:tab w:val="right" w:leader="dot" w:pos="9061"/>
+        </w:tabs>
+        <w:rPr>
+          <w:rFonts w:eastAsiaTheme="minorEastAsia" w:cstheme="minorBidi"/>
+          <w:i w:val="0"/>
+          <w:iCs w:val="0"/>
+          <w:noProof/>
+          <w:kern w:val="2"/>
+          <w:sz w:val="24"/>
+          <w:szCs w:val="24"/>
+          <w14:ligatures w14:val="standardContextual"/>
+        </w:rPr>
+      </w:pPr>
+      <w:hyperlink w:anchor="_Toc228517447" w:history="1">
+        <w:r>
+          <w:rPr>
+            <w:rStyle w:val="Hyperlink"/>
             <w:rFonts w:ascii="Times New Roman" w:hAnsi="Times New Roman" w:cs="Times New Roman"/>
             <w:noProof/>
+            <w:lang w:val="fr-CH"/>
+          </w:rPr>
+          <w:t>5.1</w:t>
+        </w:r>
+        <w:r>
+          <w:rPr>
+            <w:rFonts w:eastAsiaTheme="minorEastAsia" w:cstheme="minorBidi"/>
+            <w:i w:val="0"/>
+            <w:iCs w:val="0"/>
+            <w:noProof/>
+            <w:kern w:val="2"/>
+            <w:sz w:val="24"/>
+            <w:szCs w:val="24"/>
+            <w14:ligatures w14:val="standardContextual"/>
+          </w:rPr>
+          <w:tab/>
+        </w:r>
+        <w:r>
+          <w:rPr>
+            <w:rStyle w:val="Hyperlink"/>
+            <w:rFonts w:ascii="Times New Roman" w:hAnsi="Times New Roman" w:cs="Times New Roman"/>
+            <w:noProof/>
+            <w:lang w:val="fr-CH"/>
+          </w:rPr>
+          <w:t>Domaine de compétence &lt;&lt;[department.name]&gt;&gt;</w:t>
+        </w:r>
+        <w:r>
+          <w:rPr>
+            <w:noProof/>
+            <w:webHidden/>
+          </w:rPr>
+          <w:tab/>
+        </w:r>
+        <w:r>
+          <w:rPr>
+            <w:noProof/>
+            <w:webHidden/>
+          </w:rPr>
+          <w:fldChar w:fldCharType="begin"/>
+        </w:r>
+        <w:r>
+          <w:rPr>
+            <w:noProof/>
+            <w:webHidden/>
+          </w:rPr>
+          <w:instrText xml:space="preserve"> PAGEREF _Toc228517447 \h </w:instrText>
+        </w:r>
+        <w:r>
+          <w:rPr>
+            <w:noProof/>
+            <w:webHidden/>
+          </w:rPr>
+        </w:r>
+        <w:r>
+          <w:rPr>
+            <w:noProof/>
             <w:webHidden/>
           </w:rPr>
           <w:fldChar w:fldCharType="separate"/>
         </w:r>
         <w:r>
           <w:rPr>
+            <w:noProof/>
+            <w:webHidden/>
+          </w:rPr>
+          <w:t>3</w:t>
+        </w:r>
+        <w:r>
+          <w:rPr>
+            <w:noProof/>
+            <w:webHidden/>
+          </w:rPr>
+          <w:fldChar w:fldCharType="end"/>
+        </w:r>
+      </w:hyperlink>
+    </w:p>
+    <w:p>
+      <w:pPr>
+        <w:pStyle w:val="Verzeichnis1"/>
+        <w:rPr>
+          <w:rFonts w:eastAsiaTheme="minorEastAsia" w:cstheme="minorBidi"/>
+          <w:b w:val="0"/>
+          <w:bCs w:val="0"/>
+          <w:noProof/>
+          <w:kern w:val="2"/>
+          <w:sz w:val="24"/>
+          <w:szCs w:val="24"/>
+          <w14:ligatures w14:val="standardContextual"/>
+        </w:rPr>
+      </w:pPr>
+      <w:hyperlink w:anchor="_Toc228517448" w:history="1">
+        <w:r>
+          <w:rPr>
+            <w:rStyle w:val="Hyperlink"/>
             <w:rFonts w:ascii="Times New Roman" w:hAnsi="Times New Roman" w:cs="Times New Roman"/>
             <w:noProof/>
-            <w:webHidden/>
-          </w:rPr>
-          <w:t>2</w:t>
-        </w:r>
-        <w:r>
-          <w:rPr>
+            <w:lang w:val="fr-CH"/>
+          </w:rPr>
+          <w:t>6</w:t>
+        </w:r>
+        <w:r>
+          <w:rPr>
+            <w:rFonts w:eastAsiaTheme="minorEastAsia" w:cstheme="minorBidi"/>
+            <w:b w:val="0"/>
+            <w:bCs w:val="0"/>
+            <w:noProof/>
+            <w:kern w:val="2"/>
+            <w:sz w:val="24"/>
+            <w:szCs w:val="24"/>
+            <w14:ligatures w14:val="standardContextual"/>
+          </w:rPr>
+          <w:tab/>
+        </w:r>
+        <w:r>
+          <w:rPr>
+            <w:rStyle w:val="Hyperlink"/>
             <w:rFonts w:ascii="Times New Roman" w:hAnsi="Times New Roman" w:cs="Times New Roman"/>
+            <w:noProof/>
+            <w:lang w:val="fr-CH"/>
+          </w:rPr>
+          <w:t>Taux d’occupation des membres de commissions de suivi du marché</w:t>
+        </w:r>
+        <w:r>
+          <w:rPr>
+            <w:noProof/>
+            <w:webHidden/>
+          </w:rPr>
+          <w:tab/>
+        </w:r>
+        <w:r>
+          <w:rPr>
+            <w:noProof/>
+            <w:webHidden/>
+          </w:rPr>
+          <w:fldChar w:fldCharType="begin"/>
+        </w:r>
+        <w:r>
+          <w:rPr>
+            <w:noProof/>
+            <w:webHidden/>
+          </w:rPr>
+          <w:instrText xml:space="preserve"> PAGEREF _Toc228517448 \h </w:instrText>
+        </w:r>
+        <w:r>
+          <w:rPr>
+            <w:noProof/>
+            <w:webHidden/>
+          </w:rPr>
+        </w:r>
+        <w:r>
+          <w:rPr>
+            <w:noProof/>
+            <w:webHidden/>
+          </w:rPr>
+          <w:fldChar w:fldCharType="separate"/>
+        </w:r>
+        <w:r>
+          <w:rPr>
+            <w:noProof/>
+            <w:webHidden/>
+          </w:rPr>
+          <w:t>3</w:t>
+        </w:r>
+        <w:r>
+          <w:rPr>
+            <w:noProof/>
+            <w:webHidden/>
+          </w:rPr>
+          <w:fldChar w:fldCharType="end"/>
+        </w:r>
+      </w:hyperlink>
+    </w:p>
+    <w:p>
+      <w:pPr>
+        <w:pStyle w:val="Verzeichnis2"/>
+        <w:tabs>
+          <w:tab w:val="left" w:pos="960"/>
+          <w:tab w:val="right" w:leader="dot" w:pos="9061"/>
+        </w:tabs>
+        <w:rPr>
+          <w:rFonts w:eastAsiaTheme="minorEastAsia" w:cstheme="minorBidi"/>
+          <w:i w:val="0"/>
+          <w:iCs w:val="0"/>
+          <w:noProof/>
+          <w:kern w:val="2"/>
+          <w:sz w:val="24"/>
+          <w:szCs w:val="24"/>
+          <w14:ligatures w14:val="standardContextual"/>
+        </w:rPr>
+      </w:pPr>
+      <w:hyperlink w:anchor="_Toc228517449" w:history="1">
+        <w:r>
+          <w:rPr>
+            <w:rStyle w:val="Hyperlink"/>
+            <w:rFonts w:ascii="Times New Roman" w:hAnsi="Times New Roman" w:cs="Times New Roman"/>
+            <w:noProof/>
+            <w:lang w:val="fr-CH"/>
+          </w:rPr>
+          <w:t>6.1</w:t>
+        </w:r>
+        <w:r>
+          <w:rPr>
+            <w:rFonts w:eastAsiaTheme="minorEastAsia" w:cstheme="minorBidi"/>
+            <w:i w:val="0"/>
+            <w:iCs w:val="0"/>
+            <w:noProof/>
+            <w:kern w:val="2"/>
+            <w:sz w:val="24"/>
+            <w:szCs w:val="24"/>
+            <w14:ligatures w14:val="standardContextual"/>
+          </w:rPr>
+          <w:tab/>
+        </w:r>
+        <w:r>
+          <w:rPr>
+            <w:rStyle w:val="Hyperlink"/>
+            <w:rFonts w:ascii="Times New Roman" w:hAnsi="Times New Roman" w:cs="Times New Roman"/>
+            <w:noProof/>
+            <w:lang w:val="fr-CH"/>
+          </w:rPr>
+          <w:t>Domaine de compétence &lt;&lt;[department.name]&gt;&gt;</w:t>
+        </w:r>
+        <w:r>
+          <w:rPr>
+            <w:noProof/>
+            <w:webHidden/>
+          </w:rPr>
+          <w:tab/>
+        </w:r>
+        <w:r>
+          <w:rPr>
+            <w:noProof/>
+            <w:webHidden/>
+          </w:rPr>
+          <w:fldChar w:fldCharType="begin"/>
+        </w:r>
+        <w:r>
+          <w:rPr>
+            <w:noProof/>
+            <w:webHidden/>
+          </w:rPr>
+          <w:instrText xml:space="preserve"> PAGEREF _Toc228517449 \h </w:instrText>
+        </w:r>
+        <w:r>
+          <w:rPr>
+            <w:noProof/>
+            <w:webHidden/>
+          </w:rPr>
+        </w:r>
+        <w:r>
+          <w:rPr>
+            <w:noProof/>
+            <w:webHidden/>
+          </w:rPr>
+          <w:fldChar w:fldCharType="separate"/>
+        </w:r>
+        <w:r>
+          <w:rPr>
+            <w:noProof/>
+            <w:webHidden/>
+          </w:rPr>
+          <w:t>4</w:t>
+        </w:r>
+        <w:r>
+          <w:rPr>
+            <w:noProof/>
+            <w:webHidden/>
+          </w:rPr>
+          <w:fldChar w:fldCharType="end"/>
+        </w:r>
+      </w:hyperlink>
+    </w:p>
+    <w:p>
+      <w:pPr>
+        <w:pStyle w:val="Verzeichnis1"/>
+        <w:rPr>
+          <w:rFonts w:eastAsiaTheme="minorEastAsia" w:cstheme="minorBidi"/>
+          <w:b w:val="0"/>
+          <w:bCs w:val="0"/>
+          <w:noProof/>
+          <w:kern w:val="2"/>
+          <w:sz w:val="24"/>
+          <w:szCs w:val="24"/>
+          <w14:ligatures w14:val="standardContextual"/>
+        </w:rPr>
+      </w:pPr>
+      <w:hyperlink w:anchor="_Toc228517450" w:history="1">
+        <w:r>
+          <w:rPr>
+            <w:rStyle w:val="Hyperlink"/>
+            <w:rFonts w:ascii="Times New Roman" w:hAnsi="Times New Roman" w:cs="Times New Roman"/>
+            <w:noProof/>
+            <w:lang w:val="fr-CH"/>
+          </w:rPr>
+          <w:t>7</w:t>
+        </w:r>
+        <w:r>
+          <w:rPr>
+            <w:rFonts w:eastAsiaTheme="minorEastAsia" w:cstheme="minorBidi"/>
+            <w:b w:val="0"/>
+            <w:bCs w:val="0"/>
+            <w:noProof/>
+            <w:kern w:val="2"/>
+            <w:sz w:val="24"/>
+            <w:szCs w:val="24"/>
+            <w14:ligatures w14:val="standardContextual"/>
+          </w:rPr>
+          <w:tab/>
+        </w:r>
+        <w:r>
+          <w:rPr>
+            <w:rStyle w:val="Hyperlink"/>
+            <w:rFonts w:ascii="Times New Roman" w:hAnsi="Times New Roman" w:cs="Times New Roman"/>
+            <w:noProof/>
+            <w:lang w:val="fr-CH"/>
+          </w:rPr>
+          <w:t>Exceptions concernant les exigences relatives à la composition des commissions extraparlementaires</w:t>
+        </w:r>
+        <w:r>
+          <w:rPr>
+            <w:noProof/>
+            <w:webHidden/>
+          </w:rPr>
+          <w:tab/>
+        </w:r>
+        <w:r>
+          <w:rPr>
+            <w:noProof/>
+            <w:webHidden/>
+          </w:rPr>
+          <w:fldChar w:fldCharType="begin"/>
+        </w:r>
+        <w:r>
+          <w:rPr>
+            <w:noProof/>
+            <w:webHidden/>
+          </w:rPr>
+          <w:instrText xml:space="preserve"> PAGEREF _Toc228517450 \h </w:instrText>
+        </w:r>
+        <w:r>
+          <w:rPr>
+            <w:noProof/>
+            <w:webHidden/>
+          </w:rPr>
+        </w:r>
+        <w:r>
+          <w:rPr>
+            <w:noProof/>
+            <w:webHidden/>
+          </w:rPr>
+          <w:fldChar w:fldCharType="separate"/>
+        </w:r>
+        <w:r>
+          <w:rPr>
+            <w:noProof/>
+            <w:webHidden/>
+          </w:rPr>
+          <w:t>4</w:t>
+        </w:r>
+        <w:r>
+          <w:rPr>
+            <w:noProof/>
+            <w:webHidden/>
+          </w:rPr>
+          <w:fldChar w:fldCharType="end"/>
+        </w:r>
+      </w:hyperlink>
+    </w:p>
+    <w:p>
+      <w:pPr>
+        <w:pStyle w:val="Verzeichnis2"/>
+        <w:tabs>
+          <w:tab w:val="left" w:pos="960"/>
+          <w:tab w:val="right" w:leader="dot" w:pos="9061"/>
+        </w:tabs>
+        <w:rPr>
+          <w:rFonts w:eastAsiaTheme="minorEastAsia" w:cstheme="minorBidi"/>
+          <w:i w:val="0"/>
+          <w:iCs w:val="0"/>
+          <w:noProof/>
+          <w:kern w:val="2"/>
+          <w:sz w:val="24"/>
+          <w:szCs w:val="24"/>
+          <w14:ligatures w14:val="standardContextual"/>
+        </w:rPr>
+      </w:pPr>
+      <w:hyperlink w:anchor="_Toc228517451" w:history="1">
+        <w:r>
+          <w:rPr>
+            <w:rStyle w:val="Hyperlink"/>
+            <w:rFonts w:ascii="Times New Roman" w:hAnsi="Times New Roman" w:cs="Times New Roman"/>
+            <w:noProof/>
+            <w:lang w:val="fr-CH"/>
+          </w:rPr>
+          <w:t>7.1</w:t>
+        </w:r>
+        <w:r>
+          <w:rPr>
+            <w:rFonts w:eastAsiaTheme="minorEastAsia" w:cstheme="minorBidi"/>
+            <w:i w:val="0"/>
+            <w:iCs w:val="0"/>
+            <w:noProof/>
+            <w:kern w:val="2"/>
+            <w:sz w:val="24"/>
+            <w:szCs w:val="24"/>
+            <w14:ligatures w14:val="standardContextual"/>
+          </w:rPr>
+          <w:tab/>
+        </w:r>
+        <w:r>
+          <w:rPr>
+            <w:rStyle w:val="Hyperlink"/>
+            <w:rFonts w:ascii="Times New Roman" w:hAnsi="Times New Roman" w:cs="Times New Roman"/>
+            <w:noProof/>
+            <w:lang w:val="fr-CH"/>
+          </w:rPr>
+          <w:t>Commissions de plus de 15 membres (&lt;&lt;[appendixReport.moreThan15Members]&gt;&gt; de &lt;&lt;[appendixReport.numberOfExtraParliamentaryCommissions]&gt;&gt;)</w:t>
+        </w:r>
+        <w:r>
+          <w:rPr>
+            <w:noProof/>
+            <w:webHidden/>
+          </w:rPr>
+          <w:tab/>
+        </w:r>
+        <w:r>
+          <w:rPr>
+            <w:noProof/>
+            <w:webHidden/>
+          </w:rPr>
+          <w:fldChar w:fldCharType="begin"/>
+        </w:r>
+        <w:r>
+          <w:rPr>
+            <w:noProof/>
+            <w:webHidden/>
+          </w:rPr>
+          <w:instrText xml:space="preserve"> PAGEREF _Toc228517451 \h </w:instrText>
+        </w:r>
+        <w:r>
+          <w:rPr>
+            <w:noProof/>
+            <w:webHidden/>
+          </w:rPr>
+        </w:r>
+        <w:r>
+          <w:rPr>
+            <w:noProof/>
+            <w:webHidden/>
+          </w:rPr>
+          <w:fldChar w:fldCharType="separate"/>
+        </w:r>
+        <w:r>
+          <w:rPr>
+            <w:noProof/>
+            <w:webHidden/>
+          </w:rPr>
+          <w:t>4</w:t>
+        </w:r>
+        <w:r>
+          <w:rPr>
+            <w:noProof/>
+            <w:webHidden/>
+          </w:rPr>
+          <w:fldChar w:fldCharType="end"/>
+        </w:r>
+      </w:hyperlink>
+    </w:p>
+    <w:p>
+      <w:pPr>
+        <w:pStyle w:val="Verzeichnis2"/>
+        <w:tabs>
+          <w:tab w:val="left" w:pos="960"/>
+          <w:tab w:val="right" w:leader="dot" w:pos="9061"/>
+        </w:tabs>
+        <w:rPr>
+          <w:rFonts w:eastAsiaTheme="minorEastAsia" w:cstheme="minorBidi"/>
+          <w:i w:val="0"/>
+          <w:iCs w:val="0"/>
+          <w:noProof/>
+          <w:kern w:val="2"/>
+          <w:sz w:val="24"/>
+          <w:szCs w:val="24"/>
+          <w14:ligatures w14:val="standardContextual"/>
+        </w:rPr>
+      </w:pPr>
+      <w:hyperlink w:anchor="_Toc228517452" w:history="1">
+        <w:r>
+          <w:rPr>
+            <w:rStyle w:val="Hyperlink"/>
+            <w:rFonts w:ascii="Times New Roman" w:hAnsi="Times New Roman" w:cs="Times New Roman"/>
+            <w:noProof/>
+            <w:lang w:val="fr-CH"/>
+          </w:rPr>
+          <w:t>7.2</w:t>
+        </w:r>
+        <w:r>
+          <w:rPr>
+            <w:rFonts w:eastAsiaTheme="minorEastAsia" w:cstheme="minorBidi"/>
+            <w:i w:val="0"/>
+            <w:iCs w:val="0"/>
+            <w:noProof/>
+            <w:kern w:val="2"/>
+            <w:sz w:val="24"/>
+            <w:szCs w:val="24"/>
+            <w14:ligatures w14:val="standardContextual"/>
+          </w:rPr>
+          <w:tab/>
+        </w:r>
+        <w:r>
+          <w:rPr>
+            <w:rStyle w:val="Hyperlink"/>
+            <w:rFonts w:ascii="Times New Roman" w:hAnsi="Times New Roman" w:cs="Times New Roman"/>
+            <w:noProof/>
+            <w:lang w:val="fr-CH"/>
+          </w:rPr>
+          <w:t>Commissions comptant moins de 40% de femmes ou d’hommes (&lt;&lt;[appendixReport.missingGender]&gt;&gt; de &lt;&lt;[ appendixReport.numberOfExtraParliamentaryCommissions]&gt;&gt;)</w:t>
+        </w:r>
+        <w:r>
+          <w:rPr>
+            <w:noProof/>
+            <w:webHidden/>
+          </w:rPr>
+          <w:tab/>
+        </w:r>
+        <w:r>
+          <w:rPr>
+            <w:noProof/>
+            <w:webHidden/>
+          </w:rPr>
+          <w:fldChar w:fldCharType="begin"/>
+        </w:r>
+        <w:r>
+          <w:rPr>
+            <w:noProof/>
+            <w:webHidden/>
+          </w:rPr>
+          <w:instrText xml:space="preserve"> PAGEREF _Toc228517452 \h </w:instrText>
+        </w:r>
+        <w:r>
+          <w:rPr>
+            <w:noProof/>
+            <w:webHidden/>
+          </w:rPr>
+        </w:r>
+        <w:r>
+          <w:rPr>
+            <w:noProof/>
+            <w:webHidden/>
+          </w:rPr>
+          <w:fldChar w:fldCharType="separate"/>
+        </w:r>
+        <w:r>
+          <w:rPr>
+            <w:noProof/>
+            <w:webHidden/>
+          </w:rPr>
+          <w:t>5</w:t>
+        </w:r>
+        <w:r>
+          <w:rPr>
+            <w:noProof/>
+            <w:webHidden/>
+          </w:rPr>
+          <w:fldChar w:fldCharType="end"/>
+        </w:r>
+      </w:hyperlink>
+    </w:p>
+    <w:p>
+      <w:pPr>
+        <w:pStyle w:val="Verzeichnis2"/>
+        <w:tabs>
+          <w:tab w:val="left" w:pos="960"/>
+          <w:tab w:val="right" w:leader="dot" w:pos="9061"/>
+        </w:tabs>
+        <w:rPr>
+          <w:rFonts w:eastAsiaTheme="minorEastAsia" w:cstheme="minorBidi"/>
+          <w:i w:val="0"/>
+          <w:iCs w:val="0"/>
+          <w:noProof/>
+          <w:kern w:val="2"/>
+          <w:sz w:val="24"/>
+          <w:szCs w:val="24"/>
+          <w14:ligatures w14:val="standardContextual"/>
+        </w:rPr>
+      </w:pPr>
+      <w:hyperlink w:anchor="_Toc228517453" w:history="1">
+        <w:r>
+          <w:rPr>
+            <w:rStyle w:val="Hyperlink"/>
+            <w:rFonts w:ascii="Times New Roman" w:hAnsi="Times New Roman" w:cs="Times New Roman"/>
+            <w:noProof/>
+            <w:lang w:val="fr-CH"/>
+          </w:rPr>
+          <w:t>7.3</w:t>
+        </w:r>
+        <w:r>
+          <w:rPr>
+            <w:rFonts w:eastAsiaTheme="minorEastAsia" w:cstheme="minorBidi"/>
+            <w:i w:val="0"/>
+            <w:iCs w:val="0"/>
+            <w:noProof/>
+            <w:kern w:val="2"/>
+            <w:sz w:val="24"/>
+            <w:szCs w:val="24"/>
+            <w14:ligatures w14:val="standardContextual"/>
+          </w:rPr>
+          <w:tab/>
+        </w:r>
+        <w:r>
+          <w:rPr>
+            <w:rStyle w:val="Hyperlink"/>
+            <w:rFonts w:ascii="Times New Roman" w:hAnsi="Times New Roman" w:cs="Times New Roman"/>
+            <w:noProof/>
+            <w:lang w:val="fr-CH"/>
+          </w:rPr>
+          <w:t>Commissions dans lesquelles une langue est sous-représentée (&lt;&lt;[appendixReport.missingLanguage]&gt;&gt; de &lt;&lt;[appendixReport.numberOfExtraParliamentaryCommissions]&gt;&gt;)</w:t>
+        </w:r>
+        <w:r>
+          <w:rPr>
+            <w:noProof/>
+            <w:webHidden/>
+          </w:rPr>
+          <w:tab/>
+        </w:r>
+        <w:r>
+          <w:rPr>
+            <w:noProof/>
+            <w:webHidden/>
+          </w:rPr>
+          <w:fldChar w:fldCharType="begin"/>
+        </w:r>
+        <w:r>
+          <w:rPr>
+            <w:noProof/>
+            <w:webHidden/>
+          </w:rPr>
+          <w:instrText xml:space="preserve"> PAGEREF _Toc228517453 \h </w:instrText>
+        </w:r>
+        <w:r>
+          <w:rPr>
+            <w:noProof/>
+            <w:webHidden/>
+          </w:rPr>
+        </w:r>
+        <w:r>
+          <w:rPr>
+            <w:noProof/>
+            <w:webHidden/>
+          </w:rPr>
+          <w:fldChar w:fldCharType="separate"/>
+        </w:r>
+        <w:r>
+          <w:rPr>
+            <w:noProof/>
+            <w:webHidden/>
+          </w:rPr>
+          <w:t>5</w:t>
+        </w:r>
+        <w:r>
+          <w:rPr>
+            <w:noProof/>
+            <w:webHidden/>
+          </w:rPr>
+          <w:fldChar w:fldCharType="end"/>
+        </w:r>
+      </w:hyperlink>
+    </w:p>
+    <w:p>
+      <w:pPr>
+        <w:pStyle w:val="Verzeichnis2"/>
+        <w:tabs>
+          <w:tab w:val="left" w:pos="960"/>
+          <w:tab w:val="right" w:leader="dot" w:pos="9061"/>
+        </w:tabs>
+        <w:rPr>
+          <w:rFonts w:eastAsiaTheme="minorEastAsia" w:cstheme="minorBidi"/>
+          <w:i w:val="0"/>
+          <w:iCs w:val="0"/>
+          <w:noProof/>
+          <w:kern w:val="2"/>
+          <w:sz w:val="24"/>
+          <w:szCs w:val="24"/>
+          <w14:ligatures w14:val="standardContextual"/>
+        </w:rPr>
+      </w:pPr>
+      <w:hyperlink w:anchor="_Toc228517454" w:history="1">
+        <w:r>
+          <w:rPr>
+            <w:rStyle w:val="Hyperlink"/>
+            <w:rFonts w:ascii="Times New Roman" w:hAnsi="Times New Roman" w:cs="Times New Roman"/>
+            <w:noProof/>
+            <w:lang w:val="fr-CH"/>
+          </w:rPr>
+          <w:t>7.4</w:t>
+        </w:r>
+        <w:r>
+          <w:rPr>
+            <w:rFonts w:eastAsiaTheme="minorEastAsia" w:cstheme="minorBidi"/>
+            <w:i w:val="0"/>
+            <w:iCs w:val="0"/>
+            <w:noProof/>
+            <w:kern w:val="2"/>
+            <w:sz w:val="24"/>
+            <w:szCs w:val="24"/>
+            <w14:ligatures w14:val="standardContextual"/>
+          </w:rPr>
+          <w:tab/>
+        </w:r>
+        <w:r>
+          <w:rPr>
+            <w:rStyle w:val="Hyperlink"/>
+            <w:rFonts w:ascii="Times New Roman" w:hAnsi="Times New Roman" w:cs="Times New Roman"/>
+            <w:noProof/>
+            <w:lang w:val="fr-CH"/>
+          </w:rPr>
+          <w:t>Dérogations à la limitation de la durée de fonction</w:t>
+        </w:r>
+        <w:r>
+          <w:rPr>
+            <w:noProof/>
+            <w:webHidden/>
+          </w:rPr>
+          <w:tab/>
+        </w:r>
+        <w:r>
+          <w:rPr>
+            <w:noProof/>
+            <w:webHidden/>
+          </w:rPr>
+          <w:fldChar w:fldCharType="begin"/>
+        </w:r>
+        <w:r>
+          <w:rPr>
+            <w:noProof/>
+            <w:webHidden/>
+          </w:rPr>
+          <w:instrText xml:space="preserve"> PAGEREF _Toc228517454 \h </w:instrText>
+        </w:r>
+        <w:r>
+          <w:rPr>
+            <w:noProof/>
+            <w:webHidden/>
+          </w:rPr>
+        </w:r>
+        <w:r>
+          <w:rPr>
+            <w:noProof/>
+            <w:webHidden/>
+          </w:rPr>
+          <w:fldChar w:fldCharType="separate"/>
+        </w:r>
+        <w:r>
+          <w:rPr>
+            <w:noProof/>
+            <w:webHidden/>
+          </w:rPr>
+          <w:t>6</w:t>
+        </w:r>
+        <w:r>
+          <w:rPr>
+            <w:noProof/>
+            <w:webHidden/>
+          </w:rPr>
+          <w:fldChar w:fldCharType="end"/>
+        </w:r>
+      </w:hyperlink>
+    </w:p>
+    <w:p>
+      <w:pPr>
+        <w:pStyle w:val="Verzeichnis2"/>
+        <w:tabs>
+          <w:tab w:val="left" w:pos="960"/>
+          <w:tab w:val="right" w:leader="dot" w:pos="9061"/>
+        </w:tabs>
+        <w:rPr>
+          <w:rFonts w:eastAsiaTheme="minorEastAsia" w:cstheme="minorBidi"/>
+          <w:i w:val="0"/>
+          <w:iCs w:val="0"/>
+          <w:noProof/>
+          <w:kern w:val="2"/>
+          <w:sz w:val="24"/>
+          <w:szCs w:val="24"/>
+          <w14:ligatures w14:val="standardContextual"/>
+        </w:rPr>
+      </w:pPr>
+      <w:hyperlink w:anchor="_Toc228517455" w:history="1">
+        <w:r>
+          <w:rPr>
+            <w:rStyle w:val="Hyperlink"/>
+            <w:rFonts w:ascii="Times New Roman" w:hAnsi="Times New Roman" w:cs="Times New Roman"/>
+            <w:noProof/>
+            <w:lang w:val="fr-CH"/>
+          </w:rPr>
+          <w:t>7.5</w:t>
+        </w:r>
+        <w:r>
+          <w:rPr>
+            <w:rFonts w:eastAsiaTheme="minorEastAsia" w:cstheme="minorBidi"/>
+            <w:i w:val="0"/>
+            <w:iCs w:val="0"/>
+            <w:noProof/>
+            <w:kern w:val="2"/>
+            <w:sz w:val="24"/>
+            <w:szCs w:val="24"/>
+            <w14:ligatures w14:val="standardContextual"/>
+          </w:rPr>
+          <w:tab/>
+        </w:r>
+        <w:r>
+          <w:rPr>
+            <w:rStyle w:val="Hyperlink"/>
+            <w:rFonts w:ascii="Times New Roman" w:hAnsi="Times New Roman" w:cs="Times New Roman"/>
+            <w:noProof/>
+            <w:lang w:val="fr-CH"/>
+          </w:rPr>
+          <w:t>Nominations de membres de l’Assemblée fédérale</w:t>
+        </w:r>
+        <w:r>
+          <w:rPr>
+            <w:noProof/>
+            <w:webHidden/>
+          </w:rPr>
+          <w:tab/>
+        </w:r>
+        <w:r>
+          <w:rPr>
+            <w:noProof/>
+            <w:webHidden/>
+          </w:rPr>
+          <w:fldChar w:fldCharType="begin"/>
+        </w:r>
+        <w:r>
+          <w:rPr>
+            <w:noProof/>
+            <w:webHidden/>
+          </w:rPr>
+          <w:instrText xml:space="preserve"> PAGEREF _Toc228517455 \h </w:instrText>
+        </w:r>
+        <w:r>
+          <w:rPr>
+            <w:noProof/>
+            <w:webHidden/>
+          </w:rPr>
+        </w:r>
+        <w:r>
+          <w:rPr>
+            <w:noProof/>
+            <w:webHidden/>
+          </w:rPr>
+          <w:fldChar w:fldCharType="separate"/>
+        </w:r>
+        <w:r>
+          <w:rPr>
+            <w:noProof/>
+            <w:webHidden/>
+          </w:rPr>
+          <w:t>6</w:t>
+        </w:r>
+        <w:r>
+          <w:rPr>
+            <w:noProof/>
+            <w:webHidden/>
+          </w:rPr>
+          <w:fldChar w:fldCharType="end"/>
+        </w:r>
+      </w:hyperlink>
+    </w:p>
+    <w:p>
+      <w:pPr>
+        <w:pStyle w:val="Verzeichnis2"/>
+        <w:tabs>
+          <w:tab w:val="left" w:pos="960"/>
+          <w:tab w:val="right" w:leader="dot" w:pos="9061"/>
+        </w:tabs>
+        <w:rPr>
+          <w:rFonts w:eastAsiaTheme="minorEastAsia" w:cstheme="minorBidi"/>
+          <w:i w:val="0"/>
+          <w:iCs w:val="0"/>
+          <w:noProof/>
+          <w:kern w:val="2"/>
+          <w:sz w:val="24"/>
+          <w:szCs w:val="24"/>
+          <w14:ligatures w14:val="standardContextual"/>
+        </w:rPr>
+      </w:pPr>
+      <w:hyperlink w:anchor="_Toc228517456" w:history="1">
+        <w:r>
+          <w:rPr>
+            <w:rStyle w:val="Hyperlink"/>
+            <w:rFonts w:ascii="Times New Roman" w:hAnsi="Times New Roman" w:cs="Times New Roman"/>
+            <w:noProof/>
+            <w:lang w:val="fr-CH"/>
+          </w:rPr>
+          <w:t>7.6</w:t>
+        </w:r>
+        <w:r>
+          <w:rPr>
+            <w:rFonts w:eastAsiaTheme="minorEastAsia" w:cstheme="minorBidi"/>
+            <w:i w:val="0"/>
+            <w:iCs w:val="0"/>
+            <w:noProof/>
+            <w:kern w:val="2"/>
+            <w:sz w:val="24"/>
+            <w:szCs w:val="24"/>
+            <w14:ligatures w14:val="standardContextual"/>
+          </w:rPr>
+          <w:tab/>
+        </w:r>
+        <w:r>
+          <w:rPr>
+            <w:rStyle w:val="Hyperlink"/>
+            <w:rFonts w:ascii="Times New Roman" w:hAnsi="Times New Roman" w:cs="Times New Roman"/>
+            <w:noProof/>
+            <w:lang w:val="fr-CH"/>
+          </w:rPr>
+          <w:t>Nominations de membres de l’administration fédérale</w:t>
+        </w:r>
+        <w:r>
+          <w:rPr>
+            <w:noProof/>
+            <w:webHidden/>
+          </w:rPr>
+          <w:tab/>
+        </w:r>
+        <w:r>
+          <w:rPr>
+            <w:noProof/>
+            <w:webHidden/>
+          </w:rPr>
+          <w:fldChar w:fldCharType="begin"/>
+        </w:r>
+        <w:r>
+          <w:rPr>
+            <w:noProof/>
+            <w:webHidden/>
+          </w:rPr>
+          <w:instrText xml:space="preserve"> PAGEREF _Toc228517456 \h </w:instrText>
+        </w:r>
+        <w:r>
+          <w:rPr>
+            <w:noProof/>
+            <w:webHidden/>
+          </w:rPr>
+        </w:r>
+        <w:r>
+          <w:rPr>
+            <w:noProof/>
+            <w:webHidden/>
+          </w:rPr>
+          <w:fldChar w:fldCharType="separate"/>
+        </w:r>
+        <w:r>
+          <w:rPr>
+            <w:noProof/>
+            <w:webHidden/>
+          </w:rPr>
+          <w:t>7</w:t>
+        </w:r>
+        <w:r>
+          <w:rPr>
+            <w:noProof/>
+            <w:webHidden/>
+          </w:rPr>
+          <w:fldChar w:fldCharType="end"/>
+        </w:r>
+      </w:hyperlink>
+    </w:p>
+    <w:p>
+      <w:pPr>
+        <w:pStyle w:val="Verzeichnis1"/>
+        <w:rPr>
+          <w:rFonts w:eastAsiaTheme="minorEastAsia" w:cstheme="minorBidi"/>
+          <w:b w:val="0"/>
+          <w:bCs w:val="0"/>
+          <w:noProof/>
+          <w:kern w:val="2"/>
+          <w:sz w:val="24"/>
+          <w:szCs w:val="24"/>
+          <w14:ligatures w14:val="standardContextual"/>
+        </w:rPr>
+      </w:pPr>
+      <w:hyperlink w:anchor="_Toc228517457" w:history="1">
+        <w:r>
+          <w:rPr>
+            <w:rStyle w:val="Hyperlink"/>
+            <w:rFonts w:ascii="Times New Roman" w:hAnsi="Times New Roman" w:cs="Times New Roman"/>
+            <w:noProof/>
+            <w:lang w:val="fr-CH"/>
+          </w:rPr>
+          <w:t>8</w:t>
+        </w:r>
+        <w:r>
+          <w:rPr>
+            <w:rFonts w:eastAsiaTheme="minorEastAsia" w:cstheme="minorBidi"/>
+            <w:b w:val="0"/>
+            <w:bCs w:val="0"/>
+            <w:noProof/>
+            <w:kern w:val="2"/>
+            <w:sz w:val="24"/>
+            <w:szCs w:val="24"/>
+            <w14:ligatures w14:val="standardContextual"/>
+          </w:rPr>
+          <w:tab/>
+        </w:r>
+        <w:r>
+          <w:rPr>
+            <w:rStyle w:val="Hyperlink"/>
+            <w:rFonts w:ascii="Times New Roman" w:hAnsi="Times New Roman" w:cs="Times New Roman"/>
+            <w:noProof/>
+            <w:lang w:val="fr-CH"/>
+          </w:rPr>
+          <w:t>Organes de direction et représentants de la Confédération</w:t>
+        </w:r>
+        <w:r>
+          <w:rPr>
+            <w:noProof/>
+            <w:webHidden/>
+          </w:rPr>
+          <w:tab/>
+        </w:r>
+        <w:r>
+          <w:rPr>
+            <w:noProof/>
+            <w:webHidden/>
+          </w:rPr>
+          <w:fldChar w:fldCharType="begin"/>
+        </w:r>
+        <w:r>
+          <w:rPr>
+            <w:noProof/>
+            <w:webHidden/>
+          </w:rPr>
+          <w:instrText xml:space="preserve"> PAGEREF _Toc228517457 \h </w:instrText>
+        </w:r>
+        <w:r>
+          <w:rPr>
+            <w:noProof/>
+            <w:webHidden/>
+          </w:rPr>
+        </w:r>
+        <w:r>
+          <w:rPr>
+            <w:noProof/>
+            <w:webHidden/>
+          </w:rPr>
+          <w:fldChar w:fldCharType="separate"/>
+        </w:r>
+        <w:r>
+          <w:rPr>
+            <w:noProof/>
+            <w:webHidden/>
+          </w:rPr>
+          <w:t>7</w:t>
+        </w:r>
+        <w:r>
+          <w:rPr>
+            <w:noProof/>
+            <w:webHidden/>
+          </w:rPr>
+          <w:fldChar w:fldCharType="end"/>
+        </w:r>
+      </w:hyperlink>
+    </w:p>
+    <w:p>
+      <w:pPr>
+        <w:pStyle w:val="Verzeichnis2"/>
+        <w:tabs>
+          <w:tab w:val="left" w:pos="960"/>
+          <w:tab w:val="right" w:leader="dot" w:pos="9061"/>
+        </w:tabs>
+        <w:rPr>
+          <w:rFonts w:eastAsiaTheme="minorEastAsia" w:cstheme="minorBidi"/>
+          <w:i w:val="0"/>
+          <w:iCs w:val="0"/>
+          <w:noProof/>
+          <w:kern w:val="2"/>
+          <w:sz w:val="24"/>
+          <w:szCs w:val="24"/>
+          <w14:ligatures w14:val="standardContextual"/>
+        </w:rPr>
+      </w:pPr>
+      <w:hyperlink w:anchor="_Toc228517458" w:history="1">
+        <w:r>
+          <w:rPr>
+            <w:rStyle w:val="Hyperlink"/>
+            <w:rFonts w:ascii="Times New Roman" w:hAnsi="Times New Roman" w:cs="Times New Roman"/>
+            <w:noProof/>
+            <w:lang w:val="fr-CH"/>
+          </w:rPr>
+          <w:t>8.1</w:t>
+        </w:r>
+        <w:r>
+          <w:rPr>
+            <w:rFonts w:eastAsiaTheme="minorEastAsia" w:cstheme="minorBidi"/>
+            <w:i w:val="0"/>
+            <w:iCs w:val="0"/>
+            <w:noProof/>
+            <w:kern w:val="2"/>
+            <w:sz w:val="24"/>
+            <w:szCs w:val="24"/>
+            <w14:ligatures w14:val="standardContextual"/>
+          </w:rPr>
+          <w:tab/>
+        </w:r>
+        <w:r>
+          <w:rPr>
+            <w:rStyle w:val="Hyperlink"/>
+            <w:rFonts w:ascii="Times New Roman" w:hAnsi="Times New Roman" w:cs="Times New Roman"/>
+            <w:noProof/>
+            <w:lang w:val="fr-CH"/>
+          </w:rPr>
+          <w:t>Sous-représentation des sexes dans les organes de direction</w:t>
+        </w:r>
+        <w:r>
+          <w:rPr>
+            <w:noProof/>
+            <w:webHidden/>
+          </w:rPr>
+          <w:tab/>
+        </w:r>
+        <w:r>
+          <w:rPr>
+            <w:noProof/>
+            <w:webHidden/>
+          </w:rPr>
+          <w:fldChar w:fldCharType="begin"/>
+        </w:r>
+        <w:r>
+          <w:rPr>
+            <w:noProof/>
+            <w:webHidden/>
+          </w:rPr>
+          <w:instrText xml:space="preserve"> PAGEREF _Toc228517458 \h </w:instrText>
+        </w:r>
+        <w:r>
+          <w:rPr>
+            <w:noProof/>
+            <w:webHidden/>
+          </w:rPr>
+        </w:r>
+        <w:r>
+          <w:rPr>
+            <w:noProof/>
+            <w:webHidden/>
+          </w:rPr>
+          <w:fldChar w:fldCharType="separate"/>
+        </w:r>
+        <w:r>
+          <w:rPr>
+            <w:noProof/>
+            <w:webHidden/>
+          </w:rPr>
+          <w:t>7</w:t>
+        </w:r>
+        <w:r>
+          <w:rPr>
+            <w:noProof/>
+            <w:webHidden/>
+          </w:rPr>
+          <w:fldChar w:fldCharType="end"/>
+        </w:r>
+      </w:hyperlink>
+    </w:p>
+    <w:p>
+      <w:pPr>
+        <w:pStyle w:val="Verzeichnis2"/>
+        <w:tabs>
+          <w:tab w:val="left" w:pos="960"/>
+          <w:tab w:val="right" w:leader="dot" w:pos="9061"/>
+        </w:tabs>
+        <w:rPr>
+          <w:rFonts w:eastAsiaTheme="minorEastAsia" w:cstheme="minorBidi"/>
+          <w:i w:val="0"/>
+          <w:iCs w:val="0"/>
+          <w:noProof/>
+          <w:kern w:val="2"/>
+          <w:sz w:val="24"/>
+          <w:szCs w:val="24"/>
+          <w14:ligatures w14:val="standardContextual"/>
+        </w:rPr>
+      </w:pPr>
+      <w:hyperlink w:anchor="_Toc228517459" w:history="1">
+        <w:r>
+          <w:rPr>
+            <w:rStyle w:val="Hyperlink"/>
+            <w:rFonts w:ascii="Times New Roman" w:hAnsi="Times New Roman" w:cs="Times New Roman"/>
+            <w:noProof/>
+            <w:lang w:val="fr-CH"/>
+          </w:rPr>
+          <w:t>8.2</w:t>
+        </w:r>
+        <w:r>
+          <w:rPr>
+            <w:rFonts w:eastAsiaTheme="minorEastAsia" w:cstheme="minorBidi"/>
+            <w:i w:val="0"/>
+            <w:iCs w:val="0"/>
+            <w:noProof/>
+            <w:kern w:val="2"/>
+            <w:sz w:val="24"/>
+            <w:szCs w:val="24"/>
+            <w14:ligatures w14:val="standardContextual"/>
+          </w:rPr>
+          <w:tab/>
+        </w:r>
+        <w:r>
+          <w:rPr>
+            <w:rStyle w:val="Hyperlink"/>
+            <w:rFonts w:ascii="Times New Roman" w:hAnsi="Times New Roman" w:cs="Times New Roman"/>
+            <w:noProof/>
+            <w:lang w:val="fr-CH"/>
+          </w:rPr>
+          <w:t>Sous-représentation des langues dans les organes de direction</w:t>
+        </w:r>
+        <w:r>
+          <w:rPr>
+            <w:noProof/>
+            <w:webHidden/>
+          </w:rPr>
+          <w:tab/>
+        </w:r>
+        <w:r>
+          <w:rPr>
+            <w:noProof/>
+            <w:webHidden/>
+          </w:rPr>
+          <w:fldChar w:fldCharType="begin"/>
+        </w:r>
+        <w:r>
+          <w:rPr>
+            <w:noProof/>
+            <w:webHidden/>
+          </w:rPr>
+          <w:instrText xml:space="preserve"> PAGEREF _Toc228517459 \h </w:instrText>
+        </w:r>
+        <w:r>
+          <w:rPr>
+            <w:noProof/>
+            <w:webHidden/>
+          </w:rPr>
+        </w:r>
+        <w:r>
+          <w:rPr>
+            <w:noProof/>
+            <w:webHidden/>
+          </w:rPr>
+          <w:fldChar w:fldCharType="separate"/>
+        </w:r>
+        <w:r>
+          <w:rPr>
+            <w:noProof/>
+            <w:webHidden/>
+          </w:rPr>
+          <w:t>7</w:t>
+        </w:r>
+        <w:r>
+          <w:rPr>
+            <w:noProof/>
+            <w:webHidden/>
+          </w:rPr>
+          <w:fldChar w:fldCharType="end"/>
+        </w:r>
+      </w:hyperlink>
+    </w:p>
+    <w:p>
+      <w:pPr>
+        <w:pStyle w:val="Verzeichnis2"/>
+        <w:tabs>
+          <w:tab w:val="left" w:pos="960"/>
+          <w:tab w:val="right" w:leader="dot" w:pos="9061"/>
+        </w:tabs>
+        <w:rPr>
+          <w:rFonts w:eastAsiaTheme="minorEastAsia" w:cstheme="minorBidi"/>
+          <w:i w:val="0"/>
+          <w:iCs w:val="0"/>
+          <w:noProof/>
+          <w:kern w:val="2"/>
+          <w:sz w:val="24"/>
+          <w:szCs w:val="24"/>
+          <w14:ligatures w14:val="standardContextual"/>
+        </w:rPr>
+      </w:pPr>
+      <w:hyperlink w:anchor="_Toc228517460" w:history="1">
+        <w:r>
+          <w:rPr>
+            <w:rStyle w:val="Hyperlink"/>
+            <w:rFonts w:ascii="Times New Roman" w:hAnsi="Times New Roman" w:cs="Times New Roman"/>
+            <w:noProof/>
+            <w:lang w:val="fr-CH"/>
+          </w:rPr>
+          <w:t>8.3</w:t>
+        </w:r>
+        <w:r>
+          <w:rPr>
+            <w:rFonts w:eastAsiaTheme="minorEastAsia" w:cstheme="minorBidi"/>
+            <w:i w:val="0"/>
+            <w:iCs w:val="0"/>
+            <w:noProof/>
+            <w:kern w:val="2"/>
+            <w:sz w:val="24"/>
+            <w:szCs w:val="24"/>
+            <w14:ligatures w14:val="standardContextual"/>
+          </w:rPr>
+          <w:tab/>
+        </w:r>
+        <w:r>
+          <w:rPr>
+            <w:rStyle w:val="Hyperlink"/>
+            <w:rFonts w:ascii="Times New Roman" w:hAnsi="Times New Roman" w:cs="Times New Roman"/>
+            <w:noProof/>
+            <w:lang w:val="fr-CH"/>
+          </w:rPr>
+          <w:t>Sous-représentation des sexes parmi les représentants de la Confédération</w:t>
+        </w:r>
+        <w:r>
+          <w:rPr>
+            <w:noProof/>
+            <w:webHidden/>
+          </w:rPr>
+          <w:tab/>
+        </w:r>
+        <w:r>
+          <w:rPr>
+            <w:noProof/>
+            <w:webHidden/>
+          </w:rPr>
+          <w:fldChar w:fldCharType="begin"/>
+        </w:r>
+        <w:r>
+          <w:rPr>
+            <w:noProof/>
+            <w:webHidden/>
+          </w:rPr>
+          <w:instrText xml:space="preserve"> PAGEREF _Toc228517460 \h </w:instrText>
+        </w:r>
+        <w:r>
+          <w:rPr>
+            <w:noProof/>
+            <w:webHidden/>
+          </w:rPr>
+        </w:r>
+        <w:r>
+          <w:rPr>
+            <w:noProof/>
+            <w:webHidden/>
+          </w:rPr>
+          <w:fldChar w:fldCharType="separate"/>
+        </w:r>
+        <w:r>
+          <w:rPr>
+            <w:noProof/>
+            <w:webHidden/>
+          </w:rPr>
+          <w:t>8</w:t>
+        </w:r>
+        <w:r>
+          <w:rPr>
+            <w:noProof/>
+            <w:webHidden/>
+          </w:rPr>
+          <w:fldChar w:fldCharType="end"/>
+        </w:r>
+      </w:hyperlink>
+    </w:p>
+    <w:p>
+      <w:pPr>
+        <w:pStyle w:val="Verzeichnis2"/>
+        <w:tabs>
+          <w:tab w:val="left" w:pos="960"/>
+          <w:tab w:val="right" w:leader="dot" w:pos="9061"/>
+        </w:tabs>
+        <w:rPr>
+          <w:rFonts w:eastAsiaTheme="minorEastAsia" w:cstheme="minorBidi"/>
+          <w:i w:val="0"/>
+          <w:iCs w:val="0"/>
+          <w:noProof/>
+          <w:kern w:val="2"/>
+          <w:sz w:val="24"/>
+          <w:szCs w:val="24"/>
+          <w14:ligatures w14:val="standardContextual"/>
+        </w:rPr>
+      </w:pPr>
+      <w:hyperlink w:anchor="_Toc228517461" w:history="1">
+        <w:r>
+          <w:rPr>
+            <w:rStyle w:val="Hyperlink"/>
+            <w:rFonts w:ascii="Times New Roman" w:hAnsi="Times New Roman" w:cs="Times New Roman"/>
+            <w:noProof/>
+            <w:lang w:val="fr-CH"/>
+          </w:rPr>
+          <w:t>8.4</w:t>
+        </w:r>
+        <w:r>
+          <w:rPr>
+            <w:rFonts w:eastAsiaTheme="minorEastAsia" w:cstheme="minorBidi"/>
+            <w:i w:val="0"/>
+            <w:iCs w:val="0"/>
+            <w:noProof/>
+            <w:kern w:val="2"/>
+            <w:sz w:val="24"/>
+            <w:szCs w:val="24"/>
+            <w14:ligatures w14:val="standardContextual"/>
+          </w:rPr>
+          <w:tab/>
+        </w:r>
+        <w:r>
+          <w:rPr>
+            <w:rStyle w:val="Hyperlink"/>
+            <w:rFonts w:ascii="Times New Roman" w:hAnsi="Times New Roman" w:cs="Times New Roman"/>
+            <w:noProof/>
+            <w:lang w:val="fr-CH"/>
+          </w:rPr>
+          <w:t>Sous-représentation des langues parmi les représentants de la Confédération</w:t>
+        </w:r>
+        <w:r>
+          <w:rPr>
+            <w:noProof/>
+            <w:webHidden/>
+          </w:rPr>
+          <w:tab/>
+        </w:r>
+        <w:r>
+          <w:rPr>
+            <w:noProof/>
+            <w:webHidden/>
+          </w:rPr>
+          <w:fldChar w:fldCharType="begin"/>
+        </w:r>
+        <w:r>
+          <w:rPr>
+            <w:noProof/>
+            <w:webHidden/>
+          </w:rPr>
+          <w:instrText xml:space="preserve"> PAGEREF _Toc228517461 \h </w:instrText>
+        </w:r>
+        <w:r>
+          <w:rPr>
+            <w:noProof/>
+            <w:webHidden/>
+          </w:rPr>
+        </w:r>
+        <w:r>
+          <w:rPr>
+            <w:noProof/>
+            <w:webHidden/>
+          </w:rPr>
+          <w:fldChar w:fldCharType="separate"/>
+        </w:r>
+        <w:r>
+          <w:rPr>
+            <w:noProof/>
+            <w:webHidden/>
+          </w:rPr>
+          <w:t>8</w:t>
+        </w:r>
+        <w:r>
+          <w:rPr>
+            <w:noProof/>
+            <w:webHidden/>
+          </w:rPr>
+          <w:fldChar w:fldCharType="end"/>
+        </w:r>
+      </w:hyperlink>
+    </w:p>
+    <w:p>
+      <w:pPr>
+        <w:pStyle w:val="Verzeichnis1"/>
+        <w:rPr>
+          <w:rFonts w:eastAsiaTheme="minorEastAsia" w:cstheme="minorBidi"/>
+          <w:b w:val="0"/>
+          <w:bCs w:val="0"/>
+          <w:noProof/>
+          <w:kern w:val="2"/>
+          <w:sz w:val="24"/>
+          <w:szCs w:val="24"/>
+          <w14:ligatures w14:val="standardContextual"/>
+        </w:rPr>
+      </w:pPr>
+      <w:hyperlink w:anchor="_Toc228517462" w:history="1">
+        <w:r>
+          <w:rPr>
+            <w:rStyle w:val="Hyperlink"/>
+            <w:rFonts w:ascii="Times New Roman" w:hAnsi="Times New Roman" w:cs="Times New Roman"/>
+            <w:noProof/>
+            <w:lang w:val="fr-CH"/>
+          </w:rPr>
+          <w:t>9</w:t>
+        </w:r>
+        <w:r>
+          <w:rPr>
+            <w:rFonts w:eastAsiaTheme="minorEastAsia" w:cstheme="minorBidi"/>
+            <w:b w:val="0"/>
+            <w:bCs w:val="0"/>
+            <w:noProof/>
+            <w:kern w:val="2"/>
+            <w:sz w:val="24"/>
+            <w:szCs w:val="24"/>
+            <w14:ligatures w14:val="standardContextual"/>
+          </w:rPr>
+          <w:tab/>
+        </w:r>
+        <w:r>
+          <w:rPr>
+            <w:rStyle w:val="Hyperlink"/>
+            <w:rFonts w:ascii="Times New Roman" w:hAnsi="Times New Roman" w:cs="Times New Roman"/>
+            <w:noProof/>
+            <w:lang w:val="fr-CH"/>
+          </w:rPr>
+          <w:t>Nomination de membres de l’Assemblée fédérale qui ne le seront plus au début du mandat</w:t>
+        </w:r>
+        <w:r>
+          <w:rPr>
+            <w:noProof/>
+            <w:webHidden/>
+          </w:rPr>
+          <w:tab/>
+        </w:r>
+        <w:r>
+          <w:rPr>
+            <w:noProof/>
+            <w:webHidden/>
+          </w:rPr>
+          <w:fldChar w:fldCharType="begin"/>
+        </w:r>
+        <w:r>
+          <w:rPr>
+            <w:noProof/>
+            <w:webHidden/>
+          </w:rPr>
+          <w:instrText xml:space="preserve"> PAGEREF _Toc228517462 \h </w:instrText>
+        </w:r>
+        <w:r>
+          <w:rPr>
+            <w:noProof/>
+            <w:webHidden/>
+          </w:rPr>
+        </w:r>
+        <w:r>
+          <w:rPr>
+            <w:noProof/>
+            <w:webHidden/>
+          </w:rPr>
+          <w:fldChar w:fldCharType="separate"/>
+        </w:r>
+        <w:r>
+          <w:rPr>
+            <w:noProof/>
+            <w:webHidden/>
+          </w:rPr>
+          <w:t>9</w:t>
+        </w:r>
+        <w:r>
+          <w:rPr>
+            <w:noProof/>
+            <w:webHidden/>
+          </w:rPr>
+          <w:fldChar w:fldCharType="end"/>
+        </w:r>
+      </w:hyperlink>
+    </w:p>
+    <w:p>
+      <w:pPr>
+        <w:pStyle w:val="Verzeichnis2"/>
+        <w:tabs>
+          <w:tab w:val="left" w:pos="960"/>
+          <w:tab w:val="right" w:leader="dot" w:pos="9061"/>
+        </w:tabs>
+        <w:rPr>
+          <w:rFonts w:eastAsiaTheme="minorEastAsia" w:cstheme="minorBidi"/>
+          <w:i w:val="0"/>
+          <w:iCs w:val="0"/>
+          <w:noProof/>
+          <w:kern w:val="2"/>
+          <w:sz w:val="24"/>
+          <w:szCs w:val="24"/>
+          <w14:ligatures w14:val="standardContextual"/>
+        </w:rPr>
+      </w:pPr>
+      <w:hyperlink w:anchor="_Toc228517463" w:history="1">
+        <w:r>
+          <w:rPr>
+            <w:rStyle w:val="Hyperlink"/>
+            <w:rFonts w:ascii="Times New Roman" w:hAnsi="Times New Roman" w:cs="Times New Roman"/>
+            <w:noProof/>
+            <w:lang w:val="fr-CH"/>
+          </w:rPr>
+          <w:t>9.1</w:t>
+        </w:r>
+        <w:r>
+          <w:rPr>
+            <w:rFonts w:eastAsiaTheme="minorEastAsia" w:cstheme="minorBidi"/>
+            <w:i w:val="0"/>
+            <w:iCs w:val="0"/>
+            <w:noProof/>
+            <w:kern w:val="2"/>
+            <w:sz w:val="24"/>
+            <w:szCs w:val="24"/>
+            <w14:ligatures w14:val="standardContextual"/>
+          </w:rPr>
+          <w:tab/>
+        </w:r>
+        <w:r>
+          <w:rPr>
+            <w:rStyle w:val="Hyperlink"/>
+            <w:rFonts w:ascii="Times New Roman" w:hAnsi="Times New Roman" w:cs="Times New Roman"/>
+            <w:noProof/>
+            <w:lang w:val="fr-CH"/>
+          </w:rPr>
+          <w:t>Domaine de compétence &lt;&lt;[department.name]&gt;&gt;</w:t>
+        </w:r>
+        <w:r>
+          <w:rPr>
+            <w:noProof/>
+            <w:webHidden/>
+          </w:rPr>
+          <w:tab/>
+        </w:r>
+        <w:r>
+          <w:rPr>
+            <w:noProof/>
+            <w:webHidden/>
+          </w:rPr>
+          <w:fldChar w:fldCharType="begin"/>
+        </w:r>
+        <w:r>
+          <w:rPr>
+            <w:noProof/>
+            <w:webHidden/>
+          </w:rPr>
+          <w:instrText xml:space="preserve"> PAGEREF _Toc228517463 \h </w:instrText>
+        </w:r>
+        <w:r>
+          <w:rPr>
+            <w:noProof/>
+            <w:webHidden/>
+          </w:rPr>
+        </w:r>
+        <w:r>
+          <w:rPr>
+            <w:noProof/>
+            <w:webHidden/>
+          </w:rPr>
+          <w:fldChar w:fldCharType="separate"/>
+        </w:r>
+        <w:r>
+          <w:rPr>
+            <w:noProof/>
+            <w:webHidden/>
+          </w:rPr>
+          <w:t>9</w:t>
+        </w:r>
+        <w:r>
+          <w:rPr>
+            <w:noProof/>
+            <w:webHidden/>
+          </w:rPr>
+          <w:fldChar w:fldCharType="end"/>
+        </w:r>
+      </w:hyperlink>
+    </w:p>
+    <w:p>
+      <w:pPr>
+        <w:pStyle w:val="Verzeichnis1"/>
+        <w:rPr>
+          <w:rFonts w:eastAsiaTheme="minorEastAsia" w:cstheme="minorBidi"/>
+          <w:b w:val="0"/>
+          <w:bCs w:val="0"/>
+          <w:noProof/>
+          <w:kern w:val="2"/>
+          <w:sz w:val="24"/>
+          <w:szCs w:val="24"/>
+          <w14:ligatures w14:val="standardContextual"/>
+        </w:rPr>
+      </w:pPr>
+      <w:hyperlink w:anchor="_Toc228517464" w:history="1">
+        <w:r>
+          <w:rPr>
+            <w:rStyle w:val="Hyperlink"/>
+            <w:rFonts w:ascii="Times New Roman" w:hAnsi="Times New Roman" w:cs="Times New Roman"/>
+            <w:noProof/>
+          </w:rPr>
+          <w:t>10</w:t>
+        </w:r>
+        <w:r>
+          <w:rPr>
+            <w:rFonts w:eastAsiaTheme="minorEastAsia" w:cstheme="minorBidi"/>
+            <w:b w:val="0"/>
+            <w:bCs w:val="0"/>
+            <w:noProof/>
+            <w:kern w:val="2"/>
+            <w:sz w:val="24"/>
+            <w:szCs w:val="24"/>
+            <w14:ligatures w14:val="standardContextual"/>
+          </w:rPr>
+          <w:tab/>
+        </w:r>
+        <w:r>
+          <w:rPr>
+            <w:rStyle w:val="Hyperlink"/>
+            <w:rFonts w:ascii="Times New Roman" w:hAnsi="Times New Roman" w:cs="Times New Roman"/>
+            <w:noProof/>
+          </w:rPr>
+          <w:t>Mandats</w:t>
+        </w:r>
+        <w:r>
+          <w:rPr>
+            <w:rStyle w:val="Hyperlink"/>
+            <w:rFonts w:ascii="Times New Roman" w:hAnsi="Times New Roman" w:cs="Times New Roman"/>
+            <w:noProof/>
+            <w:lang w:val="fr-CH"/>
+          </w:rPr>
+          <w:t xml:space="preserve"> multiples</w:t>
+        </w:r>
+        <w:r>
+          <w:rPr>
+            <w:noProof/>
+            <w:webHidden/>
+          </w:rPr>
+          <w:tab/>
+        </w:r>
+        <w:r>
+          <w:rPr>
+            <w:noProof/>
+            <w:webHidden/>
+          </w:rPr>
+          <w:fldChar w:fldCharType="begin"/>
+        </w:r>
+        <w:r>
+          <w:rPr>
+            <w:noProof/>
+            <w:webHidden/>
+          </w:rPr>
+          <w:instrText xml:space="preserve"> PAGEREF _Toc228517464 \h </w:instrText>
+        </w:r>
+        <w:r>
+          <w:rPr>
+            <w:noProof/>
+            <w:webHidden/>
+          </w:rPr>
+        </w:r>
+        <w:r>
+          <w:rPr>
+            <w:noProof/>
+            <w:webHidden/>
+          </w:rPr>
+          <w:fldChar w:fldCharType="separate"/>
+        </w:r>
+        <w:r>
+          <w:rPr>
+            <w:noProof/>
+            <w:webHidden/>
+          </w:rPr>
+          <w:t>9</w:t>
+        </w:r>
+        <w:r>
+          <w:rPr>
+            <w:noProof/>
+            <w:webHidden/>
+          </w:rPr>
+          <w:fldChar w:fldCharType="end"/>
+        </w:r>
+      </w:hyperlink>
+    </w:p>
+    <w:p>
+      <w:pPr>
+        <w:pStyle w:val="Verzeichnis1"/>
+        <w:rPr>
+          <w:rFonts w:eastAsiaTheme="minorEastAsia" w:cstheme="minorBidi"/>
+          <w:b w:val="0"/>
+          <w:bCs w:val="0"/>
+          <w:noProof/>
+          <w:kern w:val="2"/>
+          <w:sz w:val="24"/>
+          <w:szCs w:val="24"/>
+          <w14:ligatures w14:val="standardContextual"/>
+        </w:rPr>
+      </w:pPr>
+      <w:hyperlink w:anchor="_Toc228517465" w:history="1">
+        <w:r>
+          <w:rPr>
+            <w:rStyle w:val="Hyperlink"/>
+            <w:rFonts w:ascii="Times New Roman" w:hAnsi="Times New Roman" w:cs="Times New Roman"/>
+            <w:noProof/>
+          </w:rPr>
+          <w:t>11</w:t>
+        </w:r>
+        <w:r>
+          <w:rPr>
+            <w:rFonts w:eastAsiaTheme="minorEastAsia" w:cstheme="minorBidi"/>
+            <w:b w:val="0"/>
+            <w:bCs w:val="0"/>
+            <w:noProof/>
+            <w:kern w:val="2"/>
+            <w:sz w:val="24"/>
+            <w:szCs w:val="24"/>
+            <w14:ligatures w14:val="standardContextual"/>
+          </w:rPr>
+          <w:tab/>
+        </w:r>
+        <w:r>
+          <w:rPr>
+            <w:rStyle w:val="Hyperlink"/>
+            <w:rFonts w:ascii="Times New Roman" w:hAnsi="Times New Roman" w:cs="Times New Roman"/>
+            <w:noProof/>
+          </w:rPr>
+          <w:t>FR_Auswahlverfahren</w:t>
+        </w:r>
+        <w:r>
+          <w:rPr>
+            <w:noProof/>
+            <w:webHidden/>
+          </w:rPr>
+          <w:tab/>
+        </w:r>
+        <w:r>
+          <w:rPr>
+            <w:noProof/>
+            <w:webHidden/>
+          </w:rPr>
+          <w:fldChar w:fldCharType="begin"/>
+        </w:r>
+        <w:r>
+          <w:rPr>
+            <w:noProof/>
+            <w:webHidden/>
+          </w:rPr>
+          <w:instrText xml:space="preserve"> PAGEREF _Toc228517465 \h </w:instrText>
+        </w:r>
+        <w:r>
+          <w:rPr>
+            <w:noProof/>
+            <w:webHidden/>
+          </w:rPr>
+        </w:r>
+        <w:r>
+          <w:rPr>
+            <w:noProof/>
+            <w:webHidden/>
+          </w:rPr>
+          <w:fldChar w:fldCharType="separate"/>
+        </w:r>
+        <w:r>
+          <w:rPr>
+            <w:noProof/>
+            <w:webHidden/>
+          </w:rPr>
+          <w:t>9</w:t>
+        </w:r>
+        <w:r>
+          <w:rPr>
+            <w:noProof/>
+            <w:webHidden/>
+          </w:rPr>
+          <w:fldChar w:fldCharType="end"/>
+        </w:r>
+      </w:hyperlink>
+    </w:p>
+    <w:p>
+      <w:pPr>
+        <w:pStyle w:val="Verzeichnis2"/>
+        <w:tabs>
+          <w:tab w:val="left" w:pos="960"/>
+          <w:tab w:val="right" w:leader="dot" w:pos="9061"/>
+        </w:tabs>
+        <w:rPr>
+          <w:rFonts w:eastAsiaTheme="minorEastAsia" w:cstheme="minorBidi"/>
+          <w:i w:val="0"/>
+          <w:iCs w:val="0"/>
+          <w:noProof/>
+          <w:kern w:val="2"/>
+          <w:sz w:val="24"/>
+          <w:szCs w:val="24"/>
+          <w14:ligatures w14:val="standardContextual"/>
+        </w:rPr>
+      </w:pPr>
+      <w:hyperlink w:anchor="_Toc228517466" w:history="1">
+        <w:r>
+          <w:rPr>
+            <w:rStyle w:val="Hyperlink"/>
+            <w:rFonts w:ascii="Times New Roman" w:hAnsi="Times New Roman" w:cs="Times New Roman"/>
+            <w:noProof/>
+            <w:lang w:val="fr-CH"/>
+          </w:rPr>
+          <w:t>11.1</w:t>
+        </w:r>
+        <w:r>
+          <w:rPr>
+            <w:rFonts w:eastAsiaTheme="minorEastAsia" w:cstheme="minorBidi"/>
+            <w:i w:val="0"/>
+            <w:iCs w:val="0"/>
+            <w:noProof/>
+            <w:kern w:val="2"/>
+            <w:sz w:val="24"/>
+            <w:szCs w:val="24"/>
+            <w14:ligatures w14:val="standardContextual"/>
+          </w:rPr>
+          <w:tab/>
+        </w:r>
+        <w:r>
+          <w:rPr>
+            <w:rStyle w:val="Hyperlink"/>
+            <w:rFonts w:ascii="Times New Roman" w:hAnsi="Times New Roman" w:cs="Times New Roman"/>
+            <w:noProof/>
+            <w:lang w:val="fr-CH"/>
+          </w:rPr>
+          <w:t>Domaine de compétence &lt;&lt;[department.name]&gt;&gt;</w:t>
+        </w:r>
+        <w:r>
+          <w:rPr>
+            <w:noProof/>
+            <w:webHidden/>
+          </w:rPr>
+          <w:tab/>
+        </w:r>
+        <w:r>
+          <w:rPr>
+            <w:noProof/>
+            <w:webHidden/>
+          </w:rPr>
+          <w:fldChar w:fldCharType="begin"/>
+        </w:r>
+        <w:r>
+          <w:rPr>
+            <w:noProof/>
+            <w:webHidden/>
+          </w:rPr>
+          <w:instrText xml:space="preserve"> PAGEREF _Toc228517466 \h </w:instrText>
+        </w:r>
+        <w:r>
+          <w:rPr>
+            <w:noProof/>
+            <w:webHidden/>
+          </w:rPr>
+        </w:r>
+        <w:r>
+          <w:rPr>
+            <w:noProof/>
+            <w:webHidden/>
+          </w:rPr>
+          <w:fldChar w:fldCharType="separate"/>
+        </w:r>
+        <w:r>
+          <w:rPr>
+            <w:noProof/>
+            <w:webHidden/>
+          </w:rPr>
+          <w:t>9</w:t>
+        </w:r>
+        <w:r>
+          <w:rPr>
+            <w:noProof/>
+            <w:webHidden/>
+          </w:rPr>
+          <w:fldChar w:fldCharType="end"/>
+        </w:r>
+      </w:hyperlink>
+    </w:p>
+    <w:p>
+      <w:pPr>
+        <w:pStyle w:val="Verzeichnis1"/>
+        <w:rPr>
+          <w:rFonts w:eastAsiaTheme="minorEastAsia" w:cstheme="minorBidi"/>
+          <w:b w:val="0"/>
+          <w:bCs w:val="0"/>
+          <w:noProof/>
+          <w:kern w:val="2"/>
+          <w:sz w:val="24"/>
+          <w:szCs w:val="24"/>
+          <w14:ligatures w14:val="standardContextual"/>
+        </w:rPr>
+      </w:pPr>
+      <w:hyperlink w:anchor="_Toc228517467" w:history="1">
+        <w:r>
+          <w:rPr>
+            <w:rStyle w:val="Hyperlink"/>
+            <w:rFonts w:ascii="Times New Roman" w:hAnsi="Times New Roman" w:cs="Times New Roman"/>
+            <w:noProof/>
+          </w:rPr>
+          <w:t>12</w:t>
+        </w:r>
+        <w:r>
+          <w:rPr>
+            <w:rFonts w:eastAsiaTheme="minorEastAsia" w:cstheme="minorBidi"/>
+            <w:b w:val="0"/>
+            <w:bCs w:val="0"/>
+            <w:noProof/>
+            <w:kern w:val="2"/>
+            <w:sz w:val="24"/>
+            <w:szCs w:val="24"/>
+            <w14:ligatures w14:val="standardContextual"/>
+          </w:rPr>
+          <w:tab/>
+        </w:r>
+        <w:r>
+          <w:rPr>
+            <w:rStyle w:val="Hyperlink"/>
+            <w:rFonts w:ascii="Times New Roman" w:hAnsi="Times New Roman" w:cs="Times New Roman"/>
+            <w:noProof/>
+          </w:rPr>
+          <w:t>FR_Übereinstimmung der Kandidaten mit dem Kompetenzprofil</w:t>
+        </w:r>
+        <w:r>
+          <w:rPr>
+            <w:noProof/>
+            <w:webHidden/>
+          </w:rPr>
+          <w:tab/>
+        </w:r>
+        <w:r>
+          <w:rPr>
+            <w:noProof/>
+            <w:webHidden/>
+          </w:rPr>
+          <w:fldChar w:fldCharType="begin"/>
+        </w:r>
+        <w:r>
+          <w:rPr>
+            <w:noProof/>
+            <w:webHidden/>
+          </w:rPr>
+          <w:instrText xml:space="preserve"> PAGEREF _Toc228517467 \h </w:instrText>
+        </w:r>
+        <w:r>
+          <w:rPr>
+            <w:noProof/>
+            <w:webHidden/>
+          </w:rPr>
+        </w:r>
+        <w:r>
+          <w:rPr>
+            <w:noProof/>
+            <w:webHidden/>
+          </w:rPr>
+          <w:fldChar w:fldCharType="separate"/>
+        </w:r>
+        <w:r>
+          <w:rPr>
+            <w:noProof/>
+            <w:webHidden/>
+          </w:rPr>
+          <w:t>10</w:t>
+        </w:r>
+        <w:r>
+          <w:rPr>
+            <w:noProof/>
+            <w:webHidden/>
+          </w:rPr>
+          <w:fldChar w:fldCharType="end"/>
+        </w:r>
+      </w:hyperlink>
+    </w:p>
+    <w:p>
+      <w:pPr>
+        <w:pStyle w:val="Verzeichnis2"/>
+        <w:tabs>
+          <w:tab w:val="left" w:pos="960"/>
+          <w:tab w:val="right" w:leader="dot" w:pos="9061"/>
+        </w:tabs>
+        <w:rPr>
+          <w:rFonts w:eastAsiaTheme="minorEastAsia" w:cstheme="minorBidi"/>
+          <w:i w:val="0"/>
+          <w:iCs w:val="0"/>
+          <w:noProof/>
+          <w:kern w:val="2"/>
+          <w:sz w:val="24"/>
+          <w:szCs w:val="24"/>
+          <w14:ligatures w14:val="standardContextual"/>
+        </w:rPr>
+      </w:pPr>
+      <w:hyperlink w:anchor="_Toc228517468" w:history="1">
+        <w:r>
+          <w:rPr>
+            <w:rStyle w:val="Hyperlink"/>
+            <w:rFonts w:ascii="Times New Roman" w:hAnsi="Times New Roman" w:cs="Times New Roman"/>
+            <w:noProof/>
+            <w:lang w:val="fr-CH"/>
+          </w:rPr>
+          <w:t>12.1</w:t>
+        </w:r>
+        <w:r>
+          <w:rPr>
+            <w:rFonts w:eastAsiaTheme="minorEastAsia" w:cstheme="minorBidi"/>
+            <w:i w:val="0"/>
+            <w:iCs w:val="0"/>
+            <w:noProof/>
+            <w:kern w:val="2"/>
+            <w:sz w:val="24"/>
+            <w:szCs w:val="24"/>
+            <w14:ligatures w14:val="standardContextual"/>
+          </w:rPr>
+          <w:tab/>
+        </w:r>
+        <w:r>
+          <w:rPr>
+            <w:rStyle w:val="Hyperlink"/>
+            <w:rFonts w:ascii="Times New Roman" w:hAnsi="Times New Roman" w:cs="Times New Roman"/>
+            <w:noProof/>
+            <w:lang w:val="fr-CH"/>
+          </w:rPr>
+          <w:t>Domaine de compétence &lt;&lt;[department.name]&gt;&gt;</w:t>
+        </w:r>
+        <w:r>
+          <w:rPr>
+            <w:noProof/>
+            <w:webHidden/>
+          </w:rPr>
+          <w:tab/>
+        </w:r>
+        <w:r>
+          <w:rPr>
+            <w:noProof/>
+            <w:webHidden/>
+          </w:rPr>
+          <w:fldChar w:fldCharType="begin"/>
+        </w:r>
+        <w:r>
+          <w:rPr>
+            <w:noProof/>
+            <w:webHidden/>
+          </w:rPr>
+          <w:instrText xml:space="preserve"> PAGEREF _Toc228517468 \h </w:instrText>
+        </w:r>
+        <w:r>
+          <w:rPr>
+            <w:noProof/>
+            <w:webHidden/>
+          </w:rPr>
+        </w:r>
+        <w:r>
+          <w:rPr>
+            <w:noProof/>
+            <w:webHidden/>
+          </w:rPr>
+          <w:fldChar w:fldCharType="separate"/>
+        </w:r>
+        <w:r>
+          <w:rPr>
+            <w:noProof/>
+            <w:webHidden/>
+          </w:rPr>
+          <w:t>10</w:t>
+        </w:r>
+        <w:r>
+          <w:rPr>
             <w:noProof/>
             <w:webHidden/>
           </w:rPr>
@@ -1048,7 +3449,6 @@
         <w:br w:type="page"/>
       </w:r>
     </w:p>
-    <w:bookmarkEnd w:id="0"/>
     <w:p>
       <w:pPr>
         <w:pStyle w:val="berschrift1"/>
@@ -1056,6 +3456,8 @@
           <w:rFonts w:ascii="Times New Roman" w:hAnsi="Times New Roman" w:cs="Times New Roman"/>
         </w:rPr>
       </w:pPr>
+      <w:bookmarkStart w:id="1" w:name="_Toc228517438"/>
+      <w:bookmarkEnd w:id="0"/>
       <w:r>
         <w:rPr>
           <w:rFonts w:ascii="Times New Roman" w:hAnsi="Times New Roman" w:cs="Times New Roman"/>
@@ -1064,6 +3466,7 @@
         <w:lastRenderedPageBreak/>
         <w:t>Organes dissous ou regroupés</w:t>
       </w:r>
+      <w:bookmarkEnd w:id="1"/>
     </w:p>
     <w:p>
       <w:pPr>
@@ -1147,7 +3550,7 @@
           <w:lang w:val="fr-CH"/>
         </w:rPr>
       </w:pPr>
-      <w:bookmarkStart w:id="1" w:name="_Toc209680928"/>
+      <w:bookmarkStart w:id="2" w:name="_Toc228517439"/>
       <w:r>
         <w:rPr>
           <w:rFonts w:ascii="Times New Roman" w:hAnsi="Times New Roman" w:cs="Times New Roman"/>
@@ -1163,7 +3566,7 @@
         </w:rPr>
         <w:t xml:space="preserve"> &lt;&lt;[department.name]&gt;&gt;</w:t>
       </w:r>
-      <w:bookmarkEnd w:id="1"/>
+      <w:bookmarkEnd w:id="2"/>
     </w:p>
     <w:p>
       <w:pPr>
@@ -1480,6 +3883,7 @@
           <w:lang w:val="fr-CH"/>
         </w:rPr>
       </w:pPr>
+      <w:bookmarkStart w:id="3" w:name="_Toc228517440"/>
       <w:r>
         <w:rPr>
           <w:rFonts w:ascii="Times New Roman" w:hAnsi="Times New Roman" w:cs="Times New Roman"/>
@@ -1487,6 +3891,7 @@
         </w:rPr>
         <w:t>Organes dont les membres ont été nommés à l’occasion du renouvellement intégral</w:t>
       </w:r>
+      <w:bookmarkEnd w:id="3"/>
     </w:p>
     <w:p>
       <w:pPr>
@@ -1561,8 +3966,8 @@
           <w:lang w:val="fr-CH"/>
         </w:rPr>
       </w:pPr>
-      <w:bookmarkStart w:id="2" w:name="_Toc209534232"/>
-      <w:bookmarkStart w:id="3" w:name="_Toc209680930"/>
+      <w:bookmarkStart w:id="4" w:name="_Toc209534232"/>
+      <w:bookmarkStart w:id="5" w:name="_Toc228517441"/>
       <w:r>
         <w:rPr>
           <w:rFonts w:ascii="Times New Roman" w:hAnsi="Times New Roman" w:cs="Times New Roman"/>
@@ -1578,8 +3983,8 @@
         </w:rPr>
         <w:t xml:space="preserve"> &lt;&lt;[department.name]&gt;&gt;</w:t>
       </w:r>
-      <w:bookmarkEnd w:id="2"/>
-      <w:bookmarkEnd w:id="3"/>
+      <w:bookmarkEnd w:id="4"/>
+      <w:bookmarkEnd w:id="5"/>
     </w:p>
     <w:p>
       <w:pPr>
@@ -1749,11 +4154,11 @@
           <w:rFonts w:ascii="Times New Roman" w:hAnsi="Times New Roman"/>
         </w:rPr>
       </w:pPr>
-      <w:bookmarkStart w:id="4" w:name="_Toc302134379"/>
-      <w:bookmarkStart w:id="5" w:name="_Toc302138032"/>
-      <w:bookmarkStart w:id="6" w:name="_Toc303174102"/>
-      <w:bookmarkStart w:id="7" w:name="_Toc306713419"/>
-      <w:bookmarkStart w:id="8" w:name="_Toc376932682"/>
+      <w:bookmarkStart w:id="6" w:name="_Toc302134379"/>
+      <w:bookmarkStart w:id="7" w:name="_Toc302138032"/>
+      <w:bookmarkStart w:id="8" w:name="_Toc303174102"/>
+      <w:bookmarkStart w:id="9" w:name="_Toc306713419"/>
+      <w:bookmarkStart w:id="10" w:name="_Toc376932682"/>
     </w:p>
     <w:p>
       <w:pPr>
@@ -1763,12 +4168,13 @@
           <w:lang w:val="fr-CH"/>
         </w:rPr>
       </w:pPr>
-      <w:bookmarkStart w:id="9" w:name="_Toc405904555"/>
-      <w:bookmarkEnd w:id="4"/>
-      <w:bookmarkEnd w:id="5"/>
+      <w:bookmarkStart w:id="11" w:name="_Toc405904555"/>
+      <w:bookmarkStart w:id="12" w:name="_Toc228517442"/>
       <w:bookmarkEnd w:id="6"/>
       <w:bookmarkEnd w:id="7"/>
       <w:bookmarkEnd w:id="8"/>
+      <w:bookmarkEnd w:id="9"/>
+      <w:bookmarkEnd w:id="10"/>
       <w:r>
         <w:rPr>
           <w:rFonts w:ascii="Times New Roman" w:hAnsi="Times New Roman" w:cs="Times New Roman"/>
@@ -1776,6 +4182,7 @@
         </w:rPr>
         <w:t>Organes dont les membres n’ont pas été nommés ou ont été nommés plus tard</w:t>
       </w:r>
+      <w:bookmarkEnd w:id="12"/>
     </w:p>
     <w:p>
       <w:pPr>
@@ -1810,8 +4217,8 @@
           <w:lang w:val="fr-CH"/>
         </w:rPr>
       </w:pPr>
-      <w:bookmarkStart w:id="10" w:name="_Toc209534234"/>
-      <w:bookmarkStart w:id="11" w:name="_Toc209680932"/>
+      <w:bookmarkStart w:id="13" w:name="_Toc209534234"/>
+      <w:bookmarkStart w:id="14" w:name="_Toc228517443"/>
       <w:r>
         <w:rPr>
           <w:rFonts w:ascii="Times New Roman" w:hAnsi="Times New Roman" w:cs="Times New Roman"/>
@@ -1827,8 +4234,8 @@
         </w:rPr>
         <w:t xml:space="preserve"> &lt;&lt;[department.name]&gt;&gt;</w:t>
       </w:r>
-      <w:bookmarkEnd w:id="10"/>
-      <w:bookmarkEnd w:id="11"/>
+      <w:bookmarkEnd w:id="13"/>
+      <w:bookmarkEnd w:id="14"/>
     </w:p>
     <w:p>
       <w:pPr>
@@ -1991,7 +4398,7 @@
         <w:t>&lt;&lt;/foreach&gt;&gt;</w:t>
       </w:r>
     </w:p>
-    <w:bookmarkEnd w:id="9"/>
+    <w:bookmarkEnd w:id="11"/>
     <w:p>
       <w:pPr>
         <w:rPr>
@@ -2008,8 +4415,9 @@
           <w:rFonts w:ascii="Times New Roman" w:hAnsi="Times New Roman" w:cs="Times New Roman"/>
         </w:rPr>
       </w:pPr>
-      <w:bookmarkStart w:id="12" w:name="_Toc109324974"/>
-      <w:bookmarkStart w:id="13" w:name="_Toc141190631"/>
+      <w:bookmarkStart w:id="15" w:name="_Toc109324974"/>
+      <w:bookmarkStart w:id="16" w:name="_Toc141190631"/>
+      <w:bookmarkStart w:id="17" w:name="_Toc228517444"/>
       <w:r>
         <w:rPr>
           <w:rFonts w:ascii="Times New Roman" w:hAnsi="Times New Roman" w:cs="Times New Roman"/>
@@ -2017,8 +4425,9 @@
         <w:lastRenderedPageBreak/>
         <w:t>Vacances</w:t>
       </w:r>
-      <w:bookmarkEnd w:id="12"/>
-      <w:bookmarkEnd w:id="13"/>
+      <w:bookmarkEnd w:id="15"/>
+      <w:bookmarkEnd w:id="16"/>
+      <w:bookmarkEnd w:id="17"/>
     </w:p>
     <w:p>
       <w:pPr>
@@ -2068,7 +4477,8 @@
           <w:lang w:val="fr-CH"/>
         </w:rPr>
       </w:pPr>
-      <w:bookmarkStart w:id="14" w:name="_Toc209534236"/>
+      <w:bookmarkStart w:id="18" w:name="_Toc209534236"/>
+      <w:bookmarkStart w:id="19" w:name="_Toc228517445"/>
       <w:r>
         <w:rPr>
           <w:rFonts w:ascii="Times New Roman" w:hAnsi="Times New Roman" w:cs="Times New Roman"/>
@@ -2084,7 +4494,8 @@
         </w:rPr>
         <w:t xml:space="preserve"> &lt;&lt;[department.name]&gt;&gt;</w:t>
       </w:r>
-      <w:bookmarkEnd w:id="14"/>
+      <w:bookmarkEnd w:id="18"/>
+      <w:bookmarkEnd w:id="19"/>
     </w:p>
     <w:p>
       <w:pPr>
@@ -2263,8 +4674,9 @@
           <w:lang w:val="fr-CH"/>
         </w:rPr>
       </w:pPr>
-      <w:bookmarkStart w:id="15" w:name="_Toc109324975"/>
-      <w:bookmarkStart w:id="16" w:name="_Toc141190633"/>
+      <w:bookmarkStart w:id="20" w:name="_Toc109324975"/>
+      <w:bookmarkStart w:id="21" w:name="_Toc141190633"/>
+      <w:bookmarkStart w:id="22" w:name="_Toc228517446"/>
       <w:r>
         <w:rPr>
           <w:rFonts w:ascii="Times New Roman" w:hAnsi="Times New Roman" w:cs="Times New Roman"/>
@@ -2272,8 +4684,9 @@
         </w:rPr>
         <w:t>Nominations ne correspondant pas à la période de fonction</w:t>
       </w:r>
-      <w:bookmarkEnd w:id="15"/>
-      <w:bookmarkEnd w:id="16"/>
+      <w:bookmarkEnd w:id="20"/>
+      <w:bookmarkEnd w:id="21"/>
+      <w:bookmarkEnd w:id="22"/>
     </w:p>
     <w:p>
       <w:pPr>
@@ -2344,7 +4757,8 @@
           <w:lang w:val="fr-CH"/>
         </w:rPr>
       </w:pPr>
-      <w:bookmarkStart w:id="17" w:name="_Toc209534238"/>
+      <w:bookmarkStart w:id="23" w:name="_Toc209534238"/>
+      <w:bookmarkStart w:id="24" w:name="_Toc228517447"/>
       <w:r>
         <w:rPr>
           <w:rFonts w:ascii="Times New Roman" w:hAnsi="Times New Roman" w:cs="Times New Roman"/>
@@ -2360,7 +4774,8 @@
         </w:rPr>
         <w:t xml:space="preserve"> &lt;&lt;[department.name]&gt;&gt;</w:t>
       </w:r>
-      <w:bookmarkEnd w:id="17"/>
+      <w:bookmarkEnd w:id="23"/>
+      <w:bookmarkEnd w:id="24"/>
     </w:p>
     <w:p>
       <w:pPr>
@@ -2577,7 +4992,35 @@
           <w:szCs w:val="24"/>
           <w:lang w:val="en-US" w:eastAsia="de-DE"/>
         </w:rPr>
-        <w:t>&lt;&lt;[member.justification]&gt;&gt;</w:t>
+        <w:t>&lt;&lt;[member.justification]</w:t>
+      </w:r>
+      <w:r>
+        <w:rPr>
+          <w:rFonts w:ascii="Times New Roman" w:eastAsia="Times New Roman" w:hAnsi="Times New Roman"/>
+          <w:sz w:val="24"/>
+          <w:szCs w:val="24"/>
+          <w:lang w:val="en-US" w:eastAsia="de-DE"/>
+        </w:rPr>
+        <w:t xml:space="preserve"> </w:t>
+      </w:r>
+      <w:r>
+        <w:rPr>
+          <w:rFonts w:ascii="Times New Roman" w:hAnsi="Times New Roman"/>
+          <w:bCs/>
+          <w:sz w:val="24"/>
+          <w:szCs w:val="24"/>
+          <w:lang w:val="en-US"/>
+        </w:rPr>
+        <w:t>-html</w:t>
+      </w:r>
+      <w:r>
+        <w:rPr>
+          <w:rFonts w:ascii="Times New Roman" w:eastAsia="Times New Roman" w:hAnsi="Times New Roman"/>
+          <w:sz w:val="24"/>
+          <w:szCs w:val="24"/>
+          <w:lang w:val="en-US" w:eastAsia="de-DE"/>
+        </w:rPr>
+        <w:t>&gt;&gt;</w:t>
       </w:r>
     </w:p>
     <w:p>
@@ -2679,9 +5122,10 @@
           <w:lang w:val="fr-CH"/>
         </w:rPr>
       </w:pPr>
-      <w:bookmarkStart w:id="18" w:name="_Toc405904558"/>
-      <w:bookmarkStart w:id="19" w:name="_Toc109324976"/>
-      <w:bookmarkStart w:id="20" w:name="_Toc141190635"/>
+      <w:bookmarkStart w:id="25" w:name="_Toc405904558"/>
+      <w:bookmarkStart w:id="26" w:name="_Toc109324976"/>
+      <w:bookmarkStart w:id="27" w:name="_Toc141190635"/>
+      <w:bookmarkStart w:id="28" w:name="_Toc228517448"/>
       <w:r>
         <w:rPr>
           <w:rFonts w:ascii="Times New Roman" w:hAnsi="Times New Roman" w:cs="Times New Roman"/>
@@ -2689,9 +5133,10 @@
         </w:rPr>
         <w:t>Taux d’occupation des membres de commissions de suivi du marché</w:t>
       </w:r>
-      <w:bookmarkEnd w:id="18"/>
-      <w:bookmarkEnd w:id="19"/>
-      <w:bookmarkEnd w:id="20"/>
+      <w:bookmarkEnd w:id="25"/>
+      <w:bookmarkEnd w:id="26"/>
+      <w:bookmarkEnd w:id="27"/>
+      <w:bookmarkEnd w:id="28"/>
     </w:p>
     <w:p>
       <w:pPr>
@@ -2810,7 +5255,8 @@
           <w:lang w:val="fr-CH"/>
         </w:rPr>
       </w:pPr>
-      <w:bookmarkStart w:id="21" w:name="_Toc209534240"/>
+      <w:bookmarkStart w:id="29" w:name="_Toc209534240"/>
+      <w:bookmarkStart w:id="30" w:name="_Toc228517449"/>
       <w:r>
         <w:rPr>
           <w:rFonts w:ascii="Times New Roman" w:hAnsi="Times New Roman" w:cs="Times New Roman"/>
@@ -2826,7 +5272,8 @@
         </w:rPr>
         <w:t xml:space="preserve"> &lt;&lt;[department.name]&gt;&gt;</w:t>
       </w:r>
-      <w:bookmarkEnd w:id="21"/>
+      <w:bookmarkEnd w:id="29"/>
+      <w:bookmarkEnd w:id="30"/>
     </w:p>
     <w:p>
       <w:pPr>
@@ -3083,8 +5530,9 @@
           <w:lang w:val="fr-CH"/>
         </w:rPr>
       </w:pPr>
-      <w:bookmarkStart w:id="22" w:name="_Toc109324977"/>
-      <w:bookmarkStart w:id="23" w:name="_Toc141190637"/>
+      <w:bookmarkStart w:id="31" w:name="_Toc109324977"/>
+      <w:bookmarkStart w:id="32" w:name="_Toc141190637"/>
+      <w:bookmarkStart w:id="33" w:name="_Toc228517450"/>
       <w:r>
         <w:rPr>
           <w:rFonts w:ascii="Times New Roman" w:hAnsi="Times New Roman" w:cs="Times New Roman"/>
@@ -3092,11 +5540,13 @@
         </w:rPr>
         <w:t>Exceptions concernant les exigences relatives à la composition des commissions extraparlementaires</w:t>
       </w:r>
-      <w:bookmarkEnd w:id="22"/>
-      <w:bookmarkEnd w:id="23"/>
-    </w:p>
-    <w:p>
-      <w:pPr>
+      <w:bookmarkEnd w:id="31"/>
+      <w:bookmarkEnd w:id="32"/>
+      <w:bookmarkEnd w:id="33"/>
+    </w:p>
+    <w:p>
+      <w:pPr>
+        <w:jc w:val="both"/>
         <w:rPr>
           <w:rFonts w:ascii="Times New Roman" w:hAnsi="Times New Roman"/>
           <w:lang w:val="fr-CH"/>
@@ -3142,9 +5592,10 @@
           <w:lang w:val="fr-CH"/>
         </w:rPr>
       </w:pPr>
-      <w:bookmarkStart w:id="24" w:name="_Toc109324978"/>
-      <w:bookmarkStart w:id="25" w:name="_Toc109375679"/>
-      <w:bookmarkStart w:id="26" w:name="_Toc209534242"/>
+      <w:bookmarkStart w:id="34" w:name="_Toc109324978"/>
+      <w:bookmarkStart w:id="35" w:name="_Toc109375679"/>
+      <w:bookmarkStart w:id="36" w:name="_Toc209534242"/>
+      <w:bookmarkStart w:id="37" w:name="_Toc228517451"/>
       <w:r>
         <w:rPr>
           <w:rFonts w:ascii="Times New Roman" w:hAnsi="Times New Roman" w:cs="Times New Roman"/>
@@ -3229,12 +5680,14 @@
         </w:rPr>
         <w:t>)</w:t>
       </w:r>
-      <w:bookmarkEnd w:id="24"/>
-      <w:bookmarkEnd w:id="25"/>
-      <w:bookmarkEnd w:id="26"/>
-    </w:p>
-    <w:p>
-      <w:pPr>
+      <w:bookmarkEnd w:id="34"/>
+      <w:bookmarkEnd w:id="35"/>
+      <w:bookmarkEnd w:id="36"/>
+      <w:bookmarkEnd w:id="37"/>
+    </w:p>
+    <w:p>
+      <w:pPr>
+        <w:jc w:val="both"/>
         <w:rPr>
           <w:rFonts w:ascii="Times New Roman" w:hAnsi="Times New Roman"/>
           <w:lang w:val="fr-CH"/>
@@ -3499,7 +5952,27 @@
           <w:szCs w:val="24"/>
           <w:lang w:val="en-US"/>
         </w:rPr>
-        <w:t>&lt;&lt;[committee.justification]&gt;&gt;</w:t>
+        <w:t>&lt;&lt;[committee.justification]</w:t>
+      </w:r>
+      <w:r>
+        <w:rPr>
+          <w:rFonts w:ascii="Times New Roman" w:hAnsi="Times New Roman"/>
+          <w:bCs/>
+          <w:sz w:val="24"/>
+          <w:szCs w:val="24"/>
+          <w:lang w:val="en-US"/>
+        </w:rPr>
+        <w:t xml:space="preserve"> -html</w:t>
+      </w:r>
+      <w:r>
+        <w:rPr>
+          <w:rFonts w:ascii="Times New Roman" w:hAnsi="Times New Roman"/>
+          <w:bCs/>
+          <w:sz w:val="24"/>
+          <w:szCs w:val="24"/>
+          <w:lang w:val="en-US"/>
+        </w:rPr>
+        <w:t>&gt;&gt;</w:t>
       </w:r>
     </w:p>
     <w:p>
@@ -3557,9 +6030,10 @@
           <w:lang w:val="fr-CH"/>
         </w:rPr>
       </w:pPr>
-      <w:bookmarkStart w:id="27" w:name="_Toc109324979"/>
-      <w:bookmarkStart w:id="28" w:name="_Toc109375680"/>
-      <w:bookmarkStart w:id="29" w:name="_Toc209534243"/>
+      <w:bookmarkStart w:id="38" w:name="_Toc109324979"/>
+      <w:bookmarkStart w:id="39" w:name="_Toc109375680"/>
+      <w:bookmarkStart w:id="40" w:name="_Toc209534243"/>
+      <w:bookmarkStart w:id="41" w:name="_Toc228517452"/>
       <w:r>
         <w:rPr>
           <w:rFonts w:ascii="Times New Roman" w:hAnsi="Times New Roman" w:cs="Times New Roman"/>
@@ -3575,8 +6049,8 @@
         </w:rPr>
         <w:t xml:space="preserve"> </w:t>
       </w:r>
-      <w:bookmarkEnd w:id="27"/>
-      <w:bookmarkEnd w:id="28"/>
+      <w:bookmarkEnd w:id="38"/>
+      <w:bookmarkEnd w:id="39"/>
       <w:r>
         <w:rPr>
           <w:rFonts w:ascii="Times New Roman" w:hAnsi="Times New Roman" w:cs="Times New Roman"/>
@@ -3631,21 +6105,23 @@
         </w:rPr>
         <w:t>.numberOfExtraParliamentaryCommissions]&gt;&gt;)</w:t>
       </w:r>
-      <w:bookmarkEnd w:id="29"/>
-    </w:p>
-    <w:p>
-      <w:pPr>
-        <w:rPr>
-          <w:rFonts w:ascii="Times New Roman" w:hAnsi="Times New Roman"/>
-          <w:szCs w:val="24"/>
-          <w:lang w:val="fr-CH"/>
-        </w:rPr>
-      </w:pPr>
-      <w:bookmarkStart w:id="30" w:name="_Toc302134420"/>
-      <w:bookmarkStart w:id="31" w:name="_Toc302138073"/>
-      <w:bookmarkStart w:id="32" w:name="_Toc303174143"/>
-      <w:bookmarkStart w:id="33" w:name="_Toc306713460"/>
-      <w:bookmarkStart w:id="34" w:name="_Toc376932731"/>
+      <w:bookmarkEnd w:id="40"/>
+      <w:bookmarkEnd w:id="41"/>
+    </w:p>
+    <w:p>
+      <w:pPr>
+        <w:jc w:val="both"/>
+        <w:rPr>
+          <w:rFonts w:ascii="Times New Roman" w:hAnsi="Times New Roman"/>
+          <w:szCs w:val="24"/>
+          <w:lang w:val="fr-CH"/>
+        </w:rPr>
+      </w:pPr>
+      <w:bookmarkStart w:id="42" w:name="_Toc302134420"/>
+      <w:bookmarkStart w:id="43" w:name="_Toc302138073"/>
+      <w:bookmarkStart w:id="44" w:name="_Toc303174143"/>
+      <w:bookmarkStart w:id="45" w:name="_Toc306713460"/>
+      <w:bookmarkStart w:id="46" w:name="_Toc376932731"/>
       <w:r>
         <w:rPr>
           <w:rFonts w:ascii="Times New Roman" w:hAnsi="Times New Roman"/>
@@ -3939,7 +6415,37 @@
           <w:szCs w:val="24"/>
           <w:lang w:val="en-US"/>
         </w:rPr>
-        <w:t>&lt;&lt;[committee.justification]&gt;&gt;</w:t>
+        <w:t>&lt;&lt;[committee.justification]</w:t>
+      </w:r>
+      <w:r>
+        <w:rPr>
+          <w:rFonts w:ascii="Times New Roman" w:hAnsi="Times New Roman"/>
+          <w:bCs/>
+          <w:sz w:val="24"/>
+          <w:szCs w:val="24"/>
+          <w:lang w:val="en-US"/>
+        </w:rPr>
+        <w:t xml:space="preserve"> </w:t>
+      </w:r>
+      <w:r>
+        <w:rPr>
+          <w:rFonts w:ascii="Times New Roman" w:hAnsi="Times New Roman"/>
+          <w:bCs/>
+          <w:sz w:val="24"/>
+          <w:szCs w:val="24"/>
+          <w:lang w:val="en-US"/>
+        </w:rPr>
+        <w:t>-html</w:t>
+      </w:r>
+      <w:r>
+        <w:rPr>
+          <w:rFonts w:ascii="Times New Roman" w:hAnsi="Times New Roman"/>
+          <w:bCs/>
+          <w:sz w:val="24"/>
+          <w:szCs w:val="24"/>
+          <w:lang w:val="en-US"/>
+        </w:rPr>
+        <w:t>&gt;&gt;</w:t>
       </w:r>
     </w:p>
     <w:p>
@@ -3987,7 +6493,27 @@
           <w:szCs w:val="24"/>
           <w:lang w:val="en-US"/>
         </w:rPr>
-        <w:t>&lt;&lt;[committee.measure]&gt;&gt;</w:t>
+        <w:t>&lt;&lt;[committee.measure]</w:t>
+      </w:r>
+      <w:r>
+        <w:rPr>
+          <w:rFonts w:ascii="Times New Roman" w:hAnsi="Times New Roman"/>
+          <w:bCs/>
+          <w:sz w:val="24"/>
+          <w:szCs w:val="24"/>
+          <w:lang w:val="en-US"/>
+        </w:rPr>
+        <w:t xml:space="preserve"> -html</w:t>
+      </w:r>
+      <w:r>
+        <w:rPr>
+          <w:rFonts w:ascii="Times New Roman" w:hAnsi="Times New Roman"/>
+          <w:bCs/>
+          <w:sz w:val="24"/>
+          <w:szCs w:val="24"/>
+          <w:lang w:val="en-US"/>
+        </w:rPr>
+        <w:t>&gt;&gt;</w:t>
       </w:r>
     </w:p>
     <w:p>
@@ -4049,9 +6575,10 @@
           <w:lang w:val="fr-CH"/>
         </w:rPr>
       </w:pPr>
-      <w:bookmarkStart w:id="35" w:name="_Toc109324980"/>
-      <w:bookmarkStart w:id="36" w:name="_Toc109375681"/>
-      <w:bookmarkStart w:id="37" w:name="_Toc209534244"/>
+      <w:bookmarkStart w:id="47" w:name="_Toc109324980"/>
+      <w:bookmarkStart w:id="48" w:name="_Toc109375681"/>
+      <w:bookmarkStart w:id="49" w:name="_Toc209534244"/>
+      <w:bookmarkStart w:id="50" w:name="_Toc228517453"/>
       <w:r>
         <w:rPr>
           <w:rFonts w:ascii="Times New Roman" w:hAnsi="Times New Roman" w:cs="Times New Roman"/>
@@ -4066,8 +6593,8 @@
         </w:rPr>
         <w:t xml:space="preserve"> </w:t>
       </w:r>
-      <w:bookmarkEnd w:id="35"/>
-      <w:bookmarkEnd w:id="36"/>
+      <w:bookmarkEnd w:id="47"/>
+      <w:bookmarkEnd w:id="48"/>
       <w:r>
         <w:rPr>
           <w:rFonts w:ascii="Times New Roman" w:hAnsi="Times New Roman" w:cs="Times New Roman"/>
@@ -4122,15 +6649,17 @@
         </w:rPr>
         <w:t>.numberOfExtraParliamentaryCommissions]&gt;&gt;)</w:t>
       </w:r>
-      <w:bookmarkEnd w:id="37"/>
-    </w:p>
-    <w:bookmarkEnd w:id="30"/>
-    <w:bookmarkEnd w:id="31"/>
-    <w:bookmarkEnd w:id="32"/>
-    <w:bookmarkEnd w:id="33"/>
-    <w:bookmarkEnd w:id="34"/>
-    <w:p>
-      <w:pPr>
+      <w:bookmarkEnd w:id="49"/>
+      <w:bookmarkEnd w:id="50"/>
+    </w:p>
+    <w:bookmarkEnd w:id="42"/>
+    <w:bookmarkEnd w:id="43"/>
+    <w:bookmarkEnd w:id="44"/>
+    <w:bookmarkEnd w:id="45"/>
+    <w:bookmarkEnd w:id="46"/>
+    <w:p>
+      <w:pPr>
+        <w:jc w:val="both"/>
         <w:rPr>
           <w:rFonts w:ascii="Times New Roman" w:hAnsi="Times New Roman"/>
           <w:i/>
@@ -4460,7 +6989,37 @@
           <w:szCs w:val="24"/>
           <w:lang w:val="en-US"/>
         </w:rPr>
-        <w:t>&lt;&lt;[committee.justification]&gt;&gt;</w:t>
+        <w:t>&lt;&lt;[committee.justification]</w:t>
+      </w:r>
+      <w:r>
+        <w:rPr>
+          <w:rFonts w:ascii="Times New Roman" w:hAnsi="Times New Roman"/>
+          <w:bCs/>
+          <w:sz w:val="24"/>
+          <w:szCs w:val="24"/>
+          <w:lang w:val="en-US"/>
+        </w:rPr>
+        <w:t xml:space="preserve"> </w:t>
+      </w:r>
+      <w:r>
+        <w:rPr>
+          <w:rFonts w:ascii="Times New Roman" w:hAnsi="Times New Roman"/>
+          <w:bCs/>
+          <w:sz w:val="24"/>
+          <w:szCs w:val="24"/>
+          <w:lang w:val="en-US"/>
+        </w:rPr>
+        <w:t>-html</w:t>
+      </w:r>
+      <w:r>
+        <w:rPr>
+          <w:rFonts w:ascii="Times New Roman" w:hAnsi="Times New Roman"/>
+          <w:bCs/>
+          <w:sz w:val="24"/>
+          <w:szCs w:val="24"/>
+          <w:lang w:val="en-US"/>
+        </w:rPr>
+        <w:t>&gt;&gt;</w:t>
       </w:r>
     </w:p>
     <w:p>
@@ -4508,7 +7067,27 @@
           <w:szCs w:val="24"/>
           <w:lang w:val="en-US"/>
         </w:rPr>
-        <w:t>&lt;&lt;[committee.measure]&gt;&gt;</w:t>
+        <w:t>&lt;&lt;[committee.measure]</w:t>
+      </w:r>
+      <w:r>
+        <w:rPr>
+          <w:rFonts w:ascii="Times New Roman" w:hAnsi="Times New Roman"/>
+          <w:bCs/>
+          <w:sz w:val="24"/>
+          <w:szCs w:val="24"/>
+          <w:lang w:val="en-US"/>
+        </w:rPr>
+        <w:t xml:space="preserve"> -html</w:t>
+      </w:r>
+      <w:r>
+        <w:rPr>
+          <w:rFonts w:ascii="Times New Roman" w:hAnsi="Times New Roman"/>
+          <w:bCs/>
+          <w:sz w:val="24"/>
+          <w:szCs w:val="24"/>
+          <w:lang w:val="en-US"/>
+        </w:rPr>
+        <w:t>&gt;&gt;</w:t>
       </w:r>
     </w:p>
     <w:p>
@@ -4566,10 +7145,10 @@
           <w:lang w:val="fr-CH"/>
         </w:rPr>
       </w:pPr>
-      <w:bookmarkStart w:id="38" w:name="_Hlk120228181"/>
-      <w:bookmarkStart w:id="39" w:name="_Toc405904563"/>
-      <w:bookmarkStart w:id="40" w:name="_Toc109324063"/>
-      <w:bookmarkStart w:id="41" w:name="_Toc109375844"/>
+      <w:bookmarkStart w:id="51" w:name="_Hlk120228181"/>
+      <w:bookmarkStart w:id="52" w:name="_Toc405904563"/>
+      <w:bookmarkStart w:id="53" w:name="_Toc109324063"/>
+      <w:bookmarkStart w:id="54" w:name="_Toc109375844"/>
       <w:r>
         <w:rPr>
           <w:rFonts w:ascii="Times New Roman" w:hAnsi="Times New Roman" w:cs="Times New Roman"/>
@@ -4578,12 +7157,13 @@
         <w:lastRenderedPageBreak/>
         <w:tab/>
       </w:r>
-      <w:bookmarkStart w:id="42" w:name="_Toc109324981"/>
-      <w:bookmarkStart w:id="43" w:name="_Toc141190641"/>
-      <w:bookmarkEnd w:id="38"/>
-      <w:bookmarkEnd w:id="39"/>
-      <w:bookmarkEnd w:id="40"/>
-      <w:bookmarkEnd w:id="41"/>
+      <w:bookmarkStart w:id="55" w:name="_Toc109324981"/>
+      <w:bookmarkStart w:id="56" w:name="_Toc141190641"/>
+      <w:bookmarkStart w:id="57" w:name="_Toc228517454"/>
+      <w:bookmarkEnd w:id="51"/>
+      <w:bookmarkEnd w:id="52"/>
+      <w:bookmarkEnd w:id="53"/>
+      <w:bookmarkEnd w:id="54"/>
       <w:r>
         <w:rPr>
           <w:rFonts w:ascii="Times New Roman" w:hAnsi="Times New Roman" w:cs="Times New Roman"/>
@@ -4591,11 +7171,13 @@
         </w:rPr>
         <w:t>Dérogations à la limitation de la durée de fonction</w:t>
       </w:r>
-      <w:bookmarkEnd w:id="42"/>
-      <w:bookmarkEnd w:id="43"/>
-    </w:p>
-    <w:p>
-      <w:pPr>
+      <w:bookmarkEnd w:id="55"/>
+      <w:bookmarkEnd w:id="56"/>
+      <w:bookmarkEnd w:id="57"/>
+    </w:p>
+    <w:p>
+      <w:pPr>
+        <w:jc w:val="both"/>
         <w:rPr>
           <w:rFonts w:ascii="Times New Roman" w:hAnsi="Times New Roman"/>
           <w:lang w:val="fr-CH"/>
@@ -4911,7 +7493,27 @@
           <w:szCs w:val="24"/>
           <w:lang w:val="en-US"/>
         </w:rPr>
-        <w:t>&lt;&lt;[member.justification]&gt;&gt;</w:t>
+        <w:t>&lt;&lt;[member.justification]</w:t>
+      </w:r>
+      <w:r>
+        <w:rPr>
+          <w:rFonts w:ascii="Times New Roman" w:hAnsi="Times New Roman"/>
+          <w:bCs/>
+          <w:sz w:val="24"/>
+          <w:szCs w:val="24"/>
+          <w:lang w:val="en-US"/>
+        </w:rPr>
+        <w:t xml:space="preserve"> -html</w:t>
+      </w:r>
+      <w:r>
+        <w:rPr>
+          <w:rFonts w:ascii="Times New Roman" w:hAnsi="Times New Roman"/>
+          <w:bCs/>
+          <w:sz w:val="24"/>
+          <w:szCs w:val="24"/>
+          <w:lang w:val="en-US"/>
+        </w:rPr>
+        <w:t>&gt;&gt;</w:t>
       </w:r>
     </w:p>
     <w:p>
@@ -5016,9 +7618,9 @@
           <w:lang w:val="fr-CH"/>
         </w:rPr>
       </w:pPr>
-      <w:bookmarkStart w:id="44" w:name="_Toc405904564"/>
-      <w:bookmarkStart w:id="45" w:name="_Toc109324071"/>
-      <w:bookmarkStart w:id="46" w:name="_Toc109375845"/>
+      <w:bookmarkStart w:id="58" w:name="_Toc405904564"/>
+      <w:bookmarkStart w:id="59" w:name="_Toc109324071"/>
+      <w:bookmarkStart w:id="60" w:name="_Toc109375845"/>
       <w:r>
         <w:rPr>
           <w:rFonts w:ascii="Times New Roman" w:hAnsi="Times New Roman" w:cs="Times New Roman"/>
@@ -5026,11 +7628,12 @@
         </w:rPr>
         <w:tab/>
       </w:r>
-      <w:bookmarkStart w:id="47" w:name="_Toc109324982"/>
-      <w:bookmarkStart w:id="48" w:name="_Toc141190642"/>
-      <w:bookmarkEnd w:id="44"/>
-      <w:bookmarkEnd w:id="45"/>
-      <w:bookmarkEnd w:id="46"/>
+      <w:bookmarkStart w:id="61" w:name="_Toc109324982"/>
+      <w:bookmarkStart w:id="62" w:name="_Toc141190642"/>
+      <w:bookmarkStart w:id="63" w:name="_Toc228517455"/>
+      <w:bookmarkEnd w:id="58"/>
+      <w:bookmarkEnd w:id="59"/>
+      <w:bookmarkEnd w:id="60"/>
       <w:r>
         <w:rPr>
           <w:rFonts w:ascii="Times New Roman" w:hAnsi="Times New Roman" w:cs="Times New Roman"/>
@@ -5038,11 +7641,13 @@
         </w:rPr>
         <w:t>Nominations de membres de l’Assemblée fédérale</w:t>
       </w:r>
-      <w:bookmarkEnd w:id="47"/>
-      <w:bookmarkEnd w:id="48"/>
-    </w:p>
-    <w:p>
-      <w:pPr>
+      <w:bookmarkEnd w:id="61"/>
+      <w:bookmarkEnd w:id="62"/>
+      <w:bookmarkEnd w:id="63"/>
+    </w:p>
+    <w:p>
+      <w:pPr>
+        <w:jc w:val="both"/>
         <w:rPr>
           <w:rFonts w:ascii="Times New Roman" w:hAnsi="Times New Roman"/>
           <w:color w:val="000000"/>
@@ -5320,7 +7925,37 @@
           <w:szCs w:val="24"/>
           <w:lang w:val="en-US"/>
         </w:rPr>
-        <w:t>&lt;&lt;[member.justification]&gt;&gt;</w:t>
+        <w:t>&lt;&lt;[member.justification]</w:t>
+      </w:r>
+      <w:r>
+        <w:rPr>
+          <w:rFonts w:ascii="Times New Roman" w:hAnsi="Times New Roman"/>
+          <w:bCs/>
+          <w:sz w:val="24"/>
+          <w:szCs w:val="24"/>
+          <w:lang w:val="en-US"/>
+        </w:rPr>
+        <w:t xml:space="preserve"> </w:t>
+      </w:r>
+      <w:r>
+        <w:rPr>
+          <w:rFonts w:ascii="Times New Roman" w:hAnsi="Times New Roman"/>
+          <w:bCs/>
+          <w:sz w:val="24"/>
+          <w:szCs w:val="24"/>
+          <w:lang w:val="en-US"/>
+        </w:rPr>
+        <w:t>-html</w:t>
+      </w:r>
+      <w:r>
+        <w:rPr>
+          <w:rFonts w:ascii="Times New Roman" w:hAnsi="Times New Roman"/>
+          <w:bCs/>
+          <w:sz w:val="24"/>
+          <w:szCs w:val="24"/>
+          <w:lang w:val="en-US"/>
+        </w:rPr>
+        <w:t>&gt;&gt;</w:t>
       </w:r>
     </w:p>
     <w:p>
@@ -5360,7 +7995,6 @@
           <w:szCs w:val="24"/>
           <w:lang w:val="en-US" w:eastAsia="de-DE"/>
         </w:rPr>
-        <w:lastRenderedPageBreak/>
         <w:t>&lt;&lt;/if&gt;&gt;</w:t>
       </w:r>
     </w:p>
@@ -5383,6 +8017,7 @@
           <w:szCs w:val="24"/>
           <w:lang w:val="en-US" w:eastAsia="de-DE"/>
         </w:rPr>
+        <w:lastRenderedPageBreak/>
         <w:t>&lt;&lt;/foreach&gt;&gt;</w:t>
       </w:r>
     </w:p>
@@ -5419,9 +8054,9 @@
           <w:lang w:val="fr-CH"/>
         </w:rPr>
       </w:pPr>
-      <w:bookmarkStart w:id="49" w:name="_Toc405904565"/>
-      <w:bookmarkStart w:id="50" w:name="_Toc109324079"/>
-      <w:bookmarkStart w:id="51" w:name="_Toc109375846"/>
+      <w:bookmarkStart w:id="64" w:name="_Toc405904565"/>
+      <w:bookmarkStart w:id="65" w:name="_Toc109324079"/>
+      <w:bookmarkStart w:id="66" w:name="_Toc109375846"/>
       <w:r>
         <w:rPr>
           <w:rFonts w:ascii="Times New Roman" w:hAnsi="Times New Roman" w:cs="Times New Roman"/>
@@ -5429,11 +8064,12 @@
         </w:rPr>
         <w:tab/>
       </w:r>
-      <w:bookmarkStart w:id="52" w:name="_Toc109324983"/>
-      <w:bookmarkStart w:id="53" w:name="_Toc141190643"/>
-      <w:bookmarkEnd w:id="49"/>
-      <w:bookmarkEnd w:id="50"/>
-      <w:bookmarkEnd w:id="51"/>
+      <w:bookmarkStart w:id="67" w:name="_Toc109324983"/>
+      <w:bookmarkStart w:id="68" w:name="_Toc141190643"/>
+      <w:bookmarkStart w:id="69" w:name="_Toc228517456"/>
+      <w:bookmarkEnd w:id="64"/>
+      <w:bookmarkEnd w:id="65"/>
+      <w:bookmarkEnd w:id="66"/>
       <w:r>
         <w:rPr>
           <w:rFonts w:ascii="Times New Roman" w:hAnsi="Times New Roman" w:cs="Times New Roman"/>
@@ -5441,11 +8077,13 @@
         </w:rPr>
         <w:t>Nominations de membres de l’administration fédérale</w:t>
       </w:r>
-      <w:bookmarkEnd w:id="52"/>
-      <w:bookmarkEnd w:id="53"/>
-    </w:p>
-    <w:p>
-      <w:pPr>
+      <w:bookmarkEnd w:id="67"/>
+      <w:bookmarkEnd w:id="68"/>
+      <w:bookmarkEnd w:id="69"/>
+    </w:p>
+    <w:p>
+      <w:pPr>
+        <w:jc w:val="both"/>
         <w:rPr>
           <w:rFonts w:ascii="Times New Roman" w:hAnsi="Times New Roman"/>
           <w:color w:val="000000"/>
@@ -5738,7 +8376,37 @@
           <w:szCs w:val="24"/>
           <w:lang w:val="en-US"/>
         </w:rPr>
-        <w:t>&lt;&lt;[member.justification]&gt;&gt;</w:t>
+        <w:t>&lt;&lt;[member.justification]</w:t>
+      </w:r>
+      <w:r>
+        <w:rPr>
+          <w:rFonts w:ascii="Times New Roman" w:hAnsi="Times New Roman"/>
+          <w:bCs/>
+          <w:sz w:val="24"/>
+          <w:szCs w:val="24"/>
+          <w:lang w:val="en-US"/>
+        </w:rPr>
+        <w:t xml:space="preserve"> </w:t>
+      </w:r>
+      <w:r>
+        <w:rPr>
+          <w:rFonts w:ascii="Times New Roman" w:hAnsi="Times New Roman"/>
+          <w:bCs/>
+          <w:sz w:val="24"/>
+          <w:szCs w:val="24"/>
+          <w:lang w:val="en-US"/>
+        </w:rPr>
+        <w:t>-html</w:t>
+      </w:r>
+      <w:r>
+        <w:rPr>
+          <w:rFonts w:ascii="Times New Roman" w:hAnsi="Times New Roman"/>
+          <w:bCs/>
+          <w:sz w:val="24"/>
+          <w:szCs w:val="24"/>
+          <w:lang w:val="en-US"/>
+        </w:rPr>
+        <w:t>&gt;&gt;</w:t>
       </w:r>
     </w:p>
     <w:p>
@@ -5835,8 +8503,9 @@
           <w:lang w:val="fr-CH"/>
         </w:rPr>
       </w:pPr>
-      <w:bookmarkStart w:id="54" w:name="_Toc109324991"/>
-      <w:bookmarkStart w:id="55" w:name="_Toc141190644"/>
+      <w:bookmarkStart w:id="70" w:name="_Toc109324991"/>
+      <w:bookmarkStart w:id="71" w:name="_Toc141190644"/>
+      <w:bookmarkStart w:id="72" w:name="_Toc228517457"/>
       <w:r>
         <w:rPr>
           <w:rFonts w:ascii="Times New Roman" w:hAnsi="Times New Roman" w:cs="Times New Roman"/>
@@ -5844,8 +8513,9 @@
         </w:rPr>
         <w:t>Organes de direction et représentants de la Confédération</w:t>
       </w:r>
-      <w:bookmarkEnd w:id="54"/>
-      <w:bookmarkEnd w:id="55"/>
+      <w:bookmarkEnd w:id="70"/>
+      <w:bookmarkEnd w:id="71"/>
+      <w:bookmarkEnd w:id="72"/>
     </w:p>
     <w:p>
       <w:pPr>
@@ -5873,7 +8543,7 @@
           <w:lang w:val="fr-CH"/>
         </w:rPr>
       </w:pPr>
-      <w:bookmarkStart w:id="56" w:name="_Toc256000014"/>
+      <w:bookmarkStart w:id="73" w:name="_Toc256000014"/>
       <w:r>
         <w:rPr>
           <w:rFonts w:ascii="Times New Roman" w:hAnsi="Times New Roman" w:cs="Times New Roman"/>
@@ -5881,8 +8551,9 @@
         </w:rPr>
         <w:tab/>
       </w:r>
-      <w:bookmarkStart w:id="57" w:name="_Toc141190645"/>
-      <w:bookmarkEnd w:id="56"/>
+      <w:bookmarkStart w:id="74" w:name="_Toc141190645"/>
+      <w:bookmarkStart w:id="75" w:name="_Toc228517458"/>
+      <w:bookmarkEnd w:id="73"/>
       <w:r>
         <w:rPr>
           <w:rFonts w:ascii="Times New Roman" w:hAnsi="Times New Roman" w:cs="Times New Roman"/>
@@ -5890,7 +8561,8 @@
         </w:rPr>
         <w:t>Sous-représentation des sexes dans les organes de direction</w:t>
       </w:r>
-      <w:bookmarkEnd w:id="57"/>
+      <w:bookmarkEnd w:id="74"/>
+      <w:bookmarkEnd w:id="75"/>
     </w:p>
     <w:p>
       <w:pPr>
@@ -6183,7 +8855,37 @@
           <w:szCs w:val="24"/>
           <w:lang w:val="en-US"/>
         </w:rPr>
-        <w:t>&lt;&lt;[committee.justification]&gt;&gt;</w:t>
+        <w:t>&lt;&lt;[committee.justification]</w:t>
+      </w:r>
+      <w:r>
+        <w:rPr>
+          <w:rFonts w:ascii="Times New Roman" w:hAnsi="Times New Roman"/>
+          <w:bCs/>
+          <w:sz w:val="24"/>
+          <w:szCs w:val="24"/>
+          <w:lang w:val="en-US"/>
+        </w:rPr>
+        <w:t xml:space="preserve"> </w:t>
+      </w:r>
+      <w:r>
+        <w:rPr>
+          <w:rFonts w:ascii="Times New Roman" w:hAnsi="Times New Roman"/>
+          <w:bCs/>
+          <w:sz w:val="24"/>
+          <w:szCs w:val="24"/>
+          <w:lang w:val="en-US"/>
+        </w:rPr>
+        <w:t>-html</w:t>
+      </w:r>
+      <w:r>
+        <w:rPr>
+          <w:rFonts w:ascii="Times New Roman" w:hAnsi="Times New Roman"/>
+          <w:bCs/>
+          <w:sz w:val="24"/>
+          <w:szCs w:val="24"/>
+          <w:lang w:val="en-US"/>
+        </w:rPr>
+        <w:t>&gt;&gt;</w:t>
       </w:r>
     </w:p>
     <w:p>
@@ -6231,7 +8933,27 @@
           <w:szCs w:val="24"/>
           <w:lang w:val="en-US"/>
         </w:rPr>
-        <w:t>&lt;&lt;[committee.measure]&gt;&gt;</w:t>
+        <w:t>&lt;&lt;[committee.measure]</w:t>
+      </w:r>
+      <w:r>
+        <w:rPr>
+          <w:rFonts w:ascii="Times New Roman" w:hAnsi="Times New Roman"/>
+          <w:bCs/>
+          <w:sz w:val="24"/>
+          <w:szCs w:val="24"/>
+          <w:lang w:val="en-US"/>
+        </w:rPr>
+        <w:t xml:space="preserve"> -html</w:t>
+      </w:r>
+      <w:r>
+        <w:rPr>
+          <w:rFonts w:ascii="Times New Roman" w:hAnsi="Times New Roman"/>
+          <w:bCs/>
+          <w:sz w:val="24"/>
+          <w:szCs w:val="24"/>
+          <w:lang w:val="en-US"/>
+        </w:rPr>
+        <w:t>&gt;&gt;</w:t>
       </w:r>
     </w:p>
     <w:p>
@@ -6297,41 +9019,43 @@
           <w:rFonts w:ascii="Times New Roman" w:hAnsi="Times New Roman" w:cs="Times New Roman"/>
           <w:lang w:val="fr-CH"/>
         </w:rPr>
+        <w:tab/>
+      </w:r>
+      <w:bookmarkStart w:id="76" w:name="_Toc141190646"/>
+      <w:bookmarkStart w:id="77" w:name="_Toc228517459"/>
+      <w:r>
+        <w:rPr>
+          <w:rFonts w:ascii="Times New Roman" w:hAnsi="Times New Roman" w:cs="Times New Roman"/>
+          <w:lang w:val="fr-CH"/>
+        </w:rPr>
+        <w:t>Sous-représentation des langues dans les organes de direction</w:t>
+      </w:r>
+      <w:bookmarkEnd w:id="76"/>
+      <w:bookmarkEnd w:id="77"/>
+    </w:p>
+    <w:p>
+      <w:pPr>
+        <w:rPr>
+          <w:rFonts w:ascii="Times New Roman" w:hAnsi="Times New Roman"/>
+          <w:lang w:val="fr-CH"/>
+        </w:rPr>
+      </w:pPr>
+    </w:p>
+    <w:p>
+      <w:pPr>
+        <w:rPr>
+          <w:rFonts w:ascii="Times New Roman" w:hAnsi="Times New Roman"/>
+          <w:szCs w:val="24"/>
+          <w:lang w:val="en-US"/>
+        </w:rPr>
+      </w:pPr>
+      <w:r>
+        <w:rPr>
+          <w:rFonts w:ascii="Times New Roman" w:hAnsi="Times New Roman"/>
+          <w:szCs w:val="24"/>
+          <w:lang w:val="en-US"/>
+        </w:rPr>
         <w:lastRenderedPageBreak/>
-        <w:tab/>
-      </w:r>
-      <w:bookmarkStart w:id="58" w:name="_Toc141190646"/>
-      <w:r>
-        <w:rPr>
-          <w:rFonts w:ascii="Times New Roman" w:hAnsi="Times New Roman" w:cs="Times New Roman"/>
-          <w:lang w:val="fr-CH"/>
-        </w:rPr>
-        <w:t>Sous-représentation des langues dans les organes de direction</w:t>
-      </w:r>
-      <w:bookmarkEnd w:id="58"/>
-    </w:p>
-    <w:p>
-      <w:pPr>
-        <w:rPr>
-          <w:rFonts w:ascii="Times New Roman" w:hAnsi="Times New Roman"/>
-          <w:lang w:val="fr-CH"/>
-        </w:rPr>
-      </w:pPr>
-    </w:p>
-    <w:p>
-      <w:pPr>
-        <w:rPr>
-          <w:rFonts w:ascii="Times New Roman" w:hAnsi="Times New Roman"/>
-          <w:szCs w:val="24"/>
-          <w:lang w:val="en-US"/>
-        </w:rPr>
-      </w:pPr>
-      <w:r>
-        <w:rPr>
-          <w:rFonts w:ascii="Times New Roman" w:hAnsi="Times New Roman"/>
-          <w:szCs w:val="24"/>
-          <w:lang w:val="en-US"/>
-        </w:rPr>
         <w:t>&lt;&lt;foreach [department in appendixReport.missingLanguageMembers</w:t>
       </w:r>
       <w:r>
@@ -6810,7 +9534,27 @@
           <w:szCs w:val="24"/>
           <w:lang w:val="en-US"/>
         </w:rPr>
-        <w:t>&lt;&lt;[committee.justification]&gt;&gt;</w:t>
+        <w:t>&lt;&lt;[committee.justification]</w:t>
+      </w:r>
+      <w:r>
+        <w:rPr>
+          <w:rFonts w:ascii="Times New Roman" w:hAnsi="Times New Roman"/>
+          <w:bCs/>
+          <w:sz w:val="24"/>
+          <w:szCs w:val="24"/>
+          <w:lang w:val="en-US"/>
+        </w:rPr>
+        <w:t xml:space="preserve"> -html</w:t>
+      </w:r>
+      <w:r>
+        <w:rPr>
+          <w:rFonts w:ascii="Times New Roman" w:hAnsi="Times New Roman"/>
+          <w:bCs/>
+          <w:sz w:val="24"/>
+          <w:szCs w:val="24"/>
+          <w:lang w:val="en-US"/>
+        </w:rPr>
+        <w:t>&gt;&gt;</w:t>
       </w:r>
     </w:p>
     <w:p>
@@ -6858,7 +9602,27 @@
           <w:szCs w:val="24"/>
           <w:lang w:val="en-US"/>
         </w:rPr>
-        <w:t>&lt;&lt;[committee.measure]&gt;&gt;</w:t>
+        <w:t>&lt;&lt;[committee.measure]</w:t>
+      </w:r>
+      <w:r>
+        <w:rPr>
+          <w:rFonts w:ascii="Times New Roman" w:hAnsi="Times New Roman"/>
+          <w:bCs/>
+          <w:sz w:val="24"/>
+          <w:szCs w:val="24"/>
+          <w:lang w:val="en-US"/>
+        </w:rPr>
+        <w:t xml:space="preserve"> -html</w:t>
+      </w:r>
+      <w:r>
+        <w:rPr>
+          <w:rFonts w:ascii="Times New Roman" w:hAnsi="Times New Roman"/>
+          <w:bCs/>
+          <w:sz w:val="24"/>
+          <w:szCs w:val="24"/>
+          <w:lang w:val="en-US"/>
+        </w:rPr>
+        <w:t>&gt;&gt;</w:t>
       </w:r>
     </w:p>
     <w:p>
@@ -6923,8 +9687,9 @@
         </w:rPr>
         <w:tab/>
       </w:r>
-      <w:bookmarkStart w:id="59" w:name="_Hlk141091217"/>
-      <w:bookmarkStart w:id="60" w:name="_Toc141190647"/>
+      <w:bookmarkStart w:id="78" w:name="_Hlk141091217"/>
+      <w:bookmarkStart w:id="79" w:name="_Toc141190647"/>
+      <w:bookmarkStart w:id="80" w:name="_Toc228517460"/>
       <w:r>
         <w:rPr>
           <w:rFonts w:ascii="Times New Roman" w:hAnsi="Times New Roman" w:cs="Times New Roman"/>
@@ -6932,7 +9697,7 @@
         </w:rPr>
         <w:t xml:space="preserve">Sous-représentation </w:t>
       </w:r>
-      <w:bookmarkEnd w:id="59"/>
+      <w:bookmarkEnd w:id="78"/>
       <w:r>
         <w:rPr>
           <w:rFonts w:ascii="Times New Roman" w:hAnsi="Times New Roman" w:cs="Times New Roman"/>
@@ -6940,7 +9705,8 @@
         </w:rPr>
         <w:t>des sexes parmi les représentants de la Confédération</w:t>
       </w:r>
-      <w:bookmarkEnd w:id="60"/>
+      <w:bookmarkEnd w:id="79"/>
+      <w:bookmarkEnd w:id="80"/>
     </w:p>
     <w:p>
       <w:pPr>
@@ -7262,7 +10028,27 @@
           <w:szCs w:val="24"/>
           <w:lang w:val="en-US"/>
         </w:rPr>
-        <w:t>&lt;&lt;[committee.justification]&gt;&gt;</w:t>
+        <w:t>&lt;&lt;[committee.justification]</w:t>
+      </w:r>
+      <w:r>
+        <w:rPr>
+          <w:rFonts w:ascii="Times New Roman" w:hAnsi="Times New Roman"/>
+          <w:bCs/>
+          <w:sz w:val="24"/>
+          <w:szCs w:val="24"/>
+          <w:lang w:val="en-US"/>
+        </w:rPr>
+        <w:t xml:space="preserve"> -html</w:t>
+      </w:r>
+      <w:r>
+        <w:rPr>
+          <w:rFonts w:ascii="Times New Roman" w:hAnsi="Times New Roman"/>
+          <w:bCs/>
+          <w:sz w:val="24"/>
+          <w:szCs w:val="24"/>
+          <w:lang w:val="en-US"/>
+        </w:rPr>
+        <w:t>&gt;&gt;</w:t>
       </w:r>
     </w:p>
     <w:p>
@@ -7310,7 +10096,27 @@
           <w:szCs w:val="24"/>
           <w:lang w:val="en-US"/>
         </w:rPr>
-        <w:t>&lt;&lt;[committee.measure]&gt;&gt;</w:t>
+        <w:t>&lt;&lt;[committee.measure]</w:t>
+      </w:r>
+      <w:r>
+        <w:rPr>
+          <w:rFonts w:ascii="Times New Roman" w:hAnsi="Times New Roman"/>
+          <w:bCs/>
+          <w:sz w:val="24"/>
+          <w:szCs w:val="24"/>
+          <w:lang w:val="en-US"/>
+        </w:rPr>
+        <w:t xml:space="preserve"> -html</w:t>
+      </w:r>
+      <w:r>
+        <w:rPr>
+          <w:rFonts w:ascii="Times New Roman" w:hAnsi="Times New Roman"/>
+          <w:bCs/>
+          <w:sz w:val="24"/>
+          <w:szCs w:val="24"/>
+          <w:lang w:val="en-US"/>
+        </w:rPr>
+        <w:t>&gt;&gt;</w:t>
       </w:r>
     </w:p>
     <w:p>
@@ -7378,7 +10184,8 @@
         </w:rPr>
         <w:tab/>
       </w:r>
-      <w:bookmarkStart w:id="61" w:name="_Toc141190648"/>
+      <w:bookmarkStart w:id="81" w:name="_Toc141190648"/>
+      <w:bookmarkStart w:id="82" w:name="_Toc228517461"/>
       <w:r>
         <w:rPr>
           <w:rFonts w:ascii="Times New Roman" w:hAnsi="Times New Roman" w:cs="Times New Roman"/>
@@ -7386,7 +10193,8 @@
         </w:rPr>
         <w:t>Sous-représentation des langues parmi les représentants de la Confédération</w:t>
       </w:r>
-      <w:bookmarkEnd w:id="61"/>
+      <w:bookmarkEnd w:id="81"/>
+      <w:bookmarkEnd w:id="82"/>
     </w:p>
     <w:p>
       <w:pPr>
@@ -7662,7 +10470,6 @@
           <w:szCs w:val="24"/>
           <w:lang w:val="en-US" w:eastAsia="de-DE"/>
         </w:rPr>
-        <w:lastRenderedPageBreak/>
         <w:t>D</w:t>
       </w:r>
       <w:r>
@@ -7888,6 +10695,7 @@
           <w:szCs w:val="24"/>
           <w:lang w:val="en-US"/>
         </w:rPr>
+        <w:lastRenderedPageBreak/>
         <w:t>Justification</w:t>
       </w:r>
       <w:r>
@@ -7910,7 +10718,27 @@
           <w:szCs w:val="24"/>
           <w:lang w:val="en-US"/>
         </w:rPr>
-        <w:t>&lt;&lt;[committee.justification]&gt;&gt;</w:t>
+        <w:t>&lt;&lt;[committee.justification]</w:t>
+      </w:r>
+      <w:r>
+        <w:rPr>
+          <w:rFonts w:ascii="Times New Roman" w:hAnsi="Times New Roman"/>
+          <w:bCs/>
+          <w:sz w:val="24"/>
+          <w:szCs w:val="24"/>
+          <w:lang w:val="en-US"/>
+        </w:rPr>
+        <w:t xml:space="preserve"> -html</w:t>
+      </w:r>
+      <w:r>
+        <w:rPr>
+          <w:rFonts w:ascii="Times New Roman" w:hAnsi="Times New Roman"/>
+          <w:bCs/>
+          <w:sz w:val="24"/>
+          <w:szCs w:val="24"/>
+          <w:lang w:val="en-US"/>
+        </w:rPr>
+        <w:t>&gt;&gt;</w:t>
       </w:r>
     </w:p>
     <w:p>
@@ -7958,7 +10786,37 @@
           <w:szCs w:val="24"/>
           <w:lang w:val="en-US"/>
         </w:rPr>
-        <w:t>&lt;&lt;[committee.measure]&gt;&gt;</w:t>
+        <w:t>&lt;&lt;[committee.measure]</w:t>
+      </w:r>
+      <w:r>
+        <w:rPr>
+          <w:rFonts w:ascii="Times New Roman" w:hAnsi="Times New Roman"/>
+          <w:bCs/>
+          <w:sz w:val="24"/>
+          <w:szCs w:val="24"/>
+          <w:lang w:val="en-US"/>
+        </w:rPr>
+        <w:t xml:space="preserve"> </w:t>
+      </w:r>
+      <w:r>
+        <w:rPr>
+          <w:rFonts w:ascii="Times New Roman" w:hAnsi="Times New Roman"/>
+          <w:bCs/>
+          <w:sz w:val="24"/>
+          <w:szCs w:val="24"/>
+          <w:lang w:val="en-US"/>
+        </w:rPr>
+        <w:t>-html</w:t>
+      </w:r>
+      <w:r>
+        <w:rPr>
+          <w:rFonts w:ascii="Times New Roman" w:hAnsi="Times New Roman"/>
+          <w:bCs/>
+          <w:sz w:val="24"/>
+          <w:szCs w:val="24"/>
+          <w:lang w:val="en-US"/>
+        </w:rPr>
+        <w:t>&gt;&gt;</w:t>
       </w:r>
     </w:p>
     <w:p>
@@ -8015,8 +10873,9 @@
           <w:lang w:val="fr-CH"/>
         </w:rPr>
       </w:pPr>
-      <w:bookmarkStart w:id="62" w:name="_Toc109324992"/>
-      <w:bookmarkStart w:id="63" w:name="_Toc141190649"/>
+      <w:bookmarkStart w:id="83" w:name="_Toc109324992"/>
+      <w:bookmarkStart w:id="84" w:name="_Toc141190649"/>
+      <w:bookmarkStart w:id="85" w:name="_Toc228517462"/>
       <w:r>
         <w:rPr>
           <w:rFonts w:ascii="Times New Roman" w:hAnsi="Times New Roman" w:cs="Times New Roman"/>
@@ -8024,8 +10883,9 @@
         </w:rPr>
         <w:t>Nomination de membres de l’Assemblée fédérale qui ne le seront plus au début du mandat</w:t>
       </w:r>
-      <w:bookmarkEnd w:id="62"/>
-      <w:bookmarkEnd w:id="63"/>
+      <w:bookmarkEnd w:id="83"/>
+      <w:bookmarkEnd w:id="84"/>
+      <w:bookmarkEnd w:id="85"/>
     </w:p>
     <w:p>
       <w:pPr>
@@ -8060,7 +10920,8 @@
           <w:lang w:val="fr-CH"/>
         </w:rPr>
       </w:pPr>
-      <w:bookmarkStart w:id="64" w:name="_Toc209534254"/>
+      <w:bookmarkStart w:id="86" w:name="_Toc209534254"/>
+      <w:bookmarkStart w:id="87" w:name="_Toc228517463"/>
       <w:r>
         <w:rPr>
           <w:rFonts w:ascii="Times New Roman" w:hAnsi="Times New Roman" w:cs="Times New Roman"/>
@@ -8075,7 +10936,8 @@
         </w:rPr>
         <w:t xml:space="preserve"> &lt;&lt;[department.name]&gt;&gt;</w:t>
       </w:r>
-      <w:bookmarkEnd w:id="64"/>
+      <w:bookmarkEnd w:id="86"/>
+      <w:bookmarkEnd w:id="87"/>
     </w:p>
     <w:p>
       <w:pPr>
@@ -8334,8 +11196,9 @@
           <w:rFonts w:ascii="Times New Roman" w:hAnsi="Times New Roman" w:cs="Times New Roman"/>
         </w:rPr>
       </w:pPr>
-      <w:bookmarkStart w:id="65" w:name="_Toc109324993"/>
-      <w:bookmarkStart w:id="66" w:name="_Toc141190650"/>
+      <w:bookmarkStart w:id="88" w:name="_Toc109324993"/>
+      <w:bookmarkStart w:id="89" w:name="_Toc141190650"/>
+      <w:bookmarkStart w:id="90" w:name="_Toc228517464"/>
       <w:r>
         <w:rPr>
           <w:rFonts w:ascii="Times New Roman" w:hAnsi="Times New Roman" w:cs="Times New Roman"/>
@@ -8349,8 +11212,9 @@
         </w:rPr>
         <w:t xml:space="preserve"> multiples</w:t>
       </w:r>
-      <w:bookmarkEnd w:id="65"/>
-      <w:bookmarkEnd w:id="66"/>
+      <w:bookmarkEnd w:id="88"/>
+      <w:bookmarkEnd w:id="89"/>
+      <w:bookmarkEnd w:id="90"/>
     </w:p>
     <w:p>
       <w:pPr>
@@ -8593,7 +11457,8 @@
           <w:rFonts w:ascii="Times New Roman" w:hAnsi="Times New Roman" w:cs="Times New Roman"/>
         </w:rPr>
       </w:pPr>
-      <w:bookmarkStart w:id="67" w:name="_Toc209534256"/>
+      <w:bookmarkStart w:id="91" w:name="_Toc209534256"/>
+      <w:bookmarkStart w:id="92" w:name="_Toc228517465"/>
       <w:r>
         <w:rPr>
           <w:rFonts w:ascii="Times New Roman" w:hAnsi="Times New Roman" w:cs="Times New Roman"/>
@@ -8606,7 +11471,8 @@
         </w:rPr>
         <w:t>Auswahlverfahren</w:t>
       </w:r>
-      <w:bookmarkEnd w:id="67"/>
+      <w:bookmarkEnd w:id="91"/>
+      <w:bookmarkEnd w:id="92"/>
     </w:p>
     <w:p>
       <w:pPr>
@@ -8665,7 +11531,8 @@
           <w:lang w:val="fr-CH"/>
         </w:rPr>
       </w:pPr>
-      <w:bookmarkStart w:id="68" w:name="_Toc209534257"/>
+      <w:bookmarkStart w:id="93" w:name="_Toc209534257"/>
+      <w:bookmarkStart w:id="94" w:name="_Toc228517466"/>
       <w:r>
         <w:rPr>
           <w:rFonts w:ascii="Times New Roman" w:hAnsi="Times New Roman" w:cs="Times New Roman"/>
@@ -8680,7 +11547,8 @@
         </w:rPr>
         <w:t xml:space="preserve"> &lt;&lt;[department.name]&gt;&gt;</w:t>
       </w:r>
-      <w:bookmarkEnd w:id="68"/>
+      <w:bookmarkEnd w:id="93"/>
+      <w:bookmarkEnd w:id="94"/>
     </w:p>
     <w:p>
       <w:pPr>
@@ -8744,7 +11612,6 @@
           <w:szCs w:val="24"/>
           <w:lang w:val="en-US"/>
         </w:rPr>
-        <w:lastRenderedPageBreak/>
         <w:t>&lt;&lt;foreach [committee in department.committees]&gt;&gt;</w:t>
       </w:r>
     </w:p>
@@ -8799,6 +11666,7 @@
           <w:szCs w:val="24"/>
           <w:lang w:val="en-US" w:eastAsia="de-DE"/>
         </w:rPr>
+        <w:lastRenderedPageBreak/>
         <w:t>&lt;&lt;[</w:t>
       </w:r>
       <w:r>
@@ -8875,7 +11743,8 @@
           <w:rFonts w:ascii="Times New Roman" w:hAnsi="Times New Roman" w:cs="Times New Roman"/>
         </w:rPr>
       </w:pPr>
-      <w:bookmarkStart w:id="69" w:name="_Toc209534258"/>
+      <w:bookmarkStart w:id="95" w:name="_Toc209534258"/>
+      <w:bookmarkStart w:id="96" w:name="_Toc228517467"/>
       <w:r>
         <w:rPr>
           <w:rFonts w:ascii="Times New Roman" w:hAnsi="Times New Roman" w:cs="Times New Roman"/>
@@ -8888,7 +11757,8 @@
         </w:rPr>
         <w:t>Übereinstimmung der Kandidaten mit dem Kompetenzprofil</w:t>
       </w:r>
-      <w:bookmarkEnd w:id="69"/>
+      <w:bookmarkEnd w:id="95"/>
+      <w:bookmarkEnd w:id="96"/>
     </w:p>
     <w:p>
       <w:pPr>
@@ -8946,7 +11816,8 @@
           <w:lang w:val="fr-CH"/>
         </w:rPr>
       </w:pPr>
-      <w:bookmarkStart w:id="70" w:name="_Toc209534259"/>
+      <w:bookmarkStart w:id="97" w:name="_Toc209534259"/>
+      <w:bookmarkStart w:id="98" w:name="_Toc228517468"/>
       <w:r>
         <w:rPr>
           <w:rFonts w:ascii="Times New Roman" w:hAnsi="Times New Roman" w:cs="Times New Roman"/>
@@ -8961,7 +11832,8 @@
         </w:rPr>
         <w:t xml:space="preserve"> &lt;&lt;[department.name]&gt;&gt;</w:t>
       </w:r>
-      <w:bookmarkEnd w:id="70"/>
+      <w:bookmarkEnd w:id="97"/>
+      <w:bookmarkEnd w:id="98"/>
     </w:p>
     <w:p>
       <w:pPr>
@@ -9217,15 +12089,15 @@
           <w:rFonts w:ascii="Times New Roman" w:eastAsia="Times New Roman" w:hAnsi="Times New Roman"/>
           <w:sz w:val="24"/>
           <w:szCs w:val="24"/>
-          <w:lang w:val="fr-CH" w:eastAsia="de-DE"/>
-        </w:rPr>
-      </w:pPr>
-      <w:r>
-        <w:rPr>
-          <w:rFonts w:ascii="Times New Roman" w:eastAsia="Times New Roman" w:hAnsi="Times New Roman"/>
-          <w:sz w:val="24"/>
-          <w:szCs w:val="24"/>
-          <w:lang w:val="fr-CH" w:eastAsia="de-DE"/>
+          <w:lang w:val="en-US" w:eastAsia="de-DE"/>
+        </w:rPr>
+      </w:pPr>
+      <w:r>
+        <w:rPr>
+          <w:rFonts w:ascii="Times New Roman" w:eastAsia="Times New Roman" w:hAnsi="Times New Roman"/>
+          <w:sz w:val="24"/>
+          <w:szCs w:val="24"/>
+          <w:lang w:val="en-US" w:eastAsia="de-DE"/>
         </w:rPr>
         <w:t>&lt;&lt;/foreach&gt;&gt;</w:t>
       </w:r>
@@ -9237,15 +12109,15 @@
           <w:rFonts w:ascii="Times New Roman" w:eastAsia="Times New Roman" w:hAnsi="Times New Roman"/>
           <w:sz w:val="24"/>
           <w:szCs w:val="24"/>
-          <w:lang w:val="fr-CH" w:eastAsia="de-DE"/>
-        </w:rPr>
-      </w:pPr>
-      <w:r>
-        <w:rPr>
-          <w:rFonts w:ascii="Times New Roman" w:eastAsia="Times New Roman" w:hAnsi="Times New Roman"/>
-          <w:sz w:val="24"/>
-          <w:szCs w:val="24"/>
-          <w:lang w:val="fr-CH" w:eastAsia="de-DE"/>
+          <w:lang w:val="en-US" w:eastAsia="de-DE"/>
+        </w:rPr>
+      </w:pPr>
+      <w:r>
+        <w:rPr>
+          <w:rFonts w:ascii="Times New Roman" w:eastAsia="Times New Roman" w:hAnsi="Times New Roman"/>
+          <w:sz w:val="24"/>
+          <w:szCs w:val="24"/>
+          <w:lang w:val="en-US" w:eastAsia="de-DE"/>
         </w:rPr>
         <w:t>&lt;&lt;/if&gt;&gt;</w:t>
       </w:r>
@@ -9258,7 +12130,7 @@
           <w:rFonts w:ascii="Times New Roman" w:eastAsia="Times New Roman" w:hAnsi="Times New Roman"/>
           <w:sz w:val="24"/>
           <w:szCs w:val="24"/>
-          <w:lang w:val="fr-CH" w:eastAsia="de-DE"/>
+          <w:lang w:val="en-US" w:eastAsia="de-DE"/>
         </w:rPr>
       </w:pPr>
       <w:r>
@@ -9267,7 +12139,7 @@
           <w:b/>
           <w:sz w:val="24"/>
           <w:szCs w:val="24"/>
-          <w:lang w:val="fr-CH" w:eastAsia="de-DE"/>
+          <w:lang w:val="en-US" w:eastAsia="de-DE"/>
         </w:rPr>
         <w:t>&lt;&lt;/foreach&gt;&gt;</w:t>
       </w:r>
@@ -9288,17 +12160,6 @@
         </w:rPr>
         <w:t>&lt;&lt;/foreach&gt;&gt;</w:t>
       </w:r>
-    </w:p>
-    <w:p>
-      <w:pPr>
-        <w:spacing w:before="100" w:beforeAutospacing="1" w:after="100" w:afterAutospacing="1"/>
-        <w:rPr>
-          <w:rFonts w:ascii="Times New Roman" w:hAnsi="Times New Roman"/>
-          <w:i/>
-          <w:szCs w:val="24"/>
-          <w:lang w:val="fr-CH"/>
-        </w:rPr>
-      </w:pPr>
     </w:p>
     <w:p>
       <w:pPr>

</xml_diff>

<commit_message>
feat(report): sanitize HTML output in report export #BKDO-2333
</commit_message>
<xml_diff>
--- a/src/Bk.APG.Api/Templates/Appendix_FederalCouncil_French.docx
+++ b/src/Bk.APG.Api/Templates/Appendix_FederalCouncil_French.docx
@@ -326,7 +326,7 @@
     </w:p>
     <w:p>
       <w:pPr>
-        <w:pStyle w:val="Verzeichnis2"/>
+        <w:pStyle w:val="TOC2"/>
         <w:tabs>
           <w:tab w:val="left" w:pos="720"/>
           <w:tab w:val="right" w:leader="dot" w:pos="9061"/>
@@ -339,7 +339,7 @@
     </w:p>
     <w:p>
       <w:pPr>
-        <w:pStyle w:val="Verzeichnis1"/>
+        <w:pStyle w:val="TOC1"/>
         <w:rPr>
           <w:rFonts w:eastAsiaTheme="minorEastAsia" w:cstheme="minorBidi"/>
           <w:b w:val="0"/>
@@ -458,7 +458,7 @@
     </w:p>
     <w:p>
       <w:pPr>
-        <w:pStyle w:val="Verzeichnis2"/>
+        <w:pStyle w:val="TOC2"/>
         <w:tabs>
           <w:tab w:val="left" w:pos="960"/>
           <w:tab w:val="right" w:leader="dot" w:pos="9061"/>
@@ -558,7 +558,7 @@
     </w:p>
     <w:p>
       <w:pPr>
-        <w:pStyle w:val="Verzeichnis1"/>
+        <w:pStyle w:val="TOC1"/>
         <w:rPr>
           <w:rFonts w:eastAsiaTheme="minorEastAsia" w:cstheme="minorBidi"/>
           <w:b w:val="0"/>
@@ -654,7 +654,7 @@
     </w:p>
     <w:p>
       <w:pPr>
-        <w:pStyle w:val="Verzeichnis2"/>
+        <w:pStyle w:val="TOC2"/>
         <w:tabs>
           <w:tab w:val="left" w:pos="960"/>
           <w:tab w:val="right" w:leader="dot" w:pos="9061"/>
@@ -754,7 +754,7 @@
     </w:p>
     <w:p>
       <w:pPr>
-        <w:pStyle w:val="Verzeichnis1"/>
+        <w:pStyle w:val="TOC1"/>
         <w:rPr>
           <w:rFonts w:eastAsiaTheme="minorEastAsia" w:cstheme="minorBidi"/>
           <w:b w:val="0"/>
@@ -850,7 +850,7 @@
     </w:p>
     <w:p>
       <w:pPr>
-        <w:pStyle w:val="Verzeichnis2"/>
+        <w:pStyle w:val="TOC2"/>
         <w:tabs>
           <w:tab w:val="left" w:pos="960"/>
           <w:tab w:val="right" w:leader="dot" w:pos="9061"/>
@@ -950,7 +950,7 @@
     </w:p>
     <w:p>
       <w:pPr>
-        <w:pStyle w:val="Verzeichnis1"/>
+        <w:pStyle w:val="TOC1"/>
         <w:rPr>
           <w:rFonts w:eastAsiaTheme="minorEastAsia" w:cstheme="minorBidi"/>
           <w:b w:val="0"/>
@@ -1044,7 +1044,7 @@
     </w:p>
     <w:p>
       <w:pPr>
-        <w:pStyle w:val="Verzeichnis2"/>
+        <w:pStyle w:val="TOC2"/>
         <w:tabs>
           <w:tab w:val="left" w:pos="960"/>
           <w:tab w:val="right" w:leader="dot" w:pos="9061"/>
@@ -1144,7 +1144,7 @@
     </w:p>
     <w:p>
       <w:pPr>
-        <w:pStyle w:val="Verzeichnis1"/>
+        <w:pStyle w:val="TOC1"/>
         <w:rPr>
           <w:rFonts w:eastAsiaTheme="minorEastAsia" w:cstheme="minorBidi"/>
           <w:b w:val="0"/>
@@ -1240,7 +1240,7 @@
     </w:p>
     <w:p>
       <w:pPr>
-        <w:pStyle w:val="Verzeichnis2"/>
+        <w:pStyle w:val="TOC2"/>
         <w:tabs>
           <w:tab w:val="left" w:pos="960"/>
           <w:tab w:val="right" w:leader="dot" w:pos="9061"/>
@@ -1340,7 +1340,7 @@
     </w:p>
     <w:p>
       <w:pPr>
-        <w:pStyle w:val="Verzeichnis1"/>
+        <w:pStyle w:val="TOC1"/>
         <w:rPr>
           <w:rFonts w:eastAsiaTheme="minorEastAsia" w:cstheme="minorBidi"/>
           <w:b w:val="0"/>
@@ -1436,7 +1436,7 @@
     </w:p>
     <w:p>
       <w:pPr>
-        <w:pStyle w:val="Verzeichnis2"/>
+        <w:pStyle w:val="TOC2"/>
         <w:tabs>
           <w:tab w:val="left" w:pos="960"/>
           <w:tab w:val="right" w:leader="dot" w:pos="9061"/>
@@ -1536,7 +1536,7 @@
     </w:p>
     <w:p>
       <w:pPr>
-        <w:pStyle w:val="Verzeichnis1"/>
+        <w:pStyle w:val="TOC1"/>
         <w:rPr>
           <w:rFonts w:eastAsiaTheme="minorEastAsia" w:cstheme="minorBidi"/>
           <w:b w:val="0"/>
@@ -1632,7 +1632,7 @@
     </w:p>
     <w:p>
       <w:pPr>
-        <w:pStyle w:val="Verzeichnis2"/>
+        <w:pStyle w:val="TOC2"/>
         <w:tabs>
           <w:tab w:val="left" w:pos="960"/>
           <w:tab w:val="right" w:leader="dot" w:pos="9061"/>
@@ -1732,7 +1732,7 @@
     </w:p>
     <w:p>
       <w:pPr>
-        <w:pStyle w:val="Verzeichnis2"/>
+        <w:pStyle w:val="TOC2"/>
         <w:tabs>
           <w:tab w:val="left" w:pos="960"/>
           <w:tab w:val="right" w:leader="dot" w:pos="9061"/>
@@ -1832,7 +1832,7 @@
     </w:p>
     <w:p>
       <w:pPr>
-        <w:pStyle w:val="Verzeichnis2"/>
+        <w:pStyle w:val="TOC2"/>
         <w:tabs>
           <w:tab w:val="left" w:pos="960"/>
           <w:tab w:val="right" w:leader="dot" w:pos="9061"/>
@@ -1932,7 +1932,7 @@
     </w:p>
     <w:p>
       <w:pPr>
-        <w:pStyle w:val="Verzeichnis2"/>
+        <w:pStyle w:val="TOC2"/>
         <w:tabs>
           <w:tab w:val="left" w:pos="960"/>
           <w:tab w:val="right" w:leader="dot" w:pos="9061"/>
@@ -2032,7 +2032,7 @@
     </w:p>
     <w:p>
       <w:pPr>
-        <w:pStyle w:val="Verzeichnis2"/>
+        <w:pStyle w:val="TOC2"/>
         <w:tabs>
           <w:tab w:val="left" w:pos="960"/>
           <w:tab w:val="right" w:leader="dot" w:pos="9061"/>
@@ -2132,7 +2132,7 @@
     </w:p>
     <w:p>
       <w:pPr>
-        <w:pStyle w:val="Verzeichnis2"/>
+        <w:pStyle w:val="TOC2"/>
         <w:tabs>
           <w:tab w:val="left" w:pos="960"/>
           <w:tab w:val="right" w:leader="dot" w:pos="9061"/>
@@ -2232,7 +2232,7 @@
     </w:p>
     <w:p>
       <w:pPr>
-        <w:pStyle w:val="Verzeichnis1"/>
+        <w:pStyle w:val="TOC1"/>
         <w:rPr>
           <w:rFonts w:eastAsiaTheme="minorEastAsia" w:cstheme="minorBidi"/>
           <w:b w:val="0"/>
@@ -2328,7 +2328,7 @@
     </w:p>
     <w:p>
       <w:pPr>
-        <w:pStyle w:val="Verzeichnis2"/>
+        <w:pStyle w:val="TOC2"/>
         <w:tabs>
           <w:tab w:val="left" w:pos="960"/>
           <w:tab w:val="right" w:leader="dot" w:pos="9061"/>
@@ -2428,7 +2428,7 @@
     </w:p>
     <w:p>
       <w:pPr>
-        <w:pStyle w:val="Verzeichnis2"/>
+        <w:pStyle w:val="TOC2"/>
         <w:tabs>
           <w:tab w:val="left" w:pos="960"/>
           <w:tab w:val="right" w:leader="dot" w:pos="9061"/>
@@ -2528,7 +2528,7 @@
     </w:p>
     <w:p>
       <w:pPr>
-        <w:pStyle w:val="Verzeichnis2"/>
+        <w:pStyle w:val="TOC2"/>
         <w:tabs>
           <w:tab w:val="left" w:pos="960"/>
           <w:tab w:val="right" w:leader="dot" w:pos="9061"/>
@@ -2628,7 +2628,7 @@
     </w:p>
     <w:p>
       <w:pPr>
-        <w:pStyle w:val="Verzeichnis2"/>
+        <w:pStyle w:val="TOC2"/>
         <w:tabs>
           <w:tab w:val="left" w:pos="960"/>
           <w:tab w:val="right" w:leader="dot" w:pos="9061"/>
@@ -2728,7 +2728,7 @@
     </w:p>
     <w:p>
       <w:pPr>
-        <w:pStyle w:val="Verzeichnis1"/>
+        <w:pStyle w:val="TOC1"/>
         <w:rPr>
           <w:rFonts w:eastAsiaTheme="minorEastAsia" w:cstheme="minorBidi"/>
           <w:b w:val="0"/>
@@ -2824,7 +2824,7 @@
     </w:p>
     <w:p>
       <w:pPr>
-        <w:pStyle w:val="Verzeichnis2"/>
+        <w:pStyle w:val="TOC2"/>
         <w:tabs>
           <w:tab w:val="left" w:pos="960"/>
           <w:tab w:val="right" w:leader="dot" w:pos="9061"/>
@@ -2924,7 +2924,7 @@
     </w:p>
     <w:p>
       <w:pPr>
-        <w:pStyle w:val="Verzeichnis1"/>
+        <w:pStyle w:val="TOC1"/>
         <w:rPr>
           <w:rFonts w:eastAsiaTheme="minorEastAsia" w:cstheme="minorBidi"/>
           <w:b w:val="0"/>
@@ -3027,7 +3027,7 @@
     </w:p>
     <w:p>
       <w:pPr>
-        <w:pStyle w:val="Verzeichnis1"/>
+        <w:pStyle w:val="TOC1"/>
         <w:rPr>
           <w:rFonts w:eastAsiaTheme="minorEastAsia" w:cstheme="minorBidi"/>
           <w:b w:val="0"/>
@@ -3121,7 +3121,7 @@
     </w:p>
     <w:p>
       <w:pPr>
-        <w:pStyle w:val="Verzeichnis2"/>
+        <w:pStyle w:val="TOC2"/>
         <w:tabs>
           <w:tab w:val="left" w:pos="960"/>
           <w:tab w:val="right" w:leader="dot" w:pos="9061"/>
@@ -3221,7 +3221,7 @@
     </w:p>
     <w:p>
       <w:pPr>
-        <w:pStyle w:val="Verzeichnis1"/>
+        <w:pStyle w:val="TOC1"/>
         <w:rPr>
           <w:rFonts w:eastAsiaTheme="minorEastAsia" w:cstheme="minorBidi"/>
           <w:b w:val="0"/>
@@ -3315,7 +3315,7 @@
     </w:p>
     <w:p>
       <w:pPr>
-        <w:pStyle w:val="Verzeichnis2"/>
+        <w:pStyle w:val="TOC2"/>
         <w:tabs>
           <w:tab w:val="left" w:pos="960"/>
           <w:tab w:val="right" w:leader="dot" w:pos="9061"/>
@@ -3451,7 +3451,7 @@
     </w:p>
     <w:p>
       <w:pPr>
-        <w:pStyle w:val="berschrift1"/>
+        <w:pStyle w:val="Heading1"/>
         <w:rPr>
           <w:rFonts w:ascii="Times New Roman" w:hAnsi="Times New Roman" w:cs="Times New Roman"/>
         </w:rPr>
@@ -3544,7 +3544,7 @@
     </w:p>
     <w:p>
       <w:pPr>
-        <w:pStyle w:val="berschrift2"/>
+        <w:pStyle w:val="Heading2"/>
         <w:rPr>
           <w:rFonts w:ascii="Times New Roman" w:hAnsi="Times New Roman" w:cs="Times New Roman"/>
           <w:lang w:val="fr-CH"/>
@@ -3658,7 +3658,7 @@
     </w:p>
     <w:p>
       <w:pPr>
-        <w:pStyle w:val="Listenabsatz"/>
+        <w:pStyle w:val="ListParagraph"/>
         <w:numPr>
           <w:ilvl w:val="0"/>
           <w:numId w:val="41"/>
@@ -3710,7 +3710,7 @@
     </w:p>
     <w:p>
       <w:pPr>
-        <w:pStyle w:val="Listenabsatz"/>
+        <w:pStyle w:val="ListParagraph"/>
         <w:spacing w:before="60" w:after="40"/>
         <w:ind w:left="357"/>
         <w:rPr>
@@ -3751,7 +3751,7 @@
     </w:p>
     <w:p>
       <w:pPr>
-        <w:pStyle w:val="Listenabsatz"/>
+        <w:pStyle w:val="ListParagraph"/>
         <w:rPr>
           <w:rFonts w:ascii="Times New Roman" w:eastAsia="Times New Roman" w:hAnsi="Times New Roman"/>
           <w:sz w:val="24"/>
@@ -3771,7 +3771,7 @@
     </w:p>
     <w:p>
       <w:pPr>
-        <w:pStyle w:val="Listenabsatz"/>
+        <w:pStyle w:val="ListParagraph"/>
         <w:rPr>
           <w:rFonts w:ascii="Times New Roman" w:eastAsia="Times New Roman" w:hAnsi="Times New Roman"/>
           <w:sz w:val="24"/>
@@ -3809,7 +3809,7 @@
     </w:p>
     <w:p>
       <w:pPr>
-        <w:pStyle w:val="Listenabsatz"/>
+        <w:pStyle w:val="ListParagraph"/>
         <w:rPr>
           <w:rFonts w:ascii="Times New Roman" w:eastAsia="Times New Roman" w:hAnsi="Times New Roman"/>
           <w:sz w:val="24"/>
@@ -3829,7 +3829,7 @@
     </w:p>
     <w:p>
       <w:pPr>
-        <w:pStyle w:val="Listenabsatz"/>
+        <w:pStyle w:val="ListParagraph"/>
         <w:ind w:left="0"/>
         <w:rPr>
           <w:rFonts w:ascii="Times New Roman" w:eastAsia="Times New Roman" w:hAnsi="Times New Roman"/>
@@ -3877,7 +3877,7 @@
     </w:p>
     <w:p>
       <w:pPr>
-        <w:pStyle w:val="berschrift1"/>
+        <w:pStyle w:val="Heading1"/>
         <w:rPr>
           <w:rFonts w:ascii="Times New Roman" w:hAnsi="Times New Roman" w:cs="Times New Roman"/>
           <w:lang w:val="fr-CH"/>
@@ -3960,7 +3960,7 @@
     </w:p>
     <w:p>
       <w:pPr>
-        <w:pStyle w:val="berschrift2"/>
+        <w:pStyle w:val="Heading2"/>
         <w:rPr>
           <w:rFonts w:ascii="Times New Roman" w:hAnsi="Times New Roman" w:cs="Times New Roman"/>
           <w:lang w:val="fr-CH"/>
@@ -4058,7 +4058,7 @@
     </w:p>
     <w:p>
       <w:pPr>
-        <w:pStyle w:val="Listenabsatz"/>
+        <w:pStyle w:val="ListParagraph"/>
         <w:numPr>
           <w:ilvl w:val="0"/>
           <w:numId w:val="41"/>
@@ -4110,7 +4110,7 @@
     </w:p>
     <w:p>
       <w:pPr>
-        <w:pStyle w:val="Listenabsatz"/>
+        <w:pStyle w:val="ListParagraph"/>
         <w:ind w:left="0"/>
         <w:rPr>
           <w:rFonts w:ascii="Times New Roman" w:eastAsia="Times New Roman" w:hAnsi="Times New Roman"/>
@@ -4149,7 +4149,7 @@
     </w:p>
     <w:p>
       <w:pPr>
-        <w:pStyle w:val="Kommentartext"/>
+        <w:pStyle w:val="CommentText"/>
         <w:rPr>
           <w:rFonts w:ascii="Times New Roman" w:hAnsi="Times New Roman"/>
         </w:rPr>
@@ -4162,14 +4162,14 @@
     </w:p>
     <w:p>
       <w:pPr>
-        <w:pStyle w:val="berschrift1"/>
+        <w:pStyle w:val="Heading1"/>
         <w:rPr>
           <w:rFonts w:ascii="Times New Roman" w:hAnsi="Times New Roman" w:cs="Times New Roman"/>
           <w:lang w:val="fr-CH"/>
         </w:rPr>
       </w:pPr>
-      <w:bookmarkStart w:id="11" w:name="_Toc405904555"/>
-      <w:bookmarkStart w:id="12" w:name="_Toc228517442"/>
+      <w:bookmarkStart w:id="11" w:name="_Toc228517442"/>
+      <w:bookmarkStart w:id="12" w:name="_Toc405904555"/>
       <w:bookmarkEnd w:id="6"/>
       <w:bookmarkEnd w:id="7"/>
       <w:bookmarkEnd w:id="8"/>
@@ -4182,7 +4182,7 @@
         </w:rPr>
         <w:t>Organes dont les membres n’ont pas été nommés ou ont été nommés plus tard</w:t>
       </w:r>
-      <w:bookmarkEnd w:id="12"/>
+      <w:bookmarkEnd w:id="11"/>
     </w:p>
     <w:p>
       <w:pPr>
@@ -4211,7 +4211,7 @@
     </w:p>
     <w:p>
       <w:pPr>
-        <w:pStyle w:val="berschrift2"/>
+        <w:pStyle w:val="Heading2"/>
         <w:rPr>
           <w:rFonts w:ascii="Times New Roman" w:hAnsi="Times New Roman" w:cs="Times New Roman"/>
           <w:lang w:val="fr-CH"/>
@@ -4309,7 +4309,7 @@
     </w:p>
     <w:p>
       <w:pPr>
-        <w:pStyle w:val="Listenabsatz"/>
+        <w:pStyle w:val="ListParagraph"/>
         <w:numPr>
           <w:ilvl w:val="0"/>
           <w:numId w:val="41"/>
@@ -4361,7 +4361,7 @@
     </w:p>
     <w:p>
       <w:pPr>
-        <w:pStyle w:val="Listenabsatz"/>
+        <w:pStyle w:val="ListParagraph"/>
         <w:ind w:left="0"/>
         <w:rPr>
           <w:rFonts w:ascii="Times New Roman" w:eastAsia="Times New Roman" w:hAnsi="Times New Roman"/>
@@ -4398,7 +4398,7 @@
         <w:t>&lt;&lt;/foreach&gt;&gt;</w:t>
       </w:r>
     </w:p>
-    <w:bookmarkEnd w:id="11"/>
+    <w:bookmarkEnd w:id="12"/>
     <w:p>
       <w:pPr>
         <w:rPr>
@@ -4410,7 +4410,7 @@
     </w:p>
     <w:p>
       <w:pPr>
-        <w:pStyle w:val="berschrift1"/>
+        <w:pStyle w:val="Heading1"/>
         <w:rPr>
           <w:rFonts w:ascii="Times New Roman" w:hAnsi="Times New Roman" w:cs="Times New Roman"/>
         </w:rPr>
@@ -4471,7 +4471,7 @@
     </w:p>
     <w:p>
       <w:pPr>
-        <w:pStyle w:val="berschrift2"/>
+        <w:pStyle w:val="Heading2"/>
         <w:rPr>
           <w:rFonts w:ascii="Times New Roman" w:hAnsi="Times New Roman" w:cs="Times New Roman"/>
           <w:lang w:val="fr-CH"/>
@@ -4569,7 +4569,7 @@
     </w:p>
     <w:p>
       <w:pPr>
-        <w:pStyle w:val="Listenabsatz"/>
+        <w:pStyle w:val="ListParagraph"/>
         <w:numPr>
           <w:ilvl w:val="0"/>
           <w:numId w:val="41"/>
@@ -4621,7 +4621,7 @@
     </w:p>
     <w:p>
       <w:pPr>
-        <w:pStyle w:val="Listenabsatz"/>
+        <w:pStyle w:val="ListParagraph"/>
         <w:ind w:left="0"/>
         <w:rPr>
           <w:rFonts w:ascii="Times New Roman" w:eastAsia="Times New Roman" w:hAnsi="Times New Roman"/>
@@ -4668,7 +4668,7 @@
     </w:p>
     <w:p>
       <w:pPr>
-        <w:pStyle w:val="berschrift1"/>
+        <w:pStyle w:val="Heading1"/>
         <w:rPr>
           <w:rFonts w:ascii="Times New Roman" w:hAnsi="Times New Roman" w:cs="Times New Roman"/>
           <w:lang w:val="fr-CH"/>
@@ -4751,7 +4751,7 @@
     </w:p>
     <w:p>
       <w:pPr>
-        <w:pStyle w:val="berschrift2"/>
+        <w:pStyle w:val="Heading2"/>
         <w:rPr>
           <w:rFonts w:ascii="Times New Roman" w:hAnsi="Times New Roman" w:cs="Times New Roman"/>
           <w:lang w:val="fr-CH"/>
@@ -4849,7 +4849,7 @@
     </w:p>
     <w:p>
       <w:pPr>
-        <w:pStyle w:val="Listenabsatz"/>
+        <w:pStyle w:val="ListParagraph"/>
         <w:rPr>
           <w:rFonts w:ascii="Times New Roman" w:eastAsia="Times New Roman" w:hAnsi="Times New Roman"/>
           <w:sz w:val="24"/>
@@ -4869,7 +4869,7 @@
     </w:p>
     <w:p>
       <w:pPr>
-        <w:pStyle w:val="Listenabsatz"/>
+        <w:pStyle w:val="ListParagraph"/>
         <w:numPr>
           <w:ilvl w:val="0"/>
           <w:numId w:val="41"/>
@@ -4915,7 +4915,7 @@
     </w:p>
     <w:p>
       <w:pPr>
-        <w:pStyle w:val="Listenabsatz"/>
+        <w:pStyle w:val="ListParagraph"/>
         <w:rPr>
           <w:rFonts w:ascii="Times New Roman" w:eastAsia="Times New Roman" w:hAnsi="Times New Roman"/>
           <w:sz w:val="24"/>
@@ -4935,7 +4935,7 @@
     </w:p>
     <w:p>
       <w:pPr>
-        <w:pStyle w:val="Listenabsatz"/>
+        <w:pStyle w:val="ListParagraph"/>
         <w:rPr>
           <w:rFonts w:ascii="Times New Roman" w:eastAsia="Times New Roman" w:hAnsi="Times New Roman"/>
           <w:sz w:val="24"/>
@@ -4955,12 +4955,12 @@
     </w:p>
     <w:p>
       <w:pPr>
-        <w:pStyle w:val="Listenabsatz"/>
-        <w:rPr>
-          <w:rFonts w:ascii="Times New Roman" w:eastAsia="Times New Roman" w:hAnsi="Times New Roman"/>
-          <w:sz w:val="24"/>
-          <w:szCs w:val="24"/>
-          <w:lang w:val="en-US" w:eastAsia="de-DE"/>
+        <w:pStyle w:val="ListParagraph"/>
+        <w:rPr>
+          <w:rFonts w:ascii="Times New Roman" w:eastAsia="Times New Roman" w:hAnsi="Times New Roman"/>
+          <w:sz w:val="24"/>
+          <w:szCs w:val="24"/>
+          <w:lang w:val="fr-CH" w:eastAsia="de-DE"/>
         </w:rPr>
       </w:pPr>
       <w:r>
@@ -4970,7 +4970,7 @@
           <w:iCs/>
           <w:sz w:val="24"/>
           <w:szCs w:val="24"/>
-          <w:lang w:val="en-US" w:eastAsia="de-DE"/>
+          <w:lang w:val="fr-CH" w:eastAsia="de-DE"/>
         </w:rPr>
         <w:t>Justification</w:t>
       </w:r>
@@ -4981,7 +4981,7 @@
           <w:iCs/>
           <w:sz w:val="24"/>
           <w:szCs w:val="24"/>
-          <w:lang w:val="en-US" w:eastAsia="de-DE"/>
+          <w:lang w:val="fr-CH" w:eastAsia="de-DE"/>
         </w:rPr>
         <w:t xml:space="preserve">: </w:t>
       </w:r>
@@ -4990,7 +4990,7 @@
           <w:rFonts w:ascii="Times New Roman" w:eastAsia="Times New Roman" w:hAnsi="Times New Roman"/>
           <w:sz w:val="24"/>
           <w:szCs w:val="24"/>
-          <w:lang w:val="en-US" w:eastAsia="de-DE"/>
+          <w:lang w:val="fr-CH" w:eastAsia="de-DE"/>
         </w:rPr>
         <w:t>&lt;&lt;[member.justification]</w:t>
       </w:r>
@@ -4999,7 +4999,7 @@
           <w:rFonts w:ascii="Times New Roman" w:eastAsia="Times New Roman" w:hAnsi="Times New Roman"/>
           <w:sz w:val="24"/>
           <w:szCs w:val="24"/>
-          <w:lang w:val="en-US" w:eastAsia="de-DE"/>
+          <w:lang w:val="fr-CH" w:eastAsia="de-DE"/>
         </w:rPr>
         <w:t xml:space="preserve"> </w:t>
       </w:r>
@@ -5009,7 +5009,7 @@
           <w:bCs/>
           <w:sz w:val="24"/>
           <w:szCs w:val="24"/>
-          <w:lang w:val="en-US"/>
+          <w:lang w:val="fr-CH"/>
         </w:rPr>
         <w:t>-html</w:t>
       </w:r>
@@ -5018,14 +5018,102 @@
           <w:rFonts w:ascii="Times New Roman" w:eastAsia="Times New Roman" w:hAnsi="Times New Roman"/>
           <w:sz w:val="24"/>
           <w:szCs w:val="24"/>
-          <w:lang w:val="en-US" w:eastAsia="de-DE"/>
+          <w:lang w:val="fr-CH" w:eastAsia="de-DE"/>
         </w:rPr>
         <w:t>&gt;&gt;</w:t>
       </w:r>
-    </w:p>
-    <w:p>
-      <w:pPr>
-        <w:pStyle w:val="Listenabsatz"/>
+      <w:r>
+        <w:rPr>
+          <w:rFonts w:ascii="Times New Roman" w:hAnsi="Times New Roman"/>
+          <w:bCs/>
+          <w:sz w:val="24"/>
+          <w:szCs w:val="24"/>
+          <w:lang w:val="fr-CH"/>
+        </w:rPr>
+        <w:t>&lt;&lt;if [</w:t>
+      </w:r>
+      <w:r>
+        <w:rPr>
+          <w:rFonts w:ascii="Times New Roman" w:hAnsi="Times New Roman"/>
+          <w:bCs/>
+          <w:sz w:val="24"/>
+          <w:szCs w:val="24"/>
+          <w:lang w:val="fr-CH"/>
+        </w:rPr>
+        <w:t>member</w:t>
+      </w:r>
+      <w:r>
+        <w:rPr>
+          <w:rFonts w:ascii="Times New Roman" w:hAnsi="Times New Roman"/>
+          <w:bCs/>
+          <w:sz w:val="24"/>
+          <w:szCs w:val="24"/>
+          <w:lang w:val="fr-CH"/>
+        </w:rPr>
+        <w:t>.hasOpenJustificationChanges]&gt;&gt;</w:t>
+      </w:r>
+      <w:r>
+        <w:rPr>
+          <w:rFonts w:ascii="Times New Roman" w:hAnsi="Times New Roman"/>
+          <w:bCs/>
+          <w:color w:val="FFFFFF" w:themeColor="background1"/>
+          <w:sz w:val="24"/>
+          <w:szCs w:val="24"/>
+          <w:highlight w:val="red"/>
+          <w:lang w:val="fr-CH"/>
+        </w:rPr>
+        <w:t xml:space="preserve">Il existe des modifications en suspens pour cette justification. </w:t>
+      </w:r>
+      <w:r>
+        <w:rPr>
+          <w:rFonts w:ascii="Times New Roman" w:hAnsi="Times New Roman"/>
+          <w:bCs/>
+          <w:color w:val="FFFFFF" w:themeColor="background1"/>
+          <w:sz w:val="24"/>
+          <w:szCs w:val="24"/>
+          <w:highlight w:val="red"/>
+          <w:lang w:val="fr-CH"/>
+        </w:rPr>
+        <w:t>Cliquez &lt;&lt;link [</w:t>
+      </w:r>
+      <w:r>
+        <w:rPr>
+          <w:rFonts w:ascii="Times New Roman" w:hAnsi="Times New Roman"/>
+          <w:bCs/>
+          <w:color w:val="FFFFFF" w:themeColor="background1"/>
+          <w:sz w:val="24"/>
+          <w:szCs w:val="24"/>
+          <w:highlight w:val="red"/>
+          <w:lang w:val="fr-CH"/>
+        </w:rPr>
+        <w:t>member</w:t>
+      </w:r>
+      <w:r>
+        <w:rPr>
+          <w:rFonts w:ascii="Times New Roman" w:hAnsi="Times New Roman"/>
+          <w:bCs/>
+          <w:color w:val="FFFFFF" w:themeColor="background1"/>
+          <w:sz w:val="24"/>
+          <w:szCs w:val="24"/>
+          <w:highlight w:val="red"/>
+          <w:lang w:val="fr-CH"/>
+        </w:rPr>
+        <w:t>.justificationUrl] ["ici"]&gt;&gt; pour corriger la justification dans l’application APG.</w:t>
+      </w:r>
+      <w:r>
+        <w:rPr>
+          <w:rFonts w:ascii="Times New Roman" w:hAnsi="Times New Roman"/>
+          <w:bCs/>
+          <w:sz w:val="24"/>
+          <w:szCs w:val="24"/>
+          <w:lang w:val="fr-CH"/>
+        </w:rPr>
+        <w:t>&lt;&lt;/if&gt;&gt;</w:t>
+      </w:r>
+    </w:p>
+    <w:p>
+      <w:pPr>
+        <w:pStyle w:val="ListParagraph"/>
         <w:rPr>
           <w:rFonts w:ascii="Times New Roman" w:eastAsia="Times New Roman" w:hAnsi="Times New Roman"/>
           <w:sz w:val="24"/>
@@ -5045,7 +5133,7 @@
     </w:p>
     <w:p>
       <w:pPr>
-        <w:pStyle w:val="Listenabsatz"/>
+        <w:pStyle w:val="ListParagraph"/>
         <w:rPr>
           <w:rFonts w:ascii="Times New Roman" w:eastAsia="Times New Roman" w:hAnsi="Times New Roman"/>
           <w:sz w:val="24"/>
@@ -5065,7 +5153,7 @@
     </w:p>
     <w:p>
       <w:pPr>
-        <w:pStyle w:val="Listenabsatz"/>
+        <w:pStyle w:val="ListParagraph"/>
         <w:ind w:left="0"/>
         <w:rPr>
           <w:rFonts w:ascii="Times New Roman" w:eastAsia="Times New Roman" w:hAnsi="Times New Roman"/>
@@ -5104,7 +5192,7 @@
     </w:p>
     <w:p>
       <w:pPr>
-        <w:pStyle w:val="Listenabsatz"/>
+        <w:pStyle w:val="ListParagraph"/>
         <w:ind w:left="0"/>
         <w:rPr>
           <w:rFonts w:ascii="Times New Roman" w:eastAsia="Times New Roman" w:hAnsi="Times New Roman"/>
@@ -5116,7 +5204,7 @@
     </w:p>
     <w:p>
       <w:pPr>
-        <w:pStyle w:val="berschrift1"/>
+        <w:pStyle w:val="Heading1"/>
         <w:rPr>
           <w:rFonts w:ascii="Times New Roman" w:hAnsi="Times New Roman" w:cs="Times New Roman"/>
           <w:lang w:val="fr-CH"/>
@@ -5188,7 +5276,17 @@
           <w:szCs w:val="24"/>
           <w:lang w:val="fr-CH"/>
         </w:rPr>
-        <w:t>des commissions de suivi du marché ont droit à une indemnité forfaitaire pour leur activité de commission. Les montants indiqués à l'annexe 2, chiffre 2, OLOGA sont applicables. Les taux sont valables pour un travail à plein temps. Pour les postes à temps partiel, est défini dans la décision de nomination si elle ne découle pas des prescriptions sur l’organisation de la com­mission (art. 8</w:t>
+        <w:t xml:space="preserve">des commissions de suivi du marché ont droit à une indemnité forfaitaire pour leur activité de commission. Les montants indiqués à l'annexe 2, chiffre 2, OLOGA sont applicables. Les taux </w:t>
+      </w:r>
+      <w:r>
+        <w:rPr>
+          <w:rFonts w:ascii="Times New Roman" w:hAnsi="Times New Roman"/>
+          <w:color w:val="000000"/>
+          <w:szCs w:val="24"/>
+          <w:lang w:val="fr-CH"/>
+        </w:rPr>
+        <w:lastRenderedPageBreak/>
+        <w:t>sont valables pour un travail à plein temps. Pour les postes à temps partiel, est défini dans la décision de nomination si elle ne découle pas des prescriptions sur l’organisation de la com­mission (art. 8</w:t>
       </w:r>
       <w:r>
         <w:rPr>
@@ -5249,7 +5347,7 @@
     </w:p>
     <w:p>
       <w:pPr>
-        <w:pStyle w:val="berschrift2"/>
+        <w:pStyle w:val="Heading2"/>
         <w:rPr>
           <w:rFonts w:ascii="Times New Roman" w:hAnsi="Times New Roman" w:cs="Times New Roman"/>
           <w:lang w:val="fr-CH"/>
@@ -5347,7 +5445,7 @@
     </w:p>
     <w:p>
       <w:pPr>
-        <w:pStyle w:val="Listenabsatz"/>
+        <w:pStyle w:val="ListParagraph"/>
         <w:rPr>
           <w:rFonts w:ascii="Times New Roman" w:eastAsia="Times New Roman" w:hAnsi="Times New Roman"/>
           <w:sz w:val="24"/>
@@ -5367,7 +5465,7 @@
     </w:p>
     <w:p>
       <w:pPr>
-        <w:pStyle w:val="Listenabsatz"/>
+        <w:pStyle w:val="ListParagraph"/>
         <w:numPr>
           <w:ilvl w:val="0"/>
           <w:numId w:val="41"/>
@@ -5397,7 +5495,7 @@
     </w:p>
     <w:p>
       <w:pPr>
-        <w:pStyle w:val="Listenabsatz"/>
+        <w:pStyle w:val="ListParagraph"/>
         <w:rPr>
           <w:rFonts w:ascii="Times New Roman" w:eastAsia="Times New Roman" w:hAnsi="Times New Roman"/>
           <w:sz w:val="24"/>
@@ -5417,7 +5515,7 @@
     </w:p>
     <w:p>
       <w:pPr>
-        <w:pStyle w:val="Listenabsatz"/>
+        <w:pStyle w:val="ListParagraph"/>
         <w:rPr>
           <w:rFonts w:ascii="Times New Roman" w:eastAsia="Times New Roman" w:hAnsi="Times New Roman"/>
           <w:sz w:val="24"/>
@@ -5437,7 +5535,7 @@
     </w:p>
     <w:p>
       <w:pPr>
-        <w:pStyle w:val="Listenabsatz"/>
+        <w:pStyle w:val="ListParagraph"/>
         <w:rPr>
           <w:rFonts w:ascii="Times New Roman" w:eastAsia="Times New Roman" w:hAnsi="Times New Roman"/>
           <w:sz w:val="24"/>
@@ -5457,7 +5555,7 @@
     </w:p>
     <w:p>
       <w:pPr>
-        <w:pStyle w:val="Listenabsatz"/>
+        <w:pStyle w:val="ListParagraph"/>
         <w:rPr>
           <w:rFonts w:ascii="Times New Roman" w:eastAsia="Times New Roman" w:hAnsi="Times New Roman"/>
           <w:sz w:val="24"/>
@@ -5477,7 +5575,7 @@
     </w:p>
     <w:p>
       <w:pPr>
-        <w:pStyle w:val="Listenabsatz"/>
+        <w:pStyle w:val="ListParagraph"/>
         <w:ind w:left="0"/>
         <w:rPr>
           <w:rFonts w:ascii="Times New Roman" w:eastAsia="Times New Roman" w:hAnsi="Times New Roman"/>
@@ -5524,7 +5622,7 @@
     </w:p>
     <w:p>
       <w:pPr>
-        <w:pStyle w:val="berschrift1"/>
+        <w:pStyle w:val="Heading1"/>
         <w:rPr>
           <w:rFonts w:ascii="Times New Roman" w:hAnsi="Times New Roman" w:cs="Times New Roman"/>
           <w:lang w:val="fr-CH"/>
@@ -5585,7 +5683,7 @@
     </w:p>
     <w:p>
       <w:pPr>
-        <w:pStyle w:val="berschrift2"/>
+        <w:pStyle w:val="Heading2"/>
         <w:rPr>
           <w:rFonts w:ascii="Times New Roman" w:hAnsi="Times New Roman" w:cs="Times New Roman"/>
           <w:szCs w:val="28"/>
@@ -5758,7 +5856,7 @@
     </w:p>
     <w:p>
       <w:pPr>
-        <w:pStyle w:val="berschrift3"/>
+        <w:pStyle w:val="Heading3"/>
         <w:rPr>
           <w:rFonts w:ascii="Times New Roman" w:hAnsi="Times New Roman" w:cs="Times New Roman"/>
           <w:lang w:val="fr-CH"/>
@@ -5851,7 +5949,7 @@
     </w:p>
     <w:p>
       <w:pPr>
-        <w:pStyle w:val="Listenabsatz"/>
+        <w:pStyle w:val="ListParagraph"/>
         <w:numPr>
           <w:ilvl w:val="0"/>
           <w:numId w:val="41"/>
@@ -5909,7 +6007,7 @@
     </w:p>
     <w:p>
       <w:pPr>
-        <w:pStyle w:val="Listenabsatz"/>
+        <w:pStyle w:val="ListParagraph"/>
         <w:spacing w:before="60" w:after="40"/>
         <w:ind w:left="360"/>
         <w:rPr>
@@ -5928,7 +6026,7 @@
           <w:iCs/>
           <w:sz w:val="24"/>
           <w:szCs w:val="24"/>
-          <w:lang w:val="en-US"/>
+          <w:lang w:val="fr-CH"/>
         </w:rPr>
         <w:t>Justification</w:t>
       </w:r>
@@ -5940,7 +6038,7 @@
           <w:iCs/>
           <w:sz w:val="24"/>
           <w:szCs w:val="24"/>
-          <w:lang w:val="en-US"/>
+          <w:lang w:val="fr-CH"/>
         </w:rPr>
         <w:t xml:space="preserve">: </w:t>
       </w:r>
@@ -5950,7 +6048,7 @@
           <w:bCs/>
           <w:sz w:val="24"/>
           <w:szCs w:val="24"/>
-          <w:lang w:val="en-US"/>
+          <w:lang w:val="fr-CH"/>
         </w:rPr>
         <w:t>&lt;&lt;[committee.justification]</w:t>
       </w:r>
@@ -5960,7 +6058,7 @@
           <w:bCs/>
           <w:sz w:val="24"/>
           <w:szCs w:val="24"/>
-          <w:lang w:val="en-US"/>
+          <w:lang w:val="fr-CH"/>
         </w:rPr>
         <w:t xml:space="preserve"> -html</w:t>
       </w:r>
@@ -5970,14 +6068,58 @@
           <w:bCs/>
           <w:sz w:val="24"/>
           <w:szCs w:val="24"/>
-          <w:lang w:val="en-US"/>
+          <w:lang w:val="fr-CH"/>
         </w:rPr>
         <w:t>&gt;&gt;</w:t>
       </w:r>
-    </w:p>
-    <w:p>
-      <w:pPr>
-        <w:pStyle w:val="Listenabsatz"/>
+      <w:r>
+        <w:rPr>
+          <w:rFonts w:ascii="Times New Roman" w:hAnsi="Times New Roman"/>
+          <w:bCs/>
+          <w:sz w:val="24"/>
+          <w:szCs w:val="24"/>
+          <w:lang w:val="fr-CH"/>
+        </w:rPr>
+        <w:t>&lt;&lt;if [committee.hasOpenJustificationChanges]&gt;&gt;</w:t>
+      </w:r>
+      <w:r>
+        <w:rPr>
+          <w:rFonts w:ascii="Times New Roman" w:hAnsi="Times New Roman"/>
+          <w:bCs/>
+          <w:color w:val="FFFFFF" w:themeColor="background1"/>
+          <w:sz w:val="24"/>
+          <w:szCs w:val="24"/>
+          <w:highlight w:val="red"/>
+          <w:lang w:val="fr-CH"/>
+        </w:rPr>
+        <w:t xml:space="preserve">Il existe des modifications en suspens pour cette justification. </w:t>
+      </w:r>
+      <w:r>
+        <w:rPr>
+          <w:rFonts w:ascii="Times New Roman" w:hAnsi="Times New Roman"/>
+          <w:bCs/>
+          <w:color w:val="FFFFFF" w:themeColor="background1"/>
+          <w:sz w:val="24"/>
+          <w:szCs w:val="24"/>
+          <w:highlight w:val="red"/>
+          <w:lang w:val="en-US"/>
+        </w:rPr>
+        <w:t>Cliquez &lt;&lt;link [committee.justificationUrl] ["ici"]&gt;&gt; pour corriger la justification dans l’application APG.</w:t>
+      </w:r>
+      <w:r>
+        <w:rPr>
+          <w:rFonts w:ascii="Times New Roman" w:hAnsi="Times New Roman"/>
+          <w:bCs/>
+          <w:sz w:val="24"/>
+          <w:szCs w:val="24"/>
+          <w:lang w:val="en-US"/>
+        </w:rPr>
+        <w:t>&lt;&lt;/if&gt;&gt;</w:t>
+      </w:r>
+    </w:p>
+    <w:p>
+      <w:pPr>
+        <w:pStyle w:val="ListParagraph"/>
         <w:ind w:left="0"/>
         <w:rPr>
           <w:rFonts w:ascii="Times New Roman" w:eastAsia="Times New Roman" w:hAnsi="Times New Roman"/>
@@ -6024,7 +6166,7 @@
     </w:p>
     <w:p>
       <w:pPr>
-        <w:pStyle w:val="berschrift2"/>
+        <w:pStyle w:val="Heading2"/>
         <w:rPr>
           <w:rFonts w:ascii="Times New Roman" w:hAnsi="Times New Roman" w:cs="Times New Roman"/>
           <w:lang w:val="fr-CH"/>
@@ -6039,7 +6181,6 @@
           <w:rFonts w:ascii="Times New Roman" w:hAnsi="Times New Roman" w:cs="Times New Roman"/>
           <w:lang w:val="fr-CH"/>
         </w:rPr>
-        <w:lastRenderedPageBreak/>
         <w:t>Commissions comptant moins de 40% de femmes ou d’hommes</w:t>
       </w:r>
       <w:r>
@@ -6190,7 +6331,7 @@
     </w:p>
     <w:p>
       <w:pPr>
-        <w:pStyle w:val="berschrift3"/>
+        <w:pStyle w:val="Heading3"/>
         <w:rPr>
           <w:rFonts w:ascii="Times New Roman" w:hAnsi="Times New Roman" w:cs="Times New Roman"/>
           <w:lang w:val="fr-CH"/>
@@ -6283,7 +6424,7 @@
     </w:p>
     <w:p>
       <w:pPr>
-        <w:pStyle w:val="Listenabsatz"/>
+        <w:pStyle w:val="ListParagraph"/>
         <w:numPr>
           <w:ilvl w:val="0"/>
           <w:numId w:val="41"/>
@@ -6372,7 +6513,7 @@
     </w:p>
     <w:p>
       <w:pPr>
-        <w:pStyle w:val="Listenabsatz"/>
+        <w:pStyle w:val="ListParagraph"/>
         <w:spacing w:before="60" w:after="40"/>
         <w:ind w:left="360"/>
         <w:rPr>
@@ -6380,7 +6521,7 @@
           <w:bCs/>
           <w:sz w:val="24"/>
           <w:szCs w:val="24"/>
-          <w:lang w:val="en-US"/>
+          <w:lang w:val="fr-CH"/>
         </w:rPr>
       </w:pPr>
       <w:r>
@@ -6391,7 +6532,7 @@
           <w:iCs/>
           <w:sz w:val="24"/>
           <w:szCs w:val="24"/>
-          <w:lang w:val="en-US"/>
+          <w:lang w:val="fr-CH"/>
         </w:rPr>
         <w:t>Justification</w:t>
       </w:r>
@@ -6403,7 +6544,7 @@
           <w:iCs/>
           <w:sz w:val="24"/>
           <w:szCs w:val="24"/>
-          <w:lang w:val="en-US"/>
+          <w:lang w:val="fr-CH"/>
         </w:rPr>
         <w:t xml:space="preserve">: </w:t>
       </w:r>
@@ -6413,7 +6554,7 @@
           <w:bCs/>
           <w:sz w:val="24"/>
           <w:szCs w:val="24"/>
-          <w:lang w:val="en-US"/>
+          <w:lang w:val="fr-CH"/>
         </w:rPr>
         <w:t>&lt;&lt;[committee.justification]</w:t>
       </w:r>
@@ -6423,34 +6564,56 @@
           <w:bCs/>
           <w:sz w:val="24"/>
           <w:szCs w:val="24"/>
-          <w:lang w:val="en-US"/>
-        </w:rPr>
-        <w:t xml:space="preserve"> </w:t>
-      </w:r>
-      <w:r>
-        <w:rPr>
-          <w:rFonts w:ascii="Times New Roman" w:hAnsi="Times New Roman"/>
-          <w:bCs/>
-          <w:sz w:val="24"/>
-          <w:szCs w:val="24"/>
-          <w:lang w:val="en-US"/>
-        </w:rPr>
-        <w:t>-html</w:t>
-      </w:r>
-      <w:r>
-        <w:rPr>
-          <w:rFonts w:ascii="Times New Roman" w:hAnsi="Times New Roman"/>
-          <w:bCs/>
-          <w:sz w:val="24"/>
-          <w:szCs w:val="24"/>
-          <w:lang w:val="en-US"/>
+          <w:lang w:val="fr-CH"/>
+        </w:rPr>
+        <w:t xml:space="preserve"> -html</w:t>
+      </w:r>
+      <w:r>
+        <w:rPr>
+          <w:rFonts w:ascii="Times New Roman" w:hAnsi="Times New Roman"/>
+          <w:bCs/>
+          <w:sz w:val="24"/>
+          <w:szCs w:val="24"/>
+          <w:lang w:val="fr-CH"/>
         </w:rPr>
         <w:t>&gt;&gt;</w:t>
       </w:r>
-    </w:p>
-    <w:p>
-      <w:pPr>
-        <w:pStyle w:val="Listenabsatz"/>
+      <w:r>
+        <w:rPr>
+          <w:rFonts w:ascii="Times New Roman" w:hAnsi="Times New Roman"/>
+          <w:bCs/>
+          <w:sz w:val="24"/>
+          <w:szCs w:val="24"/>
+          <w:lang w:val="fr-CH"/>
+        </w:rPr>
+        <w:t>&lt;&lt;if [committee.hasOpenJustificationChanges]&gt;&gt;</w:t>
+      </w:r>
+      <w:r>
+        <w:rPr>
+          <w:rFonts w:ascii="Times New Roman" w:hAnsi="Times New Roman"/>
+          <w:bCs/>
+          <w:color w:val="FFFFFF" w:themeColor="background1"/>
+          <w:sz w:val="24"/>
+          <w:szCs w:val="24"/>
+          <w:highlight w:val="red"/>
+          <w:lang w:val="fr-CH"/>
+        </w:rPr>
+        <w:t>Il existe des modifications en suspens pour cette justification. Cliquez &lt;&lt;link [committee.justificationUrl] ["ici"]&gt;&gt; pour corriger la justification dans l’application APG.</w:t>
+      </w:r>
+      <w:r>
+        <w:rPr>
+          <w:rFonts w:ascii="Times New Roman" w:hAnsi="Times New Roman"/>
+          <w:bCs/>
+          <w:sz w:val="24"/>
+          <w:szCs w:val="24"/>
+          <w:lang w:val="fr-CH"/>
+        </w:rPr>
+        <w:t>&lt;&lt;/if&gt;&gt;</w:t>
+      </w:r>
+    </w:p>
+    <w:p>
+      <w:pPr>
+        <w:pStyle w:val="ListParagraph"/>
         <w:spacing w:before="60" w:after="40"/>
         <w:ind w:left="360"/>
         <w:rPr>
@@ -6458,7 +6621,7 @@
           <w:bCs/>
           <w:sz w:val="24"/>
           <w:szCs w:val="24"/>
-          <w:lang w:val="en-US"/>
+          <w:lang w:val="fr-CH"/>
         </w:rPr>
       </w:pPr>
       <w:r>
@@ -6469,7 +6632,7 @@
           <w:iCs/>
           <w:sz w:val="24"/>
           <w:szCs w:val="24"/>
-          <w:lang w:val="en-US"/>
+          <w:lang w:val="fr-CH"/>
         </w:rPr>
         <w:t>Mesure</w:t>
       </w:r>
@@ -6481,7 +6644,7 @@
           <w:iCs/>
           <w:sz w:val="24"/>
           <w:szCs w:val="24"/>
-          <w:lang w:val="en-US"/>
+          <w:lang w:val="fr-CH"/>
         </w:rPr>
         <w:t xml:space="preserve">: </w:t>
       </w:r>
@@ -6491,7 +6654,7 @@
           <w:bCs/>
           <w:sz w:val="24"/>
           <w:szCs w:val="24"/>
-          <w:lang w:val="en-US"/>
+          <w:lang w:val="fr-CH"/>
         </w:rPr>
         <w:t>&lt;&lt;[committee.measure]</w:t>
       </w:r>
@@ -6501,7 +6664,7 @@
           <w:bCs/>
           <w:sz w:val="24"/>
           <w:szCs w:val="24"/>
-          <w:lang w:val="en-US"/>
+          <w:lang w:val="fr-CH"/>
         </w:rPr>
         <w:t xml:space="preserve"> -html</w:t>
       </w:r>
@@ -6511,14 +6674,46 @@
           <w:bCs/>
           <w:sz w:val="24"/>
           <w:szCs w:val="24"/>
-          <w:lang w:val="en-US"/>
+          <w:lang w:val="fr-CH"/>
         </w:rPr>
         <w:t>&gt;&gt;</w:t>
       </w:r>
-    </w:p>
-    <w:p>
-      <w:pPr>
-        <w:pStyle w:val="Listenabsatz"/>
+      <w:r>
+        <w:rPr>
+          <w:rFonts w:ascii="Times New Roman" w:hAnsi="Times New Roman"/>
+          <w:bCs/>
+          <w:sz w:val="24"/>
+          <w:szCs w:val="24"/>
+          <w:lang w:val="fr-CH"/>
+        </w:rPr>
+        <w:t>&lt;&lt;if [committee.hasOpenMeasureChanges]&gt;&gt;</w:t>
+      </w:r>
+      <w:r>
+        <w:rPr>
+          <w:rFonts w:ascii="Times New Roman" w:hAnsi="Times New Roman"/>
+          <w:bCs/>
+          <w:color w:val="FFFFFF" w:themeColor="background1"/>
+          <w:sz w:val="24"/>
+          <w:szCs w:val="24"/>
+          <w:highlight w:val="red"/>
+          <w:lang w:val="fr-CH"/>
+        </w:rPr>
+        <w:t>Il existe des modifications en suspens pour cette mesure. Cliquez &lt;&lt;link [committee.justificationUrl] ["ici"]&gt;&gt; pour corriger la justification dans l’application APG.</w:t>
+      </w:r>
+      <w:r>
+        <w:rPr>
+          <w:rFonts w:ascii="Times New Roman" w:hAnsi="Times New Roman"/>
+          <w:bCs/>
+          <w:sz w:val="24"/>
+          <w:szCs w:val="24"/>
+          <w:lang w:val="fr-CH"/>
+        </w:rPr>
+        <w:t>&lt;&lt;/if&gt;&gt;</w:t>
+      </w:r>
+    </w:p>
+    <w:p>
+      <w:pPr>
+        <w:pStyle w:val="ListParagraph"/>
         <w:ind w:left="0"/>
         <w:rPr>
           <w:rFonts w:ascii="Times New Roman" w:eastAsia="Times New Roman" w:hAnsi="Times New Roman"/>
@@ -6557,7 +6752,7 @@
     </w:p>
     <w:p>
       <w:pPr>
-        <w:pStyle w:val="Listenabsatz"/>
+        <w:pStyle w:val="ListParagraph"/>
         <w:ind w:left="0"/>
         <w:rPr>
           <w:rFonts w:ascii="Times New Roman" w:eastAsia="Times New Roman" w:hAnsi="Times New Roman"/>
@@ -6569,7 +6764,7 @@
     </w:p>
     <w:p>
       <w:pPr>
-        <w:pStyle w:val="berschrift2"/>
+        <w:pStyle w:val="Heading2"/>
         <w:rPr>
           <w:rFonts w:ascii="Times New Roman" w:hAnsi="Times New Roman" w:cs="Times New Roman"/>
           <w:lang w:val="fr-CH"/>
@@ -6744,7 +6939,7 @@
     </w:p>
     <w:p>
       <w:pPr>
-        <w:pStyle w:val="berschrift3"/>
+        <w:pStyle w:val="Heading3"/>
         <w:rPr>
           <w:rFonts w:ascii="Times New Roman" w:hAnsi="Times New Roman" w:cs="Times New Roman"/>
           <w:lang w:val="fr-CH"/>
@@ -6837,7 +7032,7 @@
     </w:p>
     <w:p>
       <w:pPr>
-        <w:pStyle w:val="Listenabsatz"/>
+        <w:pStyle w:val="ListParagraph"/>
         <w:numPr>
           <w:ilvl w:val="0"/>
           <w:numId w:val="41"/>
@@ -6946,7 +7141,7 @@
     </w:p>
     <w:p>
       <w:pPr>
-        <w:pStyle w:val="Listenabsatz"/>
+        <w:pStyle w:val="ListParagraph"/>
         <w:spacing w:before="60" w:after="40"/>
         <w:ind w:left="360"/>
         <w:rPr>
@@ -6954,7 +7149,7 @@
           <w:bCs/>
           <w:sz w:val="24"/>
           <w:szCs w:val="24"/>
-          <w:lang w:val="en-US"/>
+          <w:lang w:val="fr-CH"/>
         </w:rPr>
       </w:pPr>
       <w:r>
@@ -6965,8 +7160,9 @@
           <w:iCs/>
           <w:sz w:val="24"/>
           <w:szCs w:val="24"/>
-          <w:lang w:val="en-US"/>
-        </w:rPr>
+          <w:lang w:val="fr-CH"/>
+        </w:rPr>
+        <w:lastRenderedPageBreak/>
         <w:t>Justification</w:t>
       </w:r>
       <w:r>
@@ -6977,7 +7173,7 @@
           <w:iCs/>
           <w:sz w:val="24"/>
           <w:szCs w:val="24"/>
-          <w:lang w:val="en-US"/>
+          <w:lang w:val="fr-CH"/>
         </w:rPr>
         <w:t xml:space="preserve">: </w:t>
       </w:r>
@@ -6987,7 +7183,7 @@
           <w:bCs/>
           <w:sz w:val="24"/>
           <w:szCs w:val="24"/>
-          <w:lang w:val="en-US"/>
+          <w:lang w:val="fr-CH"/>
         </w:rPr>
         <w:t>&lt;&lt;[committee.justification]</w:t>
       </w:r>
@@ -6997,34 +7193,56 @@
           <w:bCs/>
           <w:sz w:val="24"/>
           <w:szCs w:val="24"/>
-          <w:lang w:val="en-US"/>
-        </w:rPr>
-        <w:t xml:space="preserve"> </w:t>
-      </w:r>
-      <w:r>
-        <w:rPr>
-          <w:rFonts w:ascii="Times New Roman" w:hAnsi="Times New Roman"/>
-          <w:bCs/>
-          <w:sz w:val="24"/>
-          <w:szCs w:val="24"/>
-          <w:lang w:val="en-US"/>
-        </w:rPr>
-        <w:t>-html</w:t>
-      </w:r>
-      <w:r>
-        <w:rPr>
-          <w:rFonts w:ascii="Times New Roman" w:hAnsi="Times New Roman"/>
-          <w:bCs/>
-          <w:sz w:val="24"/>
-          <w:szCs w:val="24"/>
-          <w:lang w:val="en-US"/>
+          <w:lang w:val="fr-CH"/>
+        </w:rPr>
+        <w:t xml:space="preserve"> -html</w:t>
+      </w:r>
+      <w:r>
+        <w:rPr>
+          <w:rFonts w:ascii="Times New Roman" w:hAnsi="Times New Roman"/>
+          <w:bCs/>
+          <w:sz w:val="24"/>
+          <w:szCs w:val="24"/>
+          <w:lang w:val="fr-CH"/>
         </w:rPr>
         <w:t>&gt;&gt;</w:t>
       </w:r>
-    </w:p>
-    <w:p>
-      <w:pPr>
-        <w:pStyle w:val="Listenabsatz"/>
+      <w:r>
+        <w:rPr>
+          <w:rFonts w:ascii="Times New Roman" w:hAnsi="Times New Roman"/>
+          <w:bCs/>
+          <w:sz w:val="24"/>
+          <w:szCs w:val="24"/>
+          <w:lang w:val="fr-CH"/>
+        </w:rPr>
+        <w:t>&lt;&lt;if [committee.hasOpenJustificationChanges]&gt;&gt;</w:t>
+      </w:r>
+      <w:r>
+        <w:rPr>
+          <w:rFonts w:ascii="Times New Roman" w:hAnsi="Times New Roman"/>
+          <w:bCs/>
+          <w:color w:val="FFFFFF" w:themeColor="background1"/>
+          <w:sz w:val="24"/>
+          <w:szCs w:val="24"/>
+          <w:highlight w:val="red"/>
+          <w:lang w:val="fr-CH"/>
+        </w:rPr>
+        <w:t>Il existe des modifications en suspens pour cette justification. Cliquez &lt;&lt;link [committee.justificationUrl] ["ici"]&gt;&gt; pour corriger la justification dans l’application APG.</w:t>
+      </w:r>
+      <w:r>
+        <w:rPr>
+          <w:rFonts w:ascii="Times New Roman" w:hAnsi="Times New Roman"/>
+          <w:bCs/>
+          <w:sz w:val="24"/>
+          <w:szCs w:val="24"/>
+          <w:lang w:val="fr-CH"/>
+        </w:rPr>
+        <w:t>&lt;&lt;/if&gt;&gt;</w:t>
+      </w:r>
+    </w:p>
+    <w:p>
+      <w:pPr>
+        <w:pStyle w:val="ListParagraph"/>
         <w:spacing w:before="60" w:after="40"/>
         <w:ind w:left="360"/>
         <w:rPr>
@@ -7032,7 +7250,7 @@
           <w:bCs/>
           <w:sz w:val="24"/>
           <w:szCs w:val="24"/>
-          <w:lang w:val="en-US"/>
+          <w:lang w:val="fr-CH"/>
         </w:rPr>
       </w:pPr>
       <w:r>
@@ -7043,7 +7261,7 @@
           <w:iCs/>
           <w:sz w:val="24"/>
           <w:szCs w:val="24"/>
-          <w:lang w:val="en-US"/>
+          <w:lang w:val="fr-CH"/>
         </w:rPr>
         <w:t>Mesure</w:t>
       </w:r>
@@ -7055,7 +7273,7 @@
           <w:iCs/>
           <w:sz w:val="24"/>
           <w:szCs w:val="24"/>
-          <w:lang w:val="en-US"/>
+          <w:lang w:val="fr-CH"/>
         </w:rPr>
         <w:t xml:space="preserve">: </w:t>
       </w:r>
@@ -7065,7 +7283,7 @@
           <w:bCs/>
           <w:sz w:val="24"/>
           <w:szCs w:val="24"/>
-          <w:lang w:val="en-US"/>
+          <w:lang w:val="fr-CH"/>
         </w:rPr>
         <w:t>&lt;&lt;[committee.measure]</w:t>
       </w:r>
@@ -7075,7 +7293,7 @@
           <w:bCs/>
           <w:sz w:val="24"/>
           <w:szCs w:val="24"/>
-          <w:lang w:val="en-US"/>
+          <w:lang w:val="fr-CH"/>
         </w:rPr>
         <w:t xml:space="preserve"> -html</w:t>
       </w:r>
@@ -7085,14 +7303,46 @@
           <w:bCs/>
           <w:sz w:val="24"/>
           <w:szCs w:val="24"/>
-          <w:lang w:val="en-US"/>
+          <w:lang w:val="fr-CH"/>
         </w:rPr>
         <w:t>&gt;&gt;</w:t>
       </w:r>
-    </w:p>
-    <w:p>
-      <w:pPr>
-        <w:pStyle w:val="Listenabsatz"/>
+      <w:r>
+        <w:rPr>
+          <w:rFonts w:ascii="Times New Roman" w:hAnsi="Times New Roman"/>
+          <w:bCs/>
+          <w:sz w:val="24"/>
+          <w:szCs w:val="24"/>
+          <w:lang w:val="fr-CH"/>
+        </w:rPr>
+        <w:t>&lt;&lt;if [committee.hasOpenMeasureChanges]&gt;&gt;</w:t>
+      </w:r>
+      <w:r>
+        <w:rPr>
+          <w:rFonts w:ascii="Times New Roman" w:hAnsi="Times New Roman"/>
+          <w:bCs/>
+          <w:color w:val="FFFFFF" w:themeColor="background1"/>
+          <w:sz w:val="24"/>
+          <w:szCs w:val="24"/>
+          <w:highlight w:val="red"/>
+          <w:lang w:val="fr-CH"/>
+        </w:rPr>
+        <w:t>Il existe des modifications en suspens pour cette mesure. Cliquez &lt;&lt;link [committee.justificationUrl] ["ici"]&gt;&gt; pour corriger la justification dans l’application APG.</w:t>
+      </w:r>
+      <w:r>
+        <w:rPr>
+          <w:rFonts w:ascii="Times New Roman" w:hAnsi="Times New Roman"/>
+          <w:bCs/>
+          <w:sz w:val="24"/>
+          <w:szCs w:val="24"/>
+          <w:lang w:val="fr-CH"/>
+        </w:rPr>
+        <w:t>&lt;&lt;/if&gt;&gt;</w:t>
+      </w:r>
+    </w:p>
+    <w:p>
+      <w:pPr>
+        <w:pStyle w:val="ListParagraph"/>
         <w:ind w:left="0"/>
         <w:rPr>
           <w:rFonts w:ascii="Times New Roman" w:eastAsia="Times New Roman" w:hAnsi="Times New Roman"/>
@@ -7139,7 +7389,7 @@
     </w:p>
     <w:p>
       <w:pPr>
-        <w:pStyle w:val="berschrift2"/>
+        <w:pStyle w:val="Heading2"/>
         <w:rPr>
           <w:rFonts w:ascii="Times New Roman" w:hAnsi="Times New Roman" w:cs="Times New Roman"/>
           <w:lang w:val="fr-CH"/>
@@ -7154,7 +7404,6 @@
           <w:rFonts w:ascii="Times New Roman" w:hAnsi="Times New Roman" w:cs="Times New Roman"/>
           <w:lang w:val="fr-CH"/>
         </w:rPr>
-        <w:lastRenderedPageBreak/>
         <w:tab/>
       </w:r>
       <w:bookmarkStart w:id="55" w:name="_Toc109324981"/>
@@ -7248,7 +7497,7 @@
     </w:p>
     <w:p>
       <w:pPr>
-        <w:pStyle w:val="berschrift3"/>
+        <w:pStyle w:val="Heading3"/>
         <w:rPr>
           <w:rFonts w:ascii="Times New Roman" w:hAnsi="Times New Roman" w:cs="Times New Roman"/>
           <w:lang w:val="fr-CH"/>
@@ -7341,7 +7590,7 @@
     </w:p>
     <w:p>
       <w:pPr>
-        <w:pStyle w:val="Listenabsatz"/>
+        <w:pStyle w:val="ListParagraph"/>
         <w:rPr>
           <w:rFonts w:ascii="Times New Roman" w:eastAsia="Times New Roman" w:hAnsi="Times New Roman"/>
           <w:sz w:val="24"/>
@@ -7361,7 +7610,7 @@
     </w:p>
     <w:p>
       <w:pPr>
-        <w:pStyle w:val="Listenabsatz"/>
+        <w:pStyle w:val="ListParagraph"/>
         <w:numPr>
           <w:ilvl w:val="0"/>
           <w:numId w:val="41"/>
@@ -7391,7 +7640,7 @@
     </w:p>
     <w:p>
       <w:pPr>
-        <w:pStyle w:val="Listenabsatz"/>
+        <w:pStyle w:val="ListParagraph"/>
         <w:rPr>
           <w:rFonts w:ascii="Times New Roman" w:eastAsia="Times New Roman" w:hAnsi="Times New Roman"/>
           <w:sz w:val="24"/>
@@ -7411,7 +7660,7 @@
     </w:p>
     <w:p>
       <w:pPr>
-        <w:pStyle w:val="Listenabsatz"/>
+        <w:pStyle w:val="ListParagraph"/>
         <w:rPr>
           <w:rFonts w:ascii="Times New Roman" w:eastAsia="Times New Roman" w:hAnsi="Times New Roman"/>
           <w:sz w:val="24"/>
@@ -7442,13 +7691,13 @@
     </w:p>
     <w:p>
       <w:pPr>
-        <w:pStyle w:val="Listenabsatz"/>
-        <w:rPr>
-          <w:rFonts w:ascii="Times New Roman" w:hAnsi="Times New Roman"/>
-          <w:bCs/>
-          <w:sz w:val="24"/>
-          <w:szCs w:val="24"/>
-          <w:lang w:val="en-US"/>
+        <w:pStyle w:val="ListParagraph"/>
+        <w:rPr>
+          <w:rFonts w:ascii="Times New Roman" w:hAnsi="Times New Roman"/>
+          <w:bCs/>
+          <w:sz w:val="24"/>
+          <w:szCs w:val="24"/>
+          <w:lang w:val="fr-CH"/>
         </w:rPr>
       </w:pPr>
       <w:r>
@@ -7459,7 +7708,7 @@
           <w:iCs/>
           <w:sz w:val="24"/>
           <w:szCs w:val="24"/>
-          <w:lang w:val="en-US"/>
+          <w:lang w:val="fr-CH"/>
         </w:rPr>
         <w:t>Justification</w:t>
       </w:r>
@@ -7471,7 +7720,7 @@
           <w:iCs/>
           <w:sz w:val="24"/>
           <w:szCs w:val="24"/>
-          <w:lang w:val="en-US"/>
+          <w:lang w:val="fr-CH"/>
         </w:rPr>
         <w:t>:</w:t>
       </w:r>
@@ -7481,7 +7730,7 @@
           <w:b/>
           <w:sz w:val="24"/>
           <w:szCs w:val="24"/>
-          <w:lang w:val="en-US"/>
+          <w:lang w:val="fr-CH"/>
         </w:rPr>
         <w:t xml:space="preserve"> </w:t>
       </w:r>
@@ -7491,7 +7740,7 @@
           <w:bCs/>
           <w:sz w:val="24"/>
           <w:szCs w:val="24"/>
-          <w:lang w:val="en-US"/>
+          <w:lang w:val="fr-CH"/>
         </w:rPr>
         <w:t>&lt;&lt;[member.justification]</w:t>
       </w:r>
@@ -7501,7 +7750,7 @@
           <w:bCs/>
           <w:sz w:val="24"/>
           <w:szCs w:val="24"/>
-          <w:lang w:val="en-US"/>
+          <w:lang w:val="fr-CH"/>
         </w:rPr>
         <w:t xml:space="preserve"> -html</w:t>
       </w:r>
@@ -7511,14 +7760,102 @@
           <w:bCs/>
           <w:sz w:val="24"/>
           <w:szCs w:val="24"/>
-          <w:lang w:val="en-US"/>
+          <w:lang w:val="fr-CH"/>
         </w:rPr>
         <w:t>&gt;&gt;</w:t>
       </w:r>
-    </w:p>
-    <w:p>
-      <w:pPr>
-        <w:pStyle w:val="Listenabsatz"/>
+      <w:r>
+        <w:rPr>
+          <w:rFonts w:ascii="Times New Roman" w:hAnsi="Times New Roman"/>
+          <w:bCs/>
+          <w:sz w:val="24"/>
+          <w:szCs w:val="24"/>
+          <w:lang w:val="fr-CH"/>
+        </w:rPr>
+        <w:t>&lt;&lt;if [</w:t>
+      </w:r>
+      <w:r>
+        <w:rPr>
+          <w:rFonts w:ascii="Times New Roman" w:hAnsi="Times New Roman"/>
+          <w:bCs/>
+          <w:sz w:val="24"/>
+          <w:szCs w:val="24"/>
+          <w:lang w:val="fr-CH"/>
+        </w:rPr>
+        <w:t>member</w:t>
+      </w:r>
+      <w:r>
+        <w:rPr>
+          <w:rFonts w:ascii="Times New Roman" w:hAnsi="Times New Roman"/>
+          <w:bCs/>
+          <w:sz w:val="24"/>
+          <w:szCs w:val="24"/>
+          <w:lang w:val="fr-CH"/>
+        </w:rPr>
+        <w:t>.hasOpenJustificationChanges]&gt;&gt;</w:t>
+      </w:r>
+      <w:r>
+        <w:rPr>
+          <w:rFonts w:ascii="Times New Roman" w:hAnsi="Times New Roman"/>
+          <w:bCs/>
+          <w:color w:val="FFFFFF" w:themeColor="background1"/>
+          <w:sz w:val="24"/>
+          <w:szCs w:val="24"/>
+          <w:highlight w:val="red"/>
+          <w:lang w:val="fr-CH"/>
+        </w:rPr>
+        <w:t xml:space="preserve">Il existe des modifications en suspens pour cette justification. </w:t>
+      </w:r>
+      <w:r>
+        <w:rPr>
+          <w:rFonts w:ascii="Times New Roman" w:hAnsi="Times New Roman"/>
+          <w:bCs/>
+          <w:color w:val="FFFFFF" w:themeColor="background1"/>
+          <w:sz w:val="24"/>
+          <w:szCs w:val="24"/>
+          <w:highlight w:val="red"/>
+          <w:lang w:val="fr-CH"/>
+        </w:rPr>
+        <w:t>Cliquez &lt;&lt;link [</w:t>
+      </w:r>
+      <w:r>
+        <w:rPr>
+          <w:rFonts w:ascii="Times New Roman" w:hAnsi="Times New Roman"/>
+          <w:bCs/>
+          <w:color w:val="FFFFFF" w:themeColor="background1"/>
+          <w:sz w:val="24"/>
+          <w:szCs w:val="24"/>
+          <w:highlight w:val="red"/>
+          <w:lang w:val="fr-CH"/>
+        </w:rPr>
+        <w:t>member</w:t>
+      </w:r>
+      <w:r>
+        <w:rPr>
+          <w:rFonts w:ascii="Times New Roman" w:hAnsi="Times New Roman"/>
+          <w:bCs/>
+          <w:color w:val="FFFFFF" w:themeColor="background1"/>
+          <w:sz w:val="24"/>
+          <w:szCs w:val="24"/>
+          <w:highlight w:val="red"/>
+          <w:lang w:val="fr-CH"/>
+        </w:rPr>
+        <w:t>.justificationUrl] ["ici"]&gt;&gt; pour corriger la justification dans l’application APG.</w:t>
+      </w:r>
+      <w:r>
+        <w:rPr>
+          <w:rFonts w:ascii="Times New Roman" w:hAnsi="Times New Roman"/>
+          <w:bCs/>
+          <w:sz w:val="24"/>
+          <w:szCs w:val="24"/>
+          <w:lang w:val="fr-CH"/>
+        </w:rPr>
+        <w:t>&lt;&lt;/if&gt;&gt;</w:t>
+      </w:r>
+    </w:p>
+    <w:p>
+      <w:pPr>
+        <w:pStyle w:val="ListParagraph"/>
         <w:rPr>
           <w:rFonts w:ascii="Times New Roman" w:eastAsia="Times New Roman" w:hAnsi="Times New Roman"/>
           <w:sz w:val="24"/>
@@ -7538,7 +7875,7 @@
     </w:p>
     <w:p>
       <w:pPr>
-        <w:pStyle w:val="Listenabsatz"/>
+        <w:pStyle w:val="ListParagraph"/>
         <w:rPr>
           <w:rFonts w:ascii="Times New Roman" w:eastAsia="Times New Roman" w:hAnsi="Times New Roman"/>
           <w:sz w:val="24"/>
@@ -7558,7 +7895,7 @@
     </w:p>
     <w:p>
       <w:pPr>
-        <w:pStyle w:val="Listenabsatz"/>
+        <w:pStyle w:val="ListParagraph"/>
         <w:ind w:left="0"/>
         <w:rPr>
           <w:rFonts w:ascii="Times New Roman" w:eastAsia="Times New Roman" w:hAnsi="Times New Roman"/>
@@ -7612,7 +7949,7 @@
     </w:p>
     <w:p>
       <w:pPr>
-        <w:pStyle w:val="berschrift2"/>
+        <w:pStyle w:val="Heading2"/>
         <w:rPr>
           <w:rFonts w:ascii="Times New Roman" w:hAnsi="Times New Roman" w:cs="Times New Roman"/>
           <w:lang w:val="fr-CH"/>
@@ -7660,7 +7997,15 @@
           <w:rFonts w:ascii="Times New Roman" w:hAnsi="Times New Roman"/>
           <w:lang w:val="fr-CH"/>
         </w:rPr>
-        <w:t>Selon l'art. 14, let. c, de la loi du 13 décembre 2002 sur le Parlement (RS 171.10), les membres des commissions extraparlementaires ayant des compétences décisionnelles (commissions décisionnelles) ne peuvent pas faire partie de l'Assemblée fédérale. En outre, selon les directives de la Chancellerie fédérale, les membres de l'Assemblée fédérale ne peuvent être nommés qu'exceptionnellement dans des commissions ayant une fonction consultative et préparatoire (commissions consultatives). Les commissions consultatives dans lesquelles un membre de l'Assemblée fédérale devrait être exceptionnellement nommé sont énumérées ci-dessous.</w:t>
+        <w:t xml:space="preserve">Selon l'art. 14, let. c, de la loi du 13 décembre 2002 sur le Parlement (RS 171.10), les membres des commissions extraparlementaires ayant des compétences décisionnelles (commissions décisionnelles) ne peuvent pas faire partie de l'Assemblée fédérale. En outre, selon les directives de la Chancellerie fédérale, les membres de l'Assemblée fédérale ne peuvent être nommés qu'exceptionnellement dans des commissions ayant une fonction consultative et préparatoire </w:t>
+      </w:r>
+      <w:r>
+        <w:rPr>
+          <w:rFonts w:ascii="Times New Roman" w:hAnsi="Times New Roman"/>
+          <w:lang w:val="fr-CH"/>
+        </w:rPr>
+        <w:lastRenderedPageBreak/>
+        <w:t>(commissions consultatives). Les commissions consultatives dans lesquelles un membre de l'Assemblée fédérale devrait être exceptionnellement nommé sont énumérées ci-dessous.</w:t>
       </w:r>
     </w:p>
     <w:p>
@@ -7690,7 +8035,7 @@
     </w:p>
     <w:p>
       <w:pPr>
-        <w:pStyle w:val="berschrift3"/>
+        <w:pStyle w:val="Heading3"/>
         <w:rPr>
           <w:rFonts w:ascii="Times New Roman" w:hAnsi="Times New Roman" w:cs="Times New Roman"/>
           <w:lang w:val="fr-CH"/>
@@ -7783,7 +8128,7 @@
     </w:p>
     <w:p>
       <w:pPr>
-        <w:pStyle w:val="Listenabsatz"/>
+        <w:pStyle w:val="ListParagraph"/>
         <w:rPr>
           <w:rFonts w:ascii="Times New Roman" w:eastAsia="Times New Roman" w:hAnsi="Times New Roman"/>
           <w:sz w:val="24"/>
@@ -7803,7 +8148,7 @@
     </w:p>
     <w:p>
       <w:pPr>
-        <w:pStyle w:val="Listenabsatz"/>
+        <w:pStyle w:val="ListParagraph"/>
         <w:numPr>
           <w:ilvl w:val="0"/>
           <w:numId w:val="41"/>
@@ -7833,7 +8178,7 @@
     </w:p>
     <w:p>
       <w:pPr>
-        <w:pStyle w:val="Listenabsatz"/>
+        <w:pStyle w:val="ListParagraph"/>
         <w:rPr>
           <w:rFonts w:ascii="Times New Roman" w:eastAsia="Times New Roman" w:hAnsi="Times New Roman"/>
           <w:sz w:val="24"/>
@@ -7853,7 +8198,7 @@
     </w:p>
     <w:p>
       <w:pPr>
-        <w:pStyle w:val="Listenabsatz"/>
+        <w:pStyle w:val="ListParagraph"/>
         <w:rPr>
           <w:rFonts w:ascii="Times New Roman" w:eastAsia="Times New Roman" w:hAnsi="Times New Roman"/>
           <w:sz w:val="24"/>
@@ -7884,13 +8229,13 @@
     </w:p>
     <w:p>
       <w:pPr>
-        <w:pStyle w:val="Listenabsatz"/>
-        <w:rPr>
-          <w:rFonts w:ascii="Times New Roman" w:hAnsi="Times New Roman"/>
-          <w:bCs/>
-          <w:sz w:val="24"/>
-          <w:szCs w:val="24"/>
-          <w:lang w:val="en-US"/>
+        <w:pStyle w:val="ListParagraph"/>
+        <w:rPr>
+          <w:rFonts w:ascii="Times New Roman" w:hAnsi="Times New Roman"/>
+          <w:bCs/>
+          <w:sz w:val="24"/>
+          <w:szCs w:val="24"/>
+          <w:lang w:val="fr-CH"/>
         </w:rPr>
       </w:pPr>
       <w:r>
@@ -7901,7 +8246,7 @@
           <w:iCs/>
           <w:sz w:val="24"/>
           <w:szCs w:val="24"/>
-          <w:lang w:val="en-US"/>
+          <w:lang w:val="fr-CH"/>
         </w:rPr>
         <w:t>Justification</w:t>
       </w:r>
@@ -7913,7 +8258,7 @@
           <w:iCs/>
           <w:sz w:val="24"/>
           <w:szCs w:val="24"/>
-          <w:lang w:val="en-US"/>
+          <w:lang w:val="fr-CH"/>
         </w:rPr>
         <w:t xml:space="preserve">: </w:t>
       </w:r>
@@ -7923,7 +8268,7 @@
           <w:bCs/>
           <w:sz w:val="24"/>
           <w:szCs w:val="24"/>
-          <w:lang w:val="en-US"/>
+          <w:lang w:val="fr-CH"/>
         </w:rPr>
         <w:t>&lt;&lt;[member.justification]</w:t>
       </w:r>
@@ -7933,34 +8278,112 @@
           <w:bCs/>
           <w:sz w:val="24"/>
           <w:szCs w:val="24"/>
-          <w:lang w:val="en-US"/>
-        </w:rPr>
-        <w:t xml:space="preserve"> </w:t>
-      </w:r>
-      <w:r>
-        <w:rPr>
-          <w:rFonts w:ascii="Times New Roman" w:hAnsi="Times New Roman"/>
-          <w:bCs/>
-          <w:sz w:val="24"/>
-          <w:szCs w:val="24"/>
-          <w:lang w:val="en-US"/>
-        </w:rPr>
-        <w:t>-html</w:t>
-      </w:r>
-      <w:r>
-        <w:rPr>
-          <w:rFonts w:ascii="Times New Roman" w:hAnsi="Times New Roman"/>
-          <w:bCs/>
-          <w:sz w:val="24"/>
-          <w:szCs w:val="24"/>
-          <w:lang w:val="en-US"/>
+          <w:lang w:val="fr-CH"/>
+        </w:rPr>
+        <w:t xml:space="preserve"> -html</w:t>
+      </w:r>
+      <w:r>
+        <w:rPr>
+          <w:rFonts w:ascii="Times New Roman" w:hAnsi="Times New Roman"/>
+          <w:bCs/>
+          <w:sz w:val="24"/>
+          <w:szCs w:val="24"/>
+          <w:lang w:val="fr-CH"/>
         </w:rPr>
         <w:t>&gt;&gt;</w:t>
       </w:r>
-    </w:p>
-    <w:p>
-      <w:pPr>
-        <w:pStyle w:val="Listenabsatz"/>
+      <w:r>
+        <w:rPr>
+          <w:rFonts w:ascii="Times New Roman" w:hAnsi="Times New Roman"/>
+          <w:bCs/>
+          <w:sz w:val="24"/>
+          <w:szCs w:val="24"/>
+          <w:lang w:val="fr-CH"/>
+        </w:rPr>
+        <w:t>&lt;&lt;if [</w:t>
+      </w:r>
+      <w:r>
+        <w:rPr>
+          <w:rFonts w:ascii="Times New Roman" w:hAnsi="Times New Roman"/>
+          <w:bCs/>
+          <w:sz w:val="24"/>
+          <w:szCs w:val="24"/>
+          <w:lang w:val="fr-CH"/>
+        </w:rPr>
+        <w:t>member</w:t>
+      </w:r>
+      <w:r>
+        <w:rPr>
+          <w:rFonts w:ascii="Times New Roman" w:hAnsi="Times New Roman"/>
+          <w:bCs/>
+          <w:sz w:val="24"/>
+          <w:szCs w:val="24"/>
+          <w:lang w:val="fr-CH"/>
+        </w:rPr>
+        <w:t>.hasOpenJustificationChanges]&gt;&gt;</w:t>
+      </w:r>
+      <w:r>
+        <w:rPr>
+          <w:rFonts w:ascii="Times New Roman" w:hAnsi="Times New Roman"/>
+          <w:bCs/>
+          <w:color w:val="FFFFFF" w:themeColor="background1"/>
+          <w:sz w:val="24"/>
+          <w:szCs w:val="24"/>
+          <w:highlight w:val="red"/>
+          <w:lang w:val="fr-CH"/>
+        </w:rPr>
+        <w:t xml:space="preserve">Il existe des modifications en suspens pour cette justification. </w:t>
+      </w:r>
+      <w:r>
+        <w:rPr>
+          <w:rFonts w:ascii="Times New Roman" w:hAnsi="Times New Roman"/>
+          <w:bCs/>
+          <w:color w:val="FFFFFF" w:themeColor="background1"/>
+          <w:sz w:val="24"/>
+          <w:szCs w:val="24"/>
+          <w:highlight w:val="red"/>
+          <w:lang w:val="fr-CH"/>
+        </w:rPr>
+        <w:t>Cliquez &lt;&lt;link [</w:t>
+      </w:r>
+      <w:r>
+        <w:rPr>
+          <w:rFonts w:ascii="Times New Roman" w:hAnsi="Times New Roman"/>
+          <w:bCs/>
+          <w:color w:val="FFFFFF" w:themeColor="background1"/>
+          <w:sz w:val="24"/>
+          <w:szCs w:val="24"/>
+          <w:highlight w:val="red"/>
+          <w:lang w:val="fr-CH"/>
+        </w:rPr>
+        <w:t>member</w:t>
+      </w:r>
+      <w:r>
+        <w:rPr>
+          <w:rFonts w:ascii="Times New Roman" w:hAnsi="Times New Roman"/>
+          <w:bCs/>
+          <w:color w:val="FFFFFF" w:themeColor="background1"/>
+          <w:sz w:val="24"/>
+          <w:szCs w:val="24"/>
+          <w:highlight w:val="red"/>
+          <w:lang w:val="fr-CH"/>
+        </w:rPr>
+        <w:t>.justificationUrl] ["ici"]&gt;&gt; pour corriger la justification dans l’application APG.</w:t>
+      </w:r>
+      <w:r>
+        <w:rPr>
+          <w:rFonts w:ascii="Times New Roman" w:hAnsi="Times New Roman"/>
+          <w:bCs/>
+          <w:sz w:val="24"/>
+          <w:szCs w:val="24"/>
+          <w:lang w:val="fr-CH"/>
+        </w:rPr>
+        <w:t>&lt;&lt;/if&gt;&gt;</w:t>
+      </w:r>
+    </w:p>
+    <w:p>
+      <w:pPr>
+        <w:pStyle w:val="ListParagraph"/>
         <w:rPr>
           <w:rFonts w:ascii="Times New Roman" w:eastAsia="Times New Roman" w:hAnsi="Times New Roman"/>
           <w:sz w:val="24"/>
@@ -7980,7 +8403,7 @@
     </w:p>
     <w:p>
       <w:pPr>
-        <w:pStyle w:val="Listenabsatz"/>
+        <w:pStyle w:val="ListParagraph"/>
         <w:rPr>
           <w:rFonts w:ascii="Times New Roman" w:eastAsia="Times New Roman" w:hAnsi="Times New Roman"/>
           <w:sz w:val="24"/>
@@ -8000,7 +8423,7 @@
     </w:p>
     <w:p>
       <w:pPr>
-        <w:pStyle w:val="Listenabsatz"/>
+        <w:pStyle w:val="ListParagraph"/>
         <w:ind w:left="0"/>
         <w:rPr>
           <w:rFonts w:ascii="Times New Roman" w:eastAsia="Times New Roman" w:hAnsi="Times New Roman"/>
@@ -8017,7 +8440,6 @@
           <w:szCs w:val="24"/>
           <w:lang w:val="en-US" w:eastAsia="de-DE"/>
         </w:rPr>
-        <w:lastRenderedPageBreak/>
         <w:t>&lt;&lt;/foreach&gt;&gt;</w:t>
       </w:r>
     </w:p>
@@ -8048,7 +8470,7 @@
     </w:p>
     <w:p>
       <w:pPr>
-        <w:pStyle w:val="berschrift2"/>
+        <w:pStyle w:val="Heading2"/>
         <w:rPr>
           <w:rFonts w:ascii="Times New Roman" w:hAnsi="Times New Roman" w:cs="Times New Roman"/>
           <w:lang w:val="fr-CH"/>
@@ -8141,7 +8563,7 @@
     </w:p>
     <w:p>
       <w:pPr>
-        <w:pStyle w:val="berschrift3"/>
+        <w:pStyle w:val="Heading3"/>
         <w:rPr>
           <w:rFonts w:ascii="Times New Roman" w:hAnsi="Times New Roman" w:cs="Times New Roman"/>
           <w:lang w:val="fr-CH"/>
@@ -8234,7 +8656,7 @@
     </w:p>
     <w:p>
       <w:pPr>
-        <w:pStyle w:val="Listenabsatz"/>
+        <w:pStyle w:val="ListParagraph"/>
         <w:rPr>
           <w:rFonts w:ascii="Times New Roman" w:eastAsia="Times New Roman" w:hAnsi="Times New Roman"/>
           <w:sz w:val="24"/>
@@ -8254,7 +8676,7 @@
     </w:p>
     <w:p>
       <w:pPr>
-        <w:pStyle w:val="Listenabsatz"/>
+        <w:pStyle w:val="ListParagraph"/>
         <w:numPr>
           <w:ilvl w:val="0"/>
           <w:numId w:val="41"/>
@@ -8284,7 +8706,7 @@
     </w:p>
     <w:p>
       <w:pPr>
-        <w:pStyle w:val="Listenabsatz"/>
+        <w:pStyle w:val="ListParagraph"/>
         <w:rPr>
           <w:rFonts w:ascii="Times New Roman" w:eastAsia="Times New Roman" w:hAnsi="Times New Roman"/>
           <w:sz w:val="24"/>
@@ -8304,7 +8726,7 @@
     </w:p>
     <w:p>
       <w:pPr>
-        <w:pStyle w:val="Listenabsatz"/>
+        <w:pStyle w:val="ListParagraph"/>
         <w:rPr>
           <w:rFonts w:ascii="Times New Roman" w:eastAsia="Times New Roman" w:hAnsi="Times New Roman"/>
           <w:sz w:val="24"/>
@@ -8335,13 +8757,13 @@
     </w:p>
     <w:p>
       <w:pPr>
-        <w:pStyle w:val="Listenabsatz"/>
-        <w:rPr>
-          <w:rFonts w:ascii="Times New Roman" w:hAnsi="Times New Roman"/>
-          <w:bCs/>
-          <w:sz w:val="24"/>
-          <w:szCs w:val="24"/>
-          <w:lang w:val="en-US"/>
+        <w:pStyle w:val="ListParagraph"/>
+        <w:rPr>
+          <w:rFonts w:ascii="Times New Roman" w:hAnsi="Times New Roman"/>
+          <w:bCs/>
+          <w:sz w:val="24"/>
+          <w:szCs w:val="24"/>
+          <w:lang w:val="fr-CH"/>
         </w:rPr>
       </w:pPr>
       <w:r>
@@ -8352,7 +8774,7 @@
           <w:iCs/>
           <w:sz w:val="24"/>
           <w:szCs w:val="24"/>
-          <w:lang w:val="en-US"/>
+          <w:lang w:val="fr-CH"/>
         </w:rPr>
         <w:t>Justification</w:t>
       </w:r>
@@ -8364,7 +8786,7 @@
           <w:iCs/>
           <w:sz w:val="24"/>
           <w:szCs w:val="24"/>
-          <w:lang w:val="en-US"/>
+          <w:lang w:val="fr-CH"/>
         </w:rPr>
         <w:t xml:space="preserve">: </w:t>
       </w:r>
@@ -8374,7 +8796,7 @@
           <w:bCs/>
           <w:sz w:val="24"/>
           <w:szCs w:val="24"/>
-          <w:lang w:val="en-US"/>
+          <w:lang w:val="fr-CH"/>
         </w:rPr>
         <w:t>&lt;&lt;[member.justification]</w:t>
       </w:r>
@@ -8384,34 +8806,112 @@
           <w:bCs/>
           <w:sz w:val="24"/>
           <w:szCs w:val="24"/>
-          <w:lang w:val="en-US"/>
-        </w:rPr>
-        <w:t xml:space="preserve"> </w:t>
-      </w:r>
-      <w:r>
-        <w:rPr>
-          <w:rFonts w:ascii="Times New Roman" w:hAnsi="Times New Roman"/>
-          <w:bCs/>
-          <w:sz w:val="24"/>
-          <w:szCs w:val="24"/>
-          <w:lang w:val="en-US"/>
-        </w:rPr>
-        <w:t>-html</w:t>
-      </w:r>
-      <w:r>
-        <w:rPr>
-          <w:rFonts w:ascii="Times New Roman" w:hAnsi="Times New Roman"/>
-          <w:bCs/>
-          <w:sz w:val="24"/>
-          <w:szCs w:val="24"/>
-          <w:lang w:val="en-US"/>
+          <w:lang w:val="fr-CH"/>
+        </w:rPr>
+        <w:t xml:space="preserve"> -html</w:t>
+      </w:r>
+      <w:r>
+        <w:rPr>
+          <w:rFonts w:ascii="Times New Roman" w:hAnsi="Times New Roman"/>
+          <w:bCs/>
+          <w:sz w:val="24"/>
+          <w:szCs w:val="24"/>
+          <w:lang w:val="fr-CH"/>
         </w:rPr>
         <w:t>&gt;&gt;</w:t>
       </w:r>
-    </w:p>
-    <w:p>
-      <w:pPr>
-        <w:pStyle w:val="Listenabsatz"/>
+      <w:r>
+        <w:rPr>
+          <w:rFonts w:ascii="Times New Roman" w:hAnsi="Times New Roman"/>
+          <w:bCs/>
+          <w:sz w:val="24"/>
+          <w:szCs w:val="24"/>
+          <w:lang w:val="fr-CH"/>
+        </w:rPr>
+        <w:t>&lt;&lt;if [</w:t>
+      </w:r>
+      <w:r>
+        <w:rPr>
+          <w:rFonts w:ascii="Times New Roman" w:hAnsi="Times New Roman"/>
+          <w:bCs/>
+          <w:sz w:val="24"/>
+          <w:szCs w:val="24"/>
+          <w:lang w:val="fr-CH"/>
+        </w:rPr>
+        <w:t>member</w:t>
+      </w:r>
+      <w:r>
+        <w:rPr>
+          <w:rFonts w:ascii="Times New Roman" w:hAnsi="Times New Roman"/>
+          <w:bCs/>
+          <w:sz w:val="24"/>
+          <w:szCs w:val="24"/>
+          <w:lang w:val="fr-CH"/>
+        </w:rPr>
+        <w:t>.hasOpenJustificationChanges]&gt;&gt;</w:t>
+      </w:r>
+      <w:r>
+        <w:rPr>
+          <w:rFonts w:ascii="Times New Roman" w:hAnsi="Times New Roman"/>
+          <w:bCs/>
+          <w:color w:val="FFFFFF" w:themeColor="background1"/>
+          <w:sz w:val="24"/>
+          <w:szCs w:val="24"/>
+          <w:highlight w:val="red"/>
+          <w:lang w:val="fr-CH"/>
+        </w:rPr>
+        <w:t xml:space="preserve">Il existe des modifications en suspens pour cette justification. </w:t>
+      </w:r>
+      <w:r>
+        <w:rPr>
+          <w:rFonts w:ascii="Times New Roman" w:hAnsi="Times New Roman"/>
+          <w:bCs/>
+          <w:color w:val="FFFFFF" w:themeColor="background1"/>
+          <w:sz w:val="24"/>
+          <w:szCs w:val="24"/>
+          <w:highlight w:val="red"/>
+          <w:lang w:val="fr-CH"/>
+        </w:rPr>
+        <w:t>Cliquez &lt;&lt;link [</w:t>
+      </w:r>
+      <w:r>
+        <w:rPr>
+          <w:rFonts w:ascii="Times New Roman" w:hAnsi="Times New Roman"/>
+          <w:bCs/>
+          <w:color w:val="FFFFFF" w:themeColor="background1"/>
+          <w:sz w:val="24"/>
+          <w:szCs w:val="24"/>
+          <w:highlight w:val="red"/>
+          <w:lang w:val="fr-CH"/>
+        </w:rPr>
+        <w:t>member</w:t>
+      </w:r>
+      <w:r>
+        <w:rPr>
+          <w:rFonts w:ascii="Times New Roman" w:hAnsi="Times New Roman"/>
+          <w:bCs/>
+          <w:color w:val="FFFFFF" w:themeColor="background1"/>
+          <w:sz w:val="24"/>
+          <w:szCs w:val="24"/>
+          <w:highlight w:val="red"/>
+          <w:lang w:val="fr-CH"/>
+        </w:rPr>
+        <w:t>.justificationUrl] ["ici"]&gt;&gt; pour corriger la justification dans l’application APG.</w:t>
+      </w:r>
+      <w:r>
+        <w:rPr>
+          <w:rFonts w:ascii="Times New Roman" w:hAnsi="Times New Roman"/>
+          <w:bCs/>
+          <w:sz w:val="24"/>
+          <w:szCs w:val="24"/>
+          <w:lang w:val="fr-CH"/>
+        </w:rPr>
+        <w:t>&lt;&lt;/if&gt;&gt;</w:t>
+      </w:r>
+    </w:p>
+    <w:p>
+      <w:pPr>
+        <w:pStyle w:val="ListParagraph"/>
         <w:rPr>
           <w:rFonts w:ascii="Times New Roman" w:eastAsia="Times New Roman" w:hAnsi="Times New Roman"/>
           <w:sz w:val="24"/>
@@ -8431,7 +8931,7 @@
     </w:p>
     <w:p>
       <w:pPr>
-        <w:pStyle w:val="Listenabsatz"/>
+        <w:pStyle w:val="ListParagraph"/>
         <w:rPr>
           <w:rFonts w:ascii="Times New Roman" w:eastAsia="Times New Roman" w:hAnsi="Times New Roman"/>
           <w:sz w:val="24"/>
@@ -8451,7 +8951,7 @@
     </w:p>
     <w:p>
       <w:pPr>
-        <w:pStyle w:val="Listenabsatz"/>
+        <w:pStyle w:val="ListParagraph"/>
         <w:ind w:left="0"/>
         <w:rPr>
           <w:rFonts w:ascii="Times New Roman" w:eastAsia="Times New Roman" w:hAnsi="Times New Roman"/>
@@ -8497,7 +8997,7 @@
     </w:p>
     <w:p>
       <w:pPr>
-        <w:pStyle w:val="berschrift1"/>
+        <w:pStyle w:val="Heading1"/>
         <w:rPr>
           <w:rFonts w:ascii="Times New Roman" w:hAnsi="Times New Roman" w:cs="Times New Roman"/>
           <w:lang w:val="fr-CH"/>
@@ -8511,6 +9011,7 @@
           <w:rFonts w:ascii="Times New Roman" w:hAnsi="Times New Roman" w:cs="Times New Roman"/>
           <w:lang w:val="fr-CH"/>
         </w:rPr>
+        <w:lastRenderedPageBreak/>
         <w:t>Organes de direction et représentants de la Confédération</w:t>
       </w:r>
       <w:bookmarkEnd w:id="70"/>
@@ -8537,7 +9038,7 @@
     </w:p>
     <w:p>
       <w:pPr>
-        <w:pStyle w:val="berschrift2"/>
+        <w:pStyle w:val="Heading2"/>
         <w:rPr>
           <w:rFonts w:ascii="Times New Roman" w:hAnsi="Times New Roman" w:cs="Times New Roman"/>
           <w:lang w:val="fr-CH"/>
@@ -8591,7 +9092,7 @@
     </w:p>
     <w:p>
       <w:pPr>
-        <w:pStyle w:val="berschrift3"/>
+        <w:pStyle w:val="Heading3"/>
         <w:rPr>
           <w:rFonts w:ascii="Times New Roman" w:hAnsi="Times New Roman" w:cs="Times New Roman"/>
           <w:lang w:val="fr-CH"/>
@@ -8684,7 +9185,7 @@
     </w:p>
     <w:p>
       <w:pPr>
-        <w:pStyle w:val="Listenabsatz"/>
+        <w:pStyle w:val="ListParagraph"/>
         <w:numPr>
           <w:ilvl w:val="0"/>
           <w:numId w:val="41"/>
@@ -8812,7 +9313,7 @@
     </w:p>
     <w:p>
       <w:pPr>
-        <w:pStyle w:val="Listenabsatz"/>
+        <w:pStyle w:val="ListParagraph"/>
         <w:spacing w:before="60" w:after="40"/>
         <w:ind w:left="360"/>
         <w:rPr>
@@ -8820,7 +9321,7 @@
           <w:bCs/>
           <w:sz w:val="24"/>
           <w:szCs w:val="24"/>
-          <w:lang w:val="en-US"/>
+          <w:lang w:val="fr-CH"/>
         </w:rPr>
       </w:pPr>
       <w:r>
@@ -8831,7 +9332,7 @@
           <w:iCs/>
           <w:sz w:val="24"/>
           <w:szCs w:val="24"/>
-          <w:lang w:val="en-US"/>
+          <w:lang w:val="fr-CH"/>
         </w:rPr>
         <w:t>Justification</w:t>
       </w:r>
@@ -8843,7 +9344,7 @@
           <w:iCs/>
           <w:sz w:val="24"/>
           <w:szCs w:val="24"/>
-          <w:lang w:val="en-US"/>
+          <w:lang w:val="fr-CH"/>
         </w:rPr>
         <w:t xml:space="preserve">: </w:t>
       </w:r>
@@ -8853,7 +9354,7 @@
           <w:bCs/>
           <w:sz w:val="24"/>
           <w:szCs w:val="24"/>
-          <w:lang w:val="en-US"/>
+          <w:lang w:val="fr-CH"/>
         </w:rPr>
         <w:t>&lt;&lt;[committee.justification]</w:t>
       </w:r>
@@ -8863,34 +9364,56 @@
           <w:bCs/>
           <w:sz w:val="24"/>
           <w:szCs w:val="24"/>
-          <w:lang w:val="en-US"/>
-        </w:rPr>
-        <w:t xml:space="preserve"> </w:t>
-      </w:r>
-      <w:r>
-        <w:rPr>
-          <w:rFonts w:ascii="Times New Roman" w:hAnsi="Times New Roman"/>
-          <w:bCs/>
-          <w:sz w:val="24"/>
-          <w:szCs w:val="24"/>
-          <w:lang w:val="en-US"/>
-        </w:rPr>
-        <w:t>-html</w:t>
-      </w:r>
-      <w:r>
-        <w:rPr>
-          <w:rFonts w:ascii="Times New Roman" w:hAnsi="Times New Roman"/>
-          <w:bCs/>
-          <w:sz w:val="24"/>
-          <w:szCs w:val="24"/>
-          <w:lang w:val="en-US"/>
+          <w:lang w:val="fr-CH"/>
+        </w:rPr>
+        <w:t xml:space="preserve"> -html</w:t>
+      </w:r>
+      <w:r>
+        <w:rPr>
+          <w:rFonts w:ascii="Times New Roman" w:hAnsi="Times New Roman"/>
+          <w:bCs/>
+          <w:sz w:val="24"/>
+          <w:szCs w:val="24"/>
+          <w:lang w:val="fr-CH"/>
         </w:rPr>
         <w:t>&gt;&gt;</w:t>
       </w:r>
-    </w:p>
-    <w:p>
-      <w:pPr>
-        <w:pStyle w:val="Listenabsatz"/>
+      <w:r>
+        <w:rPr>
+          <w:rFonts w:ascii="Times New Roman" w:hAnsi="Times New Roman"/>
+          <w:bCs/>
+          <w:sz w:val="24"/>
+          <w:szCs w:val="24"/>
+          <w:lang w:val="fr-CH"/>
+        </w:rPr>
+        <w:t>&lt;&lt;if [committee.hasOpenJustificationChanges]&gt;&gt;</w:t>
+      </w:r>
+      <w:r>
+        <w:rPr>
+          <w:rFonts w:ascii="Times New Roman" w:hAnsi="Times New Roman"/>
+          <w:bCs/>
+          <w:color w:val="FFFFFF" w:themeColor="background1"/>
+          <w:sz w:val="24"/>
+          <w:szCs w:val="24"/>
+          <w:highlight w:val="red"/>
+          <w:lang w:val="fr-CH"/>
+        </w:rPr>
+        <w:t>Il existe des modifications en suspens pour cette justification. Cliquez &lt;&lt;link [committee.justificationUrl] ["ici"]&gt;&gt; pour corriger la justification dans l’application APG.</w:t>
+      </w:r>
+      <w:r>
+        <w:rPr>
+          <w:rFonts w:ascii="Times New Roman" w:hAnsi="Times New Roman"/>
+          <w:bCs/>
+          <w:sz w:val="24"/>
+          <w:szCs w:val="24"/>
+          <w:lang w:val="fr-CH"/>
+        </w:rPr>
+        <w:t>&lt;&lt;/if&gt;&gt;</w:t>
+      </w:r>
+    </w:p>
+    <w:p>
+      <w:pPr>
+        <w:pStyle w:val="ListParagraph"/>
         <w:spacing w:before="60" w:after="40"/>
         <w:ind w:left="360"/>
         <w:rPr>
@@ -8898,7 +9421,7 @@
           <w:bCs/>
           <w:sz w:val="24"/>
           <w:szCs w:val="24"/>
-          <w:lang w:val="en-US"/>
+          <w:lang w:val="fr-CH"/>
         </w:rPr>
       </w:pPr>
       <w:r>
@@ -8909,7 +9432,7 @@
           <w:iCs/>
           <w:sz w:val="24"/>
           <w:szCs w:val="24"/>
-          <w:lang w:val="en-US"/>
+          <w:lang w:val="fr-CH"/>
         </w:rPr>
         <w:t>Mesure</w:t>
       </w:r>
@@ -8921,7 +9444,7 @@
           <w:iCs/>
           <w:sz w:val="24"/>
           <w:szCs w:val="24"/>
-          <w:lang w:val="en-US"/>
+          <w:lang w:val="fr-CH"/>
         </w:rPr>
         <w:t xml:space="preserve">: </w:t>
       </w:r>
@@ -8931,7 +9454,7 @@
           <w:bCs/>
           <w:sz w:val="24"/>
           <w:szCs w:val="24"/>
-          <w:lang w:val="en-US"/>
+          <w:lang w:val="fr-CH"/>
         </w:rPr>
         <w:t>&lt;&lt;[committee.measure]</w:t>
       </w:r>
@@ -8941,7 +9464,7 @@
           <w:bCs/>
           <w:sz w:val="24"/>
           <w:szCs w:val="24"/>
-          <w:lang w:val="en-US"/>
+          <w:lang w:val="fr-CH"/>
         </w:rPr>
         <w:t xml:space="preserve"> -html</w:t>
       </w:r>
@@ -8951,14 +9474,70 @@
           <w:bCs/>
           <w:sz w:val="24"/>
           <w:szCs w:val="24"/>
-          <w:lang w:val="en-US"/>
+          <w:lang w:val="fr-CH"/>
         </w:rPr>
         <w:t>&gt;&gt;</w:t>
       </w:r>
-    </w:p>
-    <w:p>
-      <w:pPr>
-        <w:pStyle w:val="Listenabsatz"/>
+      <w:r>
+        <w:rPr>
+          <w:rFonts w:ascii="Times New Roman" w:hAnsi="Times New Roman"/>
+          <w:bCs/>
+          <w:sz w:val="24"/>
+          <w:szCs w:val="24"/>
+          <w:lang w:val="fr-CH"/>
+        </w:rPr>
+        <w:t>&lt;&lt;if [committee.hasOpenMeasureChanges]&gt;&gt;</w:t>
+      </w:r>
+      <w:r>
+        <w:rPr>
+          <w:rFonts w:ascii="Times New Roman" w:hAnsi="Times New Roman"/>
+          <w:bCs/>
+          <w:color w:val="FFFFFF" w:themeColor="background1"/>
+          <w:sz w:val="24"/>
+          <w:szCs w:val="24"/>
+          <w:highlight w:val="red"/>
+          <w:lang w:val="fr-CH"/>
+        </w:rPr>
+        <w:t xml:space="preserve">Il existe des modifications en suspens pour cette </w:t>
+      </w:r>
+      <w:r>
+        <w:rPr>
+          <w:rFonts w:ascii="Times New Roman" w:hAnsi="Times New Roman"/>
+          <w:bCs/>
+          <w:color w:val="FFFFFF" w:themeColor="background1"/>
+          <w:sz w:val="24"/>
+          <w:szCs w:val="24"/>
+          <w:highlight w:val="red"/>
+          <w:lang w:val="fr-CH"/>
+        </w:rPr>
+        <w:t>mesure</w:t>
+      </w:r>
+      <w:r>
+        <w:rPr>
+          <w:rFonts w:ascii="Times New Roman" w:hAnsi="Times New Roman"/>
+          <w:bCs/>
+          <w:color w:val="FFFFFF" w:themeColor="background1"/>
+          <w:sz w:val="24"/>
+          <w:szCs w:val="24"/>
+          <w:highlight w:val="red"/>
+          <w:lang w:val="fr-CH"/>
+        </w:rPr>
+        <w:t>. Cliquez &lt;&lt;link [committee.justificationUrl] ["ici"]&gt;&gt; pour corriger la justification dans l’application APG.</w:t>
+      </w:r>
+      <w:r>
+        <w:rPr>
+          <w:rFonts w:ascii="Times New Roman" w:hAnsi="Times New Roman"/>
+          <w:bCs/>
+          <w:sz w:val="24"/>
+          <w:szCs w:val="24"/>
+          <w:lang w:val="fr-CH"/>
+        </w:rPr>
+        <w:t>&lt;&lt;/if&gt;&gt;</w:t>
+      </w:r>
+    </w:p>
+    <w:p>
+      <w:pPr>
+        <w:pStyle w:val="ListParagraph"/>
         <w:numPr>
           <w:ilvl w:val="0"/>
           <w:numId w:val="41"/>
@@ -9008,7 +9587,7 @@
     </w:p>
     <w:p>
       <w:pPr>
-        <w:pStyle w:val="berschrift2"/>
+        <w:pStyle w:val="Heading2"/>
         <w:rPr>
           <w:rFonts w:ascii="Times New Roman" w:hAnsi="Times New Roman" w:cs="Times New Roman"/>
           <w:lang w:val="fr-CH"/>
@@ -9055,7 +9634,6 @@
           <w:szCs w:val="24"/>
           <w:lang w:val="en-US"/>
         </w:rPr>
-        <w:lastRenderedPageBreak/>
         <w:t>&lt;&lt;foreach [department in appendixReport.missingLanguageMembers</w:t>
       </w:r>
       <w:r>
@@ -9077,7 +9655,7 @@
     </w:p>
     <w:p>
       <w:pPr>
-        <w:pStyle w:val="berschrift3"/>
+        <w:pStyle w:val="Heading3"/>
         <w:rPr>
           <w:rFonts w:ascii="Times New Roman" w:hAnsi="Times New Roman" w:cs="Times New Roman"/>
           <w:lang w:val="fr-CH"/>
@@ -9181,7 +9759,7 @@
     </w:p>
     <w:p>
       <w:pPr>
-        <w:pStyle w:val="Listenabsatz"/>
+        <w:pStyle w:val="ListParagraph"/>
         <w:numPr>
           <w:ilvl w:val="0"/>
           <w:numId w:val="41"/>
@@ -9269,7 +9847,7 @@
     </w:p>
     <w:p>
       <w:pPr>
-        <w:pStyle w:val="Listenabsatz"/>
+        <w:pStyle w:val="ListParagraph"/>
         <w:spacing w:before="60" w:after="40"/>
         <w:ind w:left="360"/>
         <w:rPr>
@@ -9491,7 +10069,7 @@
     </w:p>
     <w:p>
       <w:pPr>
-        <w:pStyle w:val="Listenabsatz"/>
+        <w:pStyle w:val="ListParagraph"/>
         <w:spacing w:before="60" w:after="40"/>
         <w:ind w:left="360"/>
         <w:rPr>
@@ -9499,7 +10077,7 @@
           <w:bCs/>
           <w:sz w:val="24"/>
           <w:szCs w:val="24"/>
-          <w:lang w:val="en-US"/>
+          <w:lang w:val="fr-CH"/>
         </w:rPr>
       </w:pPr>
       <w:r>
@@ -9510,7 +10088,7 @@
           <w:iCs/>
           <w:sz w:val="24"/>
           <w:szCs w:val="24"/>
-          <w:lang w:val="en-US"/>
+          <w:lang w:val="fr-CH"/>
         </w:rPr>
         <w:t>Justification</w:t>
       </w:r>
@@ -9522,7 +10100,7 @@
           <w:iCs/>
           <w:sz w:val="24"/>
           <w:szCs w:val="24"/>
-          <w:lang w:val="en-US"/>
+          <w:lang w:val="fr-CH"/>
         </w:rPr>
         <w:t xml:space="preserve">: </w:t>
       </w:r>
@@ -9532,7 +10110,7 @@
           <w:bCs/>
           <w:sz w:val="24"/>
           <w:szCs w:val="24"/>
-          <w:lang w:val="en-US"/>
+          <w:lang w:val="fr-CH"/>
         </w:rPr>
         <w:t>&lt;&lt;[committee.justification]</w:t>
       </w:r>
@@ -9542,7 +10120,7 @@
           <w:bCs/>
           <w:sz w:val="24"/>
           <w:szCs w:val="24"/>
-          <w:lang w:val="en-US"/>
+          <w:lang w:val="fr-CH"/>
         </w:rPr>
         <w:t xml:space="preserve"> -html</w:t>
       </w:r>
@@ -9552,14 +10130,46 @@
           <w:bCs/>
           <w:sz w:val="24"/>
           <w:szCs w:val="24"/>
-          <w:lang w:val="en-US"/>
+          <w:lang w:val="fr-CH"/>
         </w:rPr>
         <w:t>&gt;&gt;</w:t>
       </w:r>
-    </w:p>
-    <w:p>
-      <w:pPr>
-        <w:pStyle w:val="Listenabsatz"/>
+      <w:r>
+        <w:rPr>
+          <w:rFonts w:ascii="Times New Roman" w:hAnsi="Times New Roman"/>
+          <w:bCs/>
+          <w:sz w:val="24"/>
+          <w:szCs w:val="24"/>
+          <w:lang w:val="fr-CH"/>
+        </w:rPr>
+        <w:t>&lt;&lt;if [committee.hasOpenJustificationChanges]&gt;&gt;</w:t>
+      </w:r>
+      <w:r>
+        <w:rPr>
+          <w:rFonts w:ascii="Times New Roman" w:hAnsi="Times New Roman"/>
+          <w:bCs/>
+          <w:color w:val="FFFFFF" w:themeColor="background1"/>
+          <w:sz w:val="24"/>
+          <w:szCs w:val="24"/>
+          <w:highlight w:val="red"/>
+          <w:lang w:val="fr-CH"/>
+        </w:rPr>
+        <w:t>Il existe des modifications en suspens pour cette justification. Cliquez &lt;&lt;link [committee.justificationUrl] ["ici"]&gt;&gt; pour corriger la justification dans l’application APG.</w:t>
+      </w:r>
+      <w:r>
+        <w:rPr>
+          <w:rFonts w:ascii="Times New Roman" w:hAnsi="Times New Roman"/>
+          <w:bCs/>
+          <w:sz w:val="24"/>
+          <w:szCs w:val="24"/>
+          <w:lang w:val="fr-CH"/>
+        </w:rPr>
+        <w:t>&lt;&lt;/if&gt;&gt;</w:t>
+      </w:r>
+    </w:p>
+    <w:p>
+      <w:pPr>
+        <w:pStyle w:val="ListParagraph"/>
         <w:spacing w:before="60" w:after="40"/>
         <w:ind w:left="360"/>
         <w:rPr>
@@ -9567,7 +10177,7 @@
           <w:bCs/>
           <w:sz w:val="24"/>
           <w:szCs w:val="24"/>
-          <w:lang w:val="en-US"/>
+          <w:lang w:val="fr-CH"/>
         </w:rPr>
       </w:pPr>
       <w:r>
@@ -9578,7 +10188,7 @@
           <w:iCs/>
           <w:sz w:val="24"/>
           <w:szCs w:val="24"/>
-          <w:lang w:val="en-US"/>
+          <w:lang w:val="fr-CH"/>
         </w:rPr>
         <w:t>Mesure</w:t>
       </w:r>
@@ -9590,7 +10200,7 @@
           <w:iCs/>
           <w:sz w:val="24"/>
           <w:szCs w:val="24"/>
-          <w:lang w:val="en-US"/>
+          <w:lang w:val="fr-CH"/>
         </w:rPr>
         <w:t xml:space="preserve">: </w:t>
       </w:r>
@@ -9600,7 +10210,7 @@
           <w:bCs/>
           <w:sz w:val="24"/>
           <w:szCs w:val="24"/>
-          <w:lang w:val="en-US"/>
+          <w:lang w:val="fr-CH"/>
         </w:rPr>
         <w:t>&lt;&lt;[committee.measure]</w:t>
       </w:r>
@@ -9610,7 +10220,7 @@
           <w:bCs/>
           <w:sz w:val="24"/>
           <w:szCs w:val="24"/>
-          <w:lang w:val="en-US"/>
+          <w:lang w:val="fr-CH"/>
         </w:rPr>
         <w:t xml:space="preserve"> -html</w:t>
       </w:r>
@@ -9620,14 +10230,46 @@
           <w:bCs/>
           <w:sz w:val="24"/>
           <w:szCs w:val="24"/>
-          <w:lang w:val="en-US"/>
+          <w:lang w:val="fr-CH"/>
         </w:rPr>
         <w:t>&gt;&gt;</w:t>
       </w:r>
-    </w:p>
-    <w:p>
-      <w:pPr>
-        <w:pStyle w:val="Listenabsatz"/>
+      <w:r>
+        <w:rPr>
+          <w:rFonts w:ascii="Times New Roman" w:hAnsi="Times New Roman"/>
+          <w:bCs/>
+          <w:sz w:val="24"/>
+          <w:szCs w:val="24"/>
+          <w:lang w:val="fr-CH"/>
+        </w:rPr>
+        <w:t>&lt;&lt;if [committee.hasOpenMeasureChanges]&gt;&gt;</w:t>
+      </w:r>
+      <w:r>
+        <w:rPr>
+          <w:rFonts w:ascii="Times New Roman" w:hAnsi="Times New Roman"/>
+          <w:bCs/>
+          <w:color w:val="FFFFFF" w:themeColor="background1"/>
+          <w:sz w:val="24"/>
+          <w:szCs w:val="24"/>
+          <w:highlight w:val="red"/>
+          <w:lang w:val="fr-CH"/>
+        </w:rPr>
+        <w:t>Il existe des modifications en suspens pour cette mesure. Cliquez &lt;&lt;link [committee.justificationUrl] ["ici"]&gt;&gt; pour corriger la justification dans l’application APG.</w:t>
+      </w:r>
+      <w:r>
+        <w:rPr>
+          <w:rFonts w:ascii="Times New Roman" w:hAnsi="Times New Roman"/>
+          <w:bCs/>
+          <w:sz w:val="24"/>
+          <w:szCs w:val="24"/>
+          <w:lang w:val="fr-CH"/>
+        </w:rPr>
+        <w:t>&lt;&lt;/if&gt;&gt;</w:t>
+      </w:r>
+    </w:p>
+    <w:p>
+      <w:pPr>
+        <w:pStyle w:val="ListParagraph"/>
         <w:ind w:left="0"/>
         <w:rPr>
           <w:rFonts w:ascii="Times New Roman" w:eastAsia="Times New Roman" w:hAnsi="Times New Roman"/>
@@ -9674,7 +10316,7 @@
     </w:p>
     <w:p>
       <w:pPr>
-        <w:pStyle w:val="berschrift2"/>
+        <w:pStyle w:val="Heading2"/>
         <w:rPr>
           <w:rFonts w:ascii="Times New Roman" w:hAnsi="Times New Roman" w:cs="Times New Roman"/>
           <w:lang w:val="fr-CH"/>
@@ -9764,7 +10406,7 @@
     </w:p>
     <w:p>
       <w:pPr>
-        <w:pStyle w:val="berschrift3"/>
+        <w:pStyle w:val="Heading3"/>
         <w:rPr>
           <w:rFonts w:ascii="Times New Roman" w:hAnsi="Times New Roman" w:cs="Times New Roman"/>
           <w:lang w:val="fr-CH"/>
@@ -9857,7 +10499,7 @@
     </w:p>
     <w:p>
       <w:pPr>
-        <w:pStyle w:val="Listenabsatz"/>
+        <w:pStyle w:val="ListParagraph"/>
         <w:numPr>
           <w:ilvl w:val="0"/>
           <w:numId w:val="41"/>
@@ -9985,7 +10627,7 @@
     </w:p>
     <w:p>
       <w:pPr>
-        <w:pStyle w:val="Listenabsatz"/>
+        <w:pStyle w:val="ListParagraph"/>
         <w:spacing w:before="60" w:after="40"/>
         <w:ind w:left="360"/>
         <w:rPr>
@@ -9993,7 +10635,7 @@
           <w:bCs/>
           <w:sz w:val="24"/>
           <w:szCs w:val="24"/>
-          <w:lang w:val="en-US"/>
+          <w:lang w:val="fr-CH"/>
         </w:rPr>
       </w:pPr>
       <w:r>
@@ -10004,7 +10646,7 @@
           <w:iCs/>
           <w:sz w:val="24"/>
           <w:szCs w:val="24"/>
-          <w:lang w:val="en-US"/>
+          <w:lang w:val="fr-CH"/>
         </w:rPr>
         <w:t>Justification</w:t>
       </w:r>
@@ -10016,7 +10658,7 @@
           <w:iCs/>
           <w:sz w:val="24"/>
           <w:szCs w:val="24"/>
-          <w:lang w:val="en-US"/>
+          <w:lang w:val="fr-CH"/>
         </w:rPr>
         <w:t xml:space="preserve">: </w:t>
       </w:r>
@@ -10026,7 +10668,7 @@
           <w:bCs/>
           <w:sz w:val="24"/>
           <w:szCs w:val="24"/>
-          <w:lang w:val="en-US"/>
+          <w:lang w:val="fr-CH"/>
         </w:rPr>
         <w:t>&lt;&lt;[committee.justification]</w:t>
       </w:r>
@@ -10036,7 +10678,7 @@
           <w:bCs/>
           <w:sz w:val="24"/>
           <w:szCs w:val="24"/>
-          <w:lang w:val="en-US"/>
+          <w:lang w:val="fr-CH"/>
         </w:rPr>
         <w:t xml:space="preserve"> -html</w:t>
       </w:r>
@@ -10046,14 +10688,46 @@
           <w:bCs/>
           <w:sz w:val="24"/>
           <w:szCs w:val="24"/>
-          <w:lang w:val="en-US"/>
+          <w:lang w:val="fr-CH"/>
         </w:rPr>
         <w:t>&gt;&gt;</w:t>
       </w:r>
-    </w:p>
-    <w:p>
-      <w:pPr>
-        <w:pStyle w:val="Listenabsatz"/>
+      <w:r>
+        <w:rPr>
+          <w:rFonts w:ascii="Times New Roman" w:hAnsi="Times New Roman"/>
+          <w:bCs/>
+          <w:sz w:val="24"/>
+          <w:szCs w:val="24"/>
+          <w:lang w:val="fr-CH"/>
+        </w:rPr>
+        <w:t>&lt;&lt;if [committee.hasOpenJustificationChanges]&gt;&gt;</w:t>
+      </w:r>
+      <w:r>
+        <w:rPr>
+          <w:rFonts w:ascii="Times New Roman" w:hAnsi="Times New Roman"/>
+          <w:bCs/>
+          <w:color w:val="FFFFFF" w:themeColor="background1"/>
+          <w:sz w:val="24"/>
+          <w:szCs w:val="24"/>
+          <w:highlight w:val="red"/>
+          <w:lang w:val="fr-CH"/>
+        </w:rPr>
+        <w:t>Il existe des modifications en suspens pour cette justification. Cliquez &lt;&lt;link [committee.justificationUrl] ["ici"]&gt;&gt; pour corriger la justification dans l’application APG.</w:t>
+      </w:r>
+      <w:r>
+        <w:rPr>
+          <w:rFonts w:ascii="Times New Roman" w:hAnsi="Times New Roman"/>
+          <w:bCs/>
+          <w:sz w:val="24"/>
+          <w:szCs w:val="24"/>
+          <w:lang w:val="fr-CH"/>
+        </w:rPr>
+        <w:t>&lt;&lt;/if&gt;&gt;</w:t>
+      </w:r>
+    </w:p>
+    <w:p>
+      <w:pPr>
+        <w:pStyle w:val="ListParagraph"/>
         <w:spacing w:before="60" w:after="40"/>
         <w:ind w:left="360"/>
         <w:rPr>
@@ -10061,7 +10735,7 @@
           <w:bCs/>
           <w:sz w:val="24"/>
           <w:szCs w:val="24"/>
-          <w:lang w:val="en-US"/>
+          <w:lang w:val="fr-CH"/>
         </w:rPr>
       </w:pPr>
       <w:r>
@@ -10072,7 +10746,7 @@
           <w:iCs/>
           <w:sz w:val="24"/>
           <w:szCs w:val="24"/>
-          <w:lang w:val="en-US"/>
+          <w:lang w:val="fr-CH"/>
         </w:rPr>
         <w:t>Mesure</w:t>
       </w:r>
@@ -10084,7 +10758,7 @@
           <w:iCs/>
           <w:sz w:val="24"/>
           <w:szCs w:val="24"/>
-          <w:lang w:val="en-US"/>
+          <w:lang w:val="fr-CH"/>
         </w:rPr>
         <w:t xml:space="preserve">: </w:t>
       </w:r>
@@ -10094,7 +10768,7 @@
           <w:bCs/>
           <w:sz w:val="24"/>
           <w:szCs w:val="24"/>
-          <w:lang w:val="en-US"/>
+          <w:lang w:val="fr-CH"/>
         </w:rPr>
         <w:t>&lt;&lt;[committee.measure]</w:t>
       </w:r>
@@ -10104,7 +10778,7 @@
           <w:bCs/>
           <w:sz w:val="24"/>
           <w:szCs w:val="24"/>
-          <w:lang w:val="en-US"/>
+          <w:lang w:val="fr-CH"/>
         </w:rPr>
         <w:t xml:space="preserve"> -html</w:t>
       </w:r>
@@ -10114,14 +10788,46 @@
           <w:bCs/>
           <w:sz w:val="24"/>
           <w:szCs w:val="24"/>
-          <w:lang w:val="en-US"/>
+          <w:lang w:val="fr-CH"/>
         </w:rPr>
         <w:t>&gt;&gt;</w:t>
       </w:r>
-    </w:p>
-    <w:p>
-      <w:pPr>
-        <w:pStyle w:val="Listenabsatz"/>
+      <w:r>
+        <w:rPr>
+          <w:rFonts w:ascii="Times New Roman" w:hAnsi="Times New Roman"/>
+          <w:bCs/>
+          <w:sz w:val="24"/>
+          <w:szCs w:val="24"/>
+          <w:lang w:val="fr-CH"/>
+        </w:rPr>
+        <w:t>&lt;&lt;if [committee.hasOpenMeasureChanges]&gt;&gt;</w:t>
+      </w:r>
+      <w:r>
+        <w:rPr>
+          <w:rFonts w:ascii="Times New Roman" w:hAnsi="Times New Roman"/>
+          <w:bCs/>
+          <w:color w:val="FFFFFF" w:themeColor="background1"/>
+          <w:sz w:val="24"/>
+          <w:szCs w:val="24"/>
+          <w:highlight w:val="red"/>
+          <w:lang w:val="fr-CH"/>
+        </w:rPr>
+        <w:t>Il existe des modifications en suspens pour cette mesure. Cliquez &lt;&lt;link [committee.justificationUrl] ["ici"]&gt;&gt; pour corriger la justification dans l’application APG.</w:t>
+      </w:r>
+      <w:r>
+        <w:rPr>
+          <w:rFonts w:ascii="Times New Roman" w:hAnsi="Times New Roman"/>
+          <w:bCs/>
+          <w:sz w:val="24"/>
+          <w:szCs w:val="24"/>
+          <w:lang w:val="fr-CH"/>
+        </w:rPr>
+        <w:t>&lt;&lt;/if&gt;&gt;</w:t>
+      </w:r>
+    </w:p>
+    <w:p>
+      <w:pPr>
+        <w:pStyle w:val="ListParagraph"/>
         <w:numPr>
           <w:ilvl w:val="0"/>
           <w:numId w:val="41"/>
@@ -10171,7 +10877,7 @@
     </w:p>
     <w:p>
       <w:pPr>
-        <w:pStyle w:val="berschrift2"/>
+        <w:pStyle w:val="Heading2"/>
         <w:rPr>
           <w:rFonts w:ascii="Times New Roman" w:hAnsi="Times New Roman" w:cs="Times New Roman"/>
           <w:lang w:val="fr-CH"/>
@@ -10254,7 +10960,7 @@
     </w:p>
     <w:p>
       <w:pPr>
-        <w:pStyle w:val="berschrift3"/>
+        <w:pStyle w:val="Heading3"/>
         <w:rPr>
           <w:rFonts w:ascii="Times New Roman" w:hAnsi="Times New Roman" w:cs="Times New Roman"/>
           <w:lang w:val="fr-CH"/>
@@ -10374,7 +11080,7 @@
     </w:p>
     <w:p>
       <w:pPr>
-        <w:pStyle w:val="Listenabsatz"/>
+        <w:pStyle w:val="ListParagraph"/>
         <w:numPr>
           <w:ilvl w:val="0"/>
           <w:numId w:val="41"/>
@@ -10452,7 +11158,7 @@
     </w:p>
     <w:p>
       <w:pPr>
-        <w:pStyle w:val="Listenabsatz"/>
+        <w:pStyle w:val="ListParagraph"/>
         <w:spacing w:before="60" w:after="40"/>
         <w:ind w:left="360"/>
         <w:rPr>
@@ -10674,7 +11380,7 @@
     </w:p>
     <w:p>
       <w:pPr>
-        <w:pStyle w:val="Listenabsatz"/>
+        <w:pStyle w:val="ListParagraph"/>
         <w:spacing w:before="60" w:after="40"/>
         <w:ind w:left="360"/>
         <w:rPr>
@@ -10682,7 +11388,7 @@
           <w:bCs/>
           <w:sz w:val="24"/>
           <w:szCs w:val="24"/>
-          <w:lang w:val="en-US"/>
+          <w:lang w:val="fr-CH"/>
         </w:rPr>
       </w:pPr>
       <w:r>
@@ -10693,9 +11399,8 @@
           <w:iCs/>
           <w:sz w:val="24"/>
           <w:szCs w:val="24"/>
-          <w:lang w:val="en-US"/>
-        </w:rPr>
-        <w:lastRenderedPageBreak/>
+          <w:lang w:val="fr-CH"/>
+        </w:rPr>
         <w:t>Justification</w:t>
       </w:r>
       <w:r>
@@ -10706,7 +11411,7 @@
           <w:iCs/>
           <w:sz w:val="24"/>
           <w:szCs w:val="24"/>
-          <w:lang w:val="en-US"/>
+          <w:lang w:val="fr-CH"/>
         </w:rPr>
         <w:t xml:space="preserve">: </w:t>
       </w:r>
@@ -10716,7 +11421,7 @@
           <w:bCs/>
           <w:sz w:val="24"/>
           <w:szCs w:val="24"/>
-          <w:lang w:val="en-US"/>
+          <w:lang w:val="fr-CH"/>
         </w:rPr>
         <w:t>&lt;&lt;[committee.justification]</w:t>
       </w:r>
@@ -10726,7 +11431,7 @@
           <w:bCs/>
           <w:sz w:val="24"/>
           <w:szCs w:val="24"/>
-          <w:lang w:val="en-US"/>
+          <w:lang w:val="fr-CH"/>
         </w:rPr>
         <w:t xml:space="preserve"> -html</w:t>
       </w:r>
@@ -10736,14 +11441,46 @@
           <w:bCs/>
           <w:sz w:val="24"/>
           <w:szCs w:val="24"/>
-          <w:lang w:val="en-US"/>
+          <w:lang w:val="fr-CH"/>
         </w:rPr>
         <w:t>&gt;&gt;</w:t>
       </w:r>
-    </w:p>
-    <w:p>
-      <w:pPr>
-        <w:pStyle w:val="Listenabsatz"/>
+      <w:r>
+        <w:rPr>
+          <w:rFonts w:ascii="Times New Roman" w:hAnsi="Times New Roman"/>
+          <w:bCs/>
+          <w:sz w:val="24"/>
+          <w:szCs w:val="24"/>
+          <w:lang w:val="fr-CH"/>
+        </w:rPr>
+        <w:t>&lt;&lt;if [committee.hasOpenJustificationChanges]&gt;&gt;</w:t>
+      </w:r>
+      <w:r>
+        <w:rPr>
+          <w:rFonts w:ascii="Times New Roman" w:hAnsi="Times New Roman"/>
+          <w:bCs/>
+          <w:color w:val="FFFFFF" w:themeColor="background1"/>
+          <w:sz w:val="24"/>
+          <w:szCs w:val="24"/>
+          <w:highlight w:val="red"/>
+          <w:lang w:val="fr-CH"/>
+        </w:rPr>
+        <w:t>Il existe des modifications en suspens pour cette justification. Cliquez &lt;&lt;link [committee.justificationUrl] ["ici"]&gt;&gt; pour corriger la justification dans l’application APG.</w:t>
+      </w:r>
+      <w:r>
+        <w:rPr>
+          <w:rFonts w:ascii="Times New Roman" w:hAnsi="Times New Roman"/>
+          <w:bCs/>
+          <w:sz w:val="24"/>
+          <w:szCs w:val="24"/>
+          <w:lang w:val="fr-CH"/>
+        </w:rPr>
+        <w:t>&lt;&lt;/if&gt;&gt;</w:t>
+      </w:r>
+    </w:p>
+    <w:p>
+      <w:pPr>
+        <w:pStyle w:val="ListParagraph"/>
         <w:spacing w:before="60" w:after="40"/>
         <w:ind w:left="360"/>
         <w:rPr>
@@ -10751,7 +11488,7 @@
           <w:bCs/>
           <w:sz w:val="24"/>
           <w:szCs w:val="24"/>
-          <w:lang w:val="en-US"/>
+          <w:lang w:val="fr-CH"/>
         </w:rPr>
       </w:pPr>
       <w:r>
@@ -10762,7 +11499,7 @@
           <w:iCs/>
           <w:sz w:val="24"/>
           <w:szCs w:val="24"/>
-          <w:lang w:val="en-US"/>
+          <w:lang w:val="fr-CH"/>
         </w:rPr>
         <w:t>Mesure</w:t>
       </w:r>
@@ -10774,7 +11511,7 @@
           <w:iCs/>
           <w:sz w:val="24"/>
           <w:szCs w:val="24"/>
-          <w:lang w:val="en-US"/>
+          <w:lang w:val="fr-CH"/>
         </w:rPr>
         <w:t xml:space="preserve">: </w:t>
       </w:r>
@@ -10784,7 +11521,7 @@
           <w:bCs/>
           <w:sz w:val="24"/>
           <w:szCs w:val="24"/>
-          <w:lang w:val="en-US"/>
+          <w:lang w:val="fr-CH"/>
         </w:rPr>
         <w:t>&lt;&lt;[committee.measure]</w:t>
       </w:r>
@@ -10794,34 +11531,56 @@
           <w:bCs/>
           <w:sz w:val="24"/>
           <w:szCs w:val="24"/>
-          <w:lang w:val="en-US"/>
-        </w:rPr>
-        <w:t xml:space="preserve"> </w:t>
-      </w:r>
-      <w:r>
-        <w:rPr>
-          <w:rFonts w:ascii="Times New Roman" w:hAnsi="Times New Roman"/>
-          <w:bCs/>
-          <w:sz w:val="24"/>
-          <w:szCs w:val="24"/>
-          <w:lang w:val="en-US"/>
-        </w:rPr>
-        <w:t>-html</w:t>
-      </w:r>
-      <w:r>
-        <w:rPr>
-          <w:rFonts w:ascii="Times New Roman" w:hAnsi="Times New Roman"/>
-          <w:bCs/>
-          <w:sz w:val="24"/>
-          <w:szCs w:val="24"/>
-          <w:lang w:val="en-US"/>
+          <w:lang w:val="fr-CH"/>
+        </w:rPr>
+        <w:t xml:space="preserve"> -html</w:t>
+      </w:r>
+      <w:r>
+        <w:rPr>
+          <w:rFonts w:ascii="Times New Roman" w:hAnsi="Times New Roman"/>
+          <w:bCs/>
+          <w:sz w:val="24"/>
+          <w:szCs w:val="24"/>
+          <w:lang w:val="fr-CH"/>
         </w:rPr>
         <w:t>&gt;&gt;</w:t>
       </w:r>
-    </w:p>
-    <w:p>
-      <w:pPr>
-        <w:pStyle w:val="Listenabsatz"/>
+      <w:r>
+        <w:rPr>
+          <w:rFonts w:ascii="Times New Roman" w:hAnsi="Times New Roman"/>
+          <w:bCs/>
+          <w:sz w:val="24"/>
+          <w:szCs w:val="24"/>
+          <w:lang w:val="fr-CH"/>
+        </w:rPr>
+        <w:t>&lt;&lt;if [committee.hasOpenMeasureChanges]&gt;&gt;</w:t>
+      </w:r>
+      <w:r>
+        <w:rPr>
+          <w:rFonts w:ascii="Times New Roman" w:hAnsi="Times New Roman"/>
+          <w:bCs/>
+          <w:color w:val="FFFFFF" w:themeColor="background1"/>
+          <w:sz w:val="24"/>
+          <w:szCs w:val="24"/>
+          <w:highlight w:val="red"/>
+          <w:lang w:val="fr-CH"/>
+        </w:rPr>
+        <w:t>Il existe des modifications en suspens pour cette mesure. Cliquez &lt;&lt;link [committee.justificationUrl] ["ici"]&gt;&gt; pour corriger la justification dans l’application APG.</w:t>
+      </w:r>
+      <w:r>
+        <w:rPr>
+          <w:rFonts w:ascii="Times New Roman" w:hAnsi="Times New Roman"/>
+          <w:bCs/>
+          <w:sz w:val="24"/>
+          <w:szCs w:val="24"/>
+          <w:lang w:val="fr-CH"/>
+        </w:rPr>
+        <w:t>&lt;&lt;/if&gt;&gt;</w:t>
+      </w:r>
+    </w:p>
+    <w:p>
+      <w:pPr>
+        <w:pStyle w:val="ListParagraph"/>
         <w:ind w:left="0"/>
         <w:rPr>
           <w:rFonts w:ascii="Times New Roman" w:eastAsia="Times New Roman" w:hAnsi="Times New Roman"/>
@@ -10855,6 +11614,7 @@
           <w:szCs w:val="24"/>
           <w:lang w:val="en-US"/>
         </w:rPr>
+        <w:lastRenderedPageBreak/>
         <w:t>&lt;&lt;/foreach&gt;&gt;</w:t>
       </w:r>
     </w:p>
@@ -10867,7 +11627,7 @@
     </w:p>
     <w:p>
       <w:pPr>
-        <w:pStyle w:val="berschrift1"/>
+        <w:pStyle w:val="Heading1"/>
         <w:rPr>
           <w:rFonts w:ascii="Times New Roman" w:hAnsi="Times New Roman" w:cs="Times New Roman"/>
           <w:lang w:val="fr-CH"/>
@@ -10914,7 +11674,7 @@
     </w:p>
     <w:p>
       <w:pPr>
-        <w:pStyle w:val="berschrift2"/>
+        <w:pStyle w:val="Heading2"/>
         <w:rPr>
           <w:rFonts w:ascii="Times New Roman" w:hAnsi="Times New Roman" w:cs="Times New Roman"/>
           <w:lang w:val="fr-CH"/>
@@ -10995,7 +11755,7 @@
     </w:p>
     <w:p>
       <w:pPr>
-        <w:pStyle w:val="Listenabsatz"/>
+        <w:pStyle w:val="ListParagraph"/>
         <w:rPr>
           <w:rFonts w:ascii="Times New Roman" w:eastAsia="Times New Roman" w:hAnsi="Times New Roman"/>
           <w:sz w:val="24"/>
@@ -11015,7 +11775,7 @@
     </w:p>
     <w:p>
       <w:pPr>
-        <w:pStyle w:val="Listenabsatz"/>
+        <w:pStyle w:val="ListParagraph"/>
         <w:numPr>
           <w:ilvl w:val="0"/>
           <w:numId w:val="41"/>
@@ -11045,7 +11805,7 @@
     </w:p>
     <w:p>
       <w:pPr>
-        <w:pStyle w:val="Listenabsatz"/>
+        <w:pStyle w:val="ListParagraph"/>
         <w:rPr>
           <w:rFonts w:ascii="Times New Roman" w:eastAsia="Times New Roman" w:hAnsi="Times New Roman"/>
           <w:sz w:val="24"/>
@@ -11065,7 +11825,7 @@
     </w:p>
     <w:p>
       <w:pPr>
-        <w:pStyle w:val="Listenabsatz"/>
+        <w:pStyle w:val="ListParagraph"/>
         <w:rPr>
           <w:rFonts w:ascii="Times New Roman" w:eastAsia="Times New Roman" w:hAnsi="Times New Roman"/>
           <w:sz w:val="24"/>
@@ -11096,7 +11856,7 @@
     </w:p>
     <w:p>
       <w:pPr>
-        <w:pStyle w:val="Listenabsatz"/>
+        <w:pStyle w:val="ListParagraph"/>
         <w:rPr>
           <w:rFonts w:ascii="Times New Roman" w:eastAsia="Times New Roman" w:hAnsi="Times New Roman"/>
           <w:sz w:val="24"/>
@@ -11116,7 +11876,7 @@
     </w:p>
     <w:p>
       <w:pPr>
-        <w:pStyle w:val="Listenabsatz"/>
+        <w:pStyle w:val="ListParagraph"/>
         <w:rPr>
           <w:rFonts w:ascii="Times New Roman" w:eastAsia="Times New Roman" w:hAnsi="Times New Roman"/>
           <w:sz w:val="24"/>
@@ -11136,7 +11896,7 @@
     </w:p>
     <w:p>
       <w:pPr>
-        <w:pStyle w:val="Listenabsatz"/>
+        <w:pStyle w:val="ListParagraph"/>
         <w:ind w:left="0"/>
         <w:rPr>
           <w:rFonts w:ascii="Times New Roman" w:eastAsia="Times New Roman" w:hAnsi="Times New Roman"/>
@@ -11191,7 +11951,7 @@
     </w:p>
     <w:p>
       <w:pPr>
-        <w:pStyle w:val="berschrift1"/>
+        <w:pStyle w:val="Heading1"/>
         <w:rPr>
           <w:rFonts w:ascii="Times New Roman" w:hAnsi="Times New Roman" w:cs="Times New Roman"/>
         </w:rPr>
@@ -11327,7 +12087,7 @@
     </w:p>
     <w:tbl>
       <w:tblPr>
-        <w:tblStyle w:val="Tabellenraster"/>
+        <w:tblStyle w:val="TableGrid"/>
         <w:tblW w:w="0" w:type="auto"/>
         <w:tblLook w:val="04A0" w:firstRow="1" w:lastRow="0" w:firstColumn="1" w:lastColumn="0" w:noHBand="0" w:noVBand="1"/>
       </w:tblPr>
@@ -11452,7 +12212,7 @@
     </w:p>
     <w:p>
       <w:pPr>
-        <w:pStyle w:val="berschrift1"/>
+        <w:pStyle w:val="Heading1"/>
         <w:rPr>
           <w:rFonts w:ascii="Times New Roman" w:hAnsi="Times New Roman" w:cs="Times New Roman"/>
         </w:rPr>
@@ -11525,7 +12285,7 @@
     </w:p>
     <w:p>
       <w:pPr>
-        <w:pStyle w:val="berschrift2"/>
+        <w:pStyle w:val="Heading2"/>
         <w:rPr>
           <w:rFonts w:ascii="Times New Roman" w:hAnsi="Times New Roman" w:cs="Times New Roman"/>
           <w:lang w:val="fr-CH"/>
@@ -11617,7 +12377,7 @@
     </w:p>
     <w:p>
       <w:pPr>
-        <w:pStyle w:val="Listenabsatz"/>
+        <w:pStyle w:val="ListParagraph"/>
         <w:numPr>
           <w:ilvl w:val="0"/>
           <w:numId w:val="41"/>
@@ -11647,7 +12407,7 @@
     </w:p>
     <w:p>
       <w:pPr>
-        <w:pStyle w:val="Listenabsatz"/>
+        <w:pStyle w:val="ListParagraph"/>
         <w:spacing w:before="60" w:after="40"/>
         <w:ind w:left="357"/>
         <w:rPr>
@@ -11666,7 +12426,6 @@
           <w:szCs w:val="24"/>
           <w:lang w:val="en-US" w:eastAsia="de-DE"/>
         </w:rPr>
-        <w:lastRenderedPageBreak/>
         <w:t>&lt;&lt;[</w:t>
       </w:r>
       <w:r>
@@ -11690,7 +12449,7 @@
     </w:p>
     <w:p>
       <w:pPr>
-        <w:pStyle w:val="Listenabsatz"/>
+        <w:pStyle w:val="ListParagraph"/>
         <w:ind w:left="0"/>
         <w:rPr>
           <w:rFonts w:ascii="Times New Roman" w:eastAsia="Times New Roman" w:hAnsi="Times New Roman"/>
@@ -11738,7 +12497,7 @@
     </w:p>
     <w:p>
       <w:pPr>
-        <w:pStyle w:val="berschrift1"/>
+        <w:pStyle w:val="Heading1"/>
         <w:rPr>
           <w:rFonts w:ascii="Times New Roman" w:hAnsi="Times New Roman" w:cs="Times New Roman"/>
         </w:rPr>
@@ -11810,7 +12569,7 @@
     </w:p>
     <w:p>
       <w:pPr>
-        <w:pStyle w:val="berschrift2"/>
+        <w:pStyle w:val="Heading2"/>
         <w:rPr>
           <w:rFonts w:ascii="Times New Roman" w:hAnsi="Times New Roman" w:cs="Times New Roman"/>
           <w:lang w:val="fr-CH"/>
@@ -11891,7 +12650,7 @@
     </w:p>
     <w:p>
       <w:pPr>
-        <w:pStyle w:val="Listenabsatz"/>
+        <w:pStyle w:val="ListParagraph"/>
         <w:rPr>
           <w:rFonts w:ascii="Times New Roman" w:eastAsia="Times New Roman" w:hAnsi="Times New Roman"/>
           <w:sz w:val="24"/>
@@ -11911,7 +12670,7 @@
     </w:p>
     <w:p>
       <w:pPr>
-        <w:pStyle w:val="Listenabsatz"/>
+        <w:pStyle w:val="ListParagraph"/>
         <w:numPr>
           <w:ilvl w:val="0"/>
           <w:numId w:val="41"/>
@@ -11941,7 +12700,7 @@
     </w:p>
     <w:p>
       <w:pPr>
-        <w:pStyle w:val="Listenabsatz"/>
+        <w:pStyle w:val="ListParagraph"/>
         <w:rPr>
           <w:rFonts w:ascii="Times New Roman" w:eastAsia="Times New Roman" w:hAnsi="Times New Roman"/>
           <w:sz w:val="24"/>
@@ -11961,7 +12720,7 @@
     </w:p>
     <w:p>
       <w:pPr>
-        <w:pStyle w:val="Listenabsatz"/>
+        <w:pStyle w:val="ListParagraph"/>
         <w:rPr>
           <w:rFonts w:ascii="Times New Roman" w:eastAsia="Times New Roman" w:hAnsi="Times New Roman"/>
           <w:sz w:val="24"/>
@@ -12064,27 +12823,115 @@
     </w:p>
     <w:p>
       <w:pPr>
-        <w:pStyle w:val="Listenabsatz"/>
-        <w:rPr>
-          <w:rFonts w:ascii="Times New Roman" w:eastAsia="Times New Roman" w:hAnsi="Times New Roman"/>
-          <w:sz w:val="24"/>
-          <w:szCs w:val="24"/>
-          <w:lang w:val="en-US" w:eastAsia="de-DE"/>
-        </w:rPr>
-      </w:pPr>
-      <w:r>
-        <w:rPr>
-          <w:rFonts w:ascii="Times New Roman" w:eastAsia="Times New Roman" w:hAnsi="Times New Roman"/>
-          <w:sz w:val="24"/>
-          <w:szCs w:val="24"/>
-          <w:lang w:val="en-US" w:eastAsia="de-DE"/>
+        <w:pStyle w:val="ListParagraph"/>
+        <w:rPr>
+          <w:rFonts w:ascii="Times New Roman" w:eastAsia="Times New Roman" w:hAnsi="Times New Roman"/>
+          <w:sz w:val="24"/>
+          <w:szCs w:val="24"/>
+          <w:lang w:val="fr-CH" w:eastAsia="de-DE"/>
+        </w:rPr>
+      </w:pPr>
+      <w:r>
+        <w:rPr>
+          <w:rFonts w:ascii="Times New Roman" w:eastAsia="Times New Roman" w:hAnsi="Times New Roman"/>
+          <w:sz w:val="24"/>
+          <w:szCs w:val="24"/>
+          <w:lang w:val="fr-CH" w:eastAsia="de-DE"/>
         </w:rPr>
         <w:t>&lt;&lt;[member.Freetext]&gt;&gt;</w:t>
       </w:r>
-    </w:p>
-    <w:p>
-      <w:pPr>
-        <w:pStyle w:val="Listenabsatz"/>
+      <w:r>
+        <w:rPr>
+          <w:rFonts w:ascii="Times New Roman" w:hAnsi="Times New Roman"/>
+          <w:bCs/>
+          <w:sz w:val="24"/>
+          <w:szCs w:val="24"/>
+          <w:lang w:val="fr-CH"/>
+        </w:rPr>
+        <w:t>&lt;&lt;if [</w:t>
+      </w:r>
+      <w:r>
+        <w:rPr>
+          <w:rFonts w:ascii="Times New Roman" w:hAnsi="Times New Roman"/>
+          <w:bCs/>
+          <w:sz w:val="24"/>
+          <w:szCs w:val="24"/>
+          <w:lang w:val="fr-CH"/>
+        </w:rPr>
+        <w:t>member</w:t>
+      </w:r>
+      <w:r>
+        <w:rPr>
+          <w:rFonts w:ascii="Times New Roman" w:hAnsi="Times New Roman"/>
+          <w:bCs/>
+          <w:sz w:val="24"/>
+          <w:szCs w:val="24"/>
+          <w:lang w:val="fr-CH"/>
+        </w:rPr>
+        <w:t>.hasOpenJustificationChanges]&gt;&gt;</w:t>
+      </w:r>
+      <w:r>
+        <w:rPr>
+          <w:rFonts w:ascii="Times New Roman" w:hAnsi="Times New Roman"/>
+          <w:bCs/>
+          <w:color w:val="FFFFFF" w:themeColor="background1"/>
+          <w:sz w:val="24"/>
+          <w:szCs w:val="24"/>
+          <w:highlight w:val="red"/>
+          <w:lang w:val="fr-CH"/>
+        </w:rPr>
+        <w:t xml:space="preserve">Il existe des modifications en suspens pour cette justification. </w:t>
+      </w:r>
+      <w:r>
+        <w:rPr>
+          <w:rFonts w:ascii="Times New Roman" w:hAnsi="Times New Roman"/>
+          <w:bCs/>
+          <w:color w:val="FFFFFF" w:themeColor="background1"/>
+          <w:sz w:val="24"/>
+          <w:szCs w:val="24"/>
+          <w:highlight w:val="red"/>
+          <w:lang w:val="fr-CH"/>
+        </w:rPr>
+        <w:t>Cliquez &lt;&lt;link [</w:t>
+      </w:r>
+      <w:r>
+        <w:rPr>
+          <w:rFonts w:ascii="Times New Roman" w:hAnsi="Times New Roman"/>
+          <w:bCs/>
+          <w:color w:val="FFFFFF" w:themeColor="background1"/>
+          <w:sz w:val="24"/>
+          <w:szCs w:val="24"/>
+          <w:highlight w:val="red"/>
+          <w:lang w:val="fr-CH"/>
+        </w:rPr>
+        <w:t>member</w:t>
+      </w:r>
+      <w:r>
+        <w:rPr>
+          <w:rFonts w:ascii="Times New Roman" w:hAnsi="Times New Roman"/>
+          <w:bCs/>
+          <w:color w:val="FFFFFF" w:themeColor="background1"/>
+          <w:sz w:val="24"/>
+          <w:szCs w:val="24"/>
+          <w:highlight w:val="red"/>
+          <w:lang w:val="fr-CH"/>
+        </w:rPr>
+        <w:t>.justificationUrl] ["ici"]&gt;&gt; pour corriger la justification dans l’application APG.</w:t>
+      </w:r>
+      <w:r>
+        <w:rPr>
+          <w:rFonts w:ascii="Times New Roman" w:hAnsi="Times New Roman"/>
+          <w:bCs/>
+          <w:sz w:val="24"/>
+          <w:szCs w:val="24"/>
+          <w:lang w:val="fr-CH"/>
+        </w:rPr>
+        <w:t>&lt;&lt;/if&gt;&gt;</w:t>
+      </w:r>
+    </w:p>
+    <w:p>
+      <w:pPr>
+        <w:pStyle w:val="ListParagraph"/>
         <w:rPr>
           <w:rFonts w:ascii="Times New Roman" w:eastAsia="Times New Roman" w:hAnsi="Times New Roman"/>
           <w:sz w:val="24"/>
@@ -12104,7 +12951,7 @@
     </w:p>
     <w:p>
       <w:pPr>
-        <w:pStyle w:val="Listenabsatz"/>
+        <w:pStyle w:val="ListParagraph"/>
         <w:rPr>
           <w:rFonts w:ascii="Times New Roman" w:eastAsia="Times New Roman" w:hAnsi="Times New Roman"/>
           <w:sz w:val="24"/>
@@ -12124,7 +12971,7 @@
     </w:p>
     <w:p>
       <w:pPr>
-        <w:pStyle w:val="Listenabsatz"/>
+        <w:pStyle w:val="ListParagraph"/>
         <w:ind w:left="0"/>
         <w:rPr>
           <w:rFonts w:ascii="Times New Roman" w:eastAsia="Times New Roman" w:hAnsi="Times New Roman"/>
@@ -12557,7 +13404,7 @@
   </w:p>
   <w:p>
     <w:pPr>
-      <w:pStyle w:val="Fuzeile"/>
+      <w:pStyle w:val="Footer"/>
     </w:pPr>
   </w:p>
 </w:ftr>
@@ -12681,7 +13528,7 @@
         </w:tcPr>
         <w:p>
           <w:pPr>
-            <w:pStyle w:val="Kopfzeile"/>
+            <w:pStyle w:val="Header"/>
           </w:pPr>
         </w:p>
       </w:tc>
@@ -13547,7 +14394,7 @@
     <w:lvl w:ilvl="0">
       <w:start w:val="1"/>
       <w:numFmt w:val="decimal"/>
-      <w:pStyle w:val="berschrift1"/>
+      <w:pStyle w:val="Heading1"/>
       <w:lvlText w:val="%1"/>
       <w:lvlJc w:val="left"/>
       <w:pPr>
@@ -13560,7 +14407,7 @@
     <w:lvl w:ilvl="1">
       <w:start w:val="1"/>
       <w:numFmt w:val="decimal"/>
-      <w:pStyle w:val="berschrift2"/>
+      <w:pStyle w:val="Heading2"/>
       <w:lvlText w:val="%1.%2"/>
       <w:lvlJc w:val="left"/>
       <w:pPr>
@@ -13573,7 +14420,7 @@
     <w:lvl w:ilvl="2">
       <w:start w:val="1"/>
       <w:numFmt w:val="decimal"/>
-      <w:pStyle w:val="berschrift3"/>
+      <w:pStyle w:val="Heading3"/>
       <w:lvlText w:val="%1.%2.%3"/>
       <w:lvlJc w:val="left"/>
       <w:pPr>
@@ -13586,7 +14433,7 @@
     <w:lvl w:ilvl="3">
       <w:start w:val="1"/>
       <w:numFmt w:val="decimal"/>
-      <w:pStyle w:val="berschrift4"/>
+      <w:pStyle w:val="Heading4"/>
       <w:lvlText w:val="%1.%2.%3.%4"/>
       <w:lvlJc w:val="left"/>
       <w:pPr>
@@ -13599,7 +14446,7 @@
     <w:lvl w:ilvl="4">
       <w:start w:val="1"/>
       <w:numFmt w:val="decimal"/>
-      <w:pStyle w:val="berschrift5"/>
+      <w:pStyle w:val="Heading5"/>
       <w:lvlText w:val="%1.%2.%3.%4.%5"/>
       <w:lvlJc w:val="left"/>
       <w:pPr>
@@ -13612,7 +14459,7 @@
     <w:lvl w:ilvl="5">
       <w:start w:val="1"/>
       <w:numFmt w:val="decimal"/>
-      <w:pStyle w:val="berschrift6"/>
+      <w:pStyle w:val="Heading6"/>
       <w:lvlText w:val="%1.%2.%3.%4.%5.%6"/>
       <w:lvlJc w:val="left"/>
       <w:pPr>
@@ -13625,7 +14472,7 @@
     <w:lvl w:ilvl="6">
       <w:start w:val="1"/>
       <w:numFmt w:val="decimal"/>
-      <w:pStyle w:val="berschrift7"/>
+      <w:pStyle w:val="Heading7"/>
       <w:lvlText w:val="%1.%2.%3.%4.%5.%6.%7"/>
       <w:lvlJc w:val="left"/>
       <w:pPr>
@@ -13638,7 +14485,7 @@
     <w:lvl w:ilvl="7">
       <w:start w:val="1"/>
       <w:numFmt w:val="decimal"/>
-      <w:pStyle w:val="berschrift8"/>
+      <w:pStyle w:val="Heading8"/>
       <w:lvlText w:val="%1.%2.%3.%4.%5.%6.%7.%8"/>
       <w:lvlJc w:val="left"/>
       <w:pPr>
@@ -13651,7 +14498,7 @@
     <w:lvl w:ilvl="8">
       <w:start w:val="1"/>
       <w:numFmt w:val="decimal"/>
-      <w:pStyle w:val="berschrift9"/>
+      <w:pStyle w:val="Heading9"/>
       <w:lvlText w:val="%1.%2.%3.%4.%5.%6.%7.%8.%9"/>
       <w:lvlJc w:val="left"/>
       <w:pPr>
@@ -15232,7 +16079,7 @@
     <w:lsdException w:name="Unresolved Mention" w:semiHidden="1" w:uiPriority="99" w:unhideWhenUsed="1"/>
     <w:lsdException w:name="Smart Link" w:semiHidden="1" w:uiPriority="99" w:unhideWhenUsed="1"/>
   </w:latentStyles>
-  <w:style w:type="paragraph" w:default="1" w:styleId="Standard">
+  <w:style w:type="paragraph" w:default="1" w:styleId="Normal">
     <w:name w:val="Normal"/>
     <w:qFormat/>
     <w:rsid w:val="00F42E52"/>
@@ -15242,11 +16089,11 @@
       <w:lang w:val="de-CH" w:eastAsia="de-CH"/>
     </w:rPr>
   </w:style>
-  <w:style w:type="paragraph" w:styleId="berschrift1">
+  <w:style w:type="paragraph" w:styleId="Heading1">
     <w:name w:val="heading 1"/>
-    <w:basedOn w:val="Standard"/>
-    <w:next w:val="Standard"/>
-    <w:link w:val="berschrift1Zchn"/>
+    <w:basedOn w:val="Normal"/>
+    <w:next w:val="Normal"/>
+    <w:link w:val="Heading1Char"/>
     <w:qFormat/>
     <w:pPr>
       <w:keepNext/>
@@ -15266,11 +16113,11 @@
       <w:szCs w:val="42"/>
     </w:rPr>
   </w:style>
-  <w:style w:type="paragraph" w:styleId="berschrift2">
+  <w:style w:type="paragraph" w:styleId="Heading2">
     <w:name w:val="heading 2"/>
-    <w:basedOn w:val="Standard"/>
-    <w:next w:val="Standard"/>
-    <w:link w:val="berschrift2Zchn"/>
+    <w:basedOn w:val="Normal"/>
+    <w:next w:val="Normal"/>
+    <w:link w:val="Heading2Char"/>
     <w:autoRedefine/>
     <w:qFormat/>
     <w:pPr>
@@ -15292,11 +16139,11 @@
       <w:szCs w:val="24"/>
     </w:rPr>
   </w:style>
-  <w:style w:type="paragraph" w:styleId="berschrift3">
+  <w:style w:type="paragraph" w:styleId="Heading3">
     <w:name w:val="heading 3"/>
-    <w:basedOn w:val="Standard"/>
-    <w:next w:val="Standard"/>
-    <w:link w:val="berschrift3Zchn"/>
+    <w:basedOn w:val="Normal"/>
+    <w:next w:val="Normal"/>
+    <w:link w:val="Heading3Char"/>
     <w:autoRedefine/>
     <w:qFormat/>
     <w:pPr>
@@ -15314,11 +16161,11 @@
       <w:noProof/>
     </w:rPr>
   </w:style>
-  <w:style w:type="paragraph" w:styleId="berschrift4">
+  <w:style w:type="paragraph" w:styleId="Heading4">
     <w:name w:val="heading 4"/>
-    <w:basedOn w:val="Standard"/>
-    <w:next w:val="Standard"/>
-    <w:link w:val="berschrift4Zchn"/>
+    <w:basedOn w:val="Normal"/>
+    <w:next w:val="Normal"/>
+    <w:link w:val="Heading4Char"/>
     <w:semiHidden/>
     <w:unhideWhenUsed/>
     <w:qFormat/>
@@ -15343,11 +16190,11 @@
       <w:color w:val="2E74B5" w:themeColor="accent1" w:themeShade="BF"/>
     </w:rPr>
   </w:style>
-  <w:style w:type="paragraph" w:styleId="berschrift5">
+  <w:style w:type="paragraph" w:styleId="Heading5">
     <w:name w:val="heading 5"/>
-    <w:basedOn w:val="Standard"/>
-    <w:next w:val="Standard"/>
-    <w:link w:val="berschrift5Zchn"/>
+    <w:basedOn w:val="Normal"/>
+    <w:next w:val="Normal"/>
+    <w:link w:val="Heading5Char"/>
     <w:semiHidden/>
     <w:unhideWhenUsed/>
     <w:qFormat/>
@@ -15370,11 +16217,11 @@
       <w:color w:val="2E74B5" w:themeColor="accent1" w:themeShade="BF"/>
     </w:rPr>
   </w:style>
-  <w:style w:type="paragraph" w:styleId="berschrift6">
+  <w:style w:type="paragraph" w:styleId="Heading6">
     <w:name w:val="heading 6"/>
-    <w:basedOn w:val="Standard"/>
-    <w:next w:val="Standard"/>
-    <w:link w:val="berschrift6Zchn"/>
+    <w:basedOn w:val="Normal"/>
+    <w:next w:val="Normal"/>
+    <w:link w:val="Heading6Char"/>
     <w:semiHidden/>
     <w:unhideWhenUsed/>
     <w:qFormat/>
@@ -15397,11 +16244,11 @@
       <w:color w:val="1F4D78" w:themeColor="accent1" w:themeShade="7F"/>
     </w:rPr>
   </w:style>
-  <w:style w:type="paragraph" w:styleId="berschrift7">
+  <w:style w:type="paragraph" w:styleId="Heading7">
     <w:name w:val="heading 7"/>
-    <w:basedOn w:val="Standard"/>
-    <w:next w:val="Standard"/>
-    <w:link w:val="berschrift7Zchn"/>
+    <w:basedOn w:val="Normal"/>
+    <w:next w:val="Normal"/>
+    <w:link w:val="Heading7Char"/>
     <w:semiHidden/>
     <w:unhideWhenUsed/>
     <w:qFormat/>
@@ -15426,11 +16273,11 @@
       <w:color w:val="1F4D78" w:themeColor="accent1" w:themeShade="7F"/>
     </w:rPr>
   </w:style>
-  <w:style w:type="paragraph" w:styleId="berschrift8">
+  <w:style w:type="paragraph" w:styleId="Heading8">
     <w:name w:val="heading 8"/>
-    <w:basedOn w:val="Standard"/>
-    <w:next w:val="Standard"/>
-    <w:link w:val="berschrift8Zchn"/>
+    <w:basedOn w:val="Normal"/>
+    <w:next w:val="Normal"/>
+    <w:link w:val="Heading8Char"/>
     <w:semiHidden/>
     <w:unhideWhenUsed/>
     <w:qFormat/>
@@ -15455,11 +16302,11 @@
       <w:szCs w:val="21"/>
     </w:rPr>
   </w:style>
-  <w:style w:type="paragraph" w:styleId="berschrift9">
+  <w:style w:type="paragraph" w:styleId="Heading9">
     <w:name w:val="heading 9"/>
-    <w:basedOn w:val="Standard"/>
-    <w:next w:val="Standard"/>
-    <w:link w:val="berschrift9Zchn"/>
+    <w:basedOn w:val="Normal"/>
+    <w:next w:val="Normal"/>
+    <w:link w:val="Heading9Char"/>
     <w:semiHidden/>
     <w:unhideWhenUsed/>
     <w:qFormat/>
@@ -15486,13 +16333,13 @@
       <w:szCs w:val="21"/>
     </w:rPr>
   </w:style>
-  <w:style w:type="character" w:default="1" w:styleId="Absatz-Standardschriftart">
+  <w:style w:type="character" w:default="1" w:styleId="DefaultParagraphFont">
     <w:name w:val="Default Paragraph Font"/>
     <w:uiPriority w:val="1"/>
     <w:semiHidden/>
     <w:unhideWhenUsed/>
   </w:style>
-  <w:style w:type="table" w:default="1" w:styleId="NormaleTabelle">
+  <w:style w:type="table" w:default="1" w:styleId="TableNormal">
     <w:name w:val="Normal Table"/>
     <w:uiPriority w:val="99"/>
     <w:semiHidden/>
@@ -15507,15 +16354,15 @@
       </w:tblCellMar>
     </w:tblPr>
   </w:style>
-  <w:style w:type="numbering" w:default="1" w:styleId="KeineListe">
+  <w:style w:type="numbering" w:default="1" w:styleId="NoList">
     <w:name w:val="No List"/>
     <w:uiPriority w:val="99"/>
     <w:semiHidden/>
     <w:unhideWhenUsed/>
   </w:style>
-  <w:style w:type="paragraph" w:styleId="Kopfzeile">
+  <w:style w:type="paragraph" w:styleId="Header">
     <w:name w:val="header"/>
-    <w:basedOn w:val="Standard"/>
+    <w:basedOn w:val="Normal"/>
     <w:pPr>
       <w:suppressAutoHyphens/>
       <w:spacing w:line="200" w:lineRule="exact"/>
@@ -15525,9 +16372,9 @@
       <w:sz w:val="15"/>
     </w:rPr>
   </w:style>
-  <w:style w:type="paragraph" w:styleId="Fuzeile">
+  <w:style w:type="paragraph" w:styleId="Footer">
     <w:name w:val="footer"/>
-    <w:basedOn w:val="Standard"/>
+    <w:basedOn w:val="Normal"/>
     <w:pPr>
       <w:suppressAutoHyphens/>
       <w:spacing w:line="200" w:lineRule="exact"/>
@@ -15540,15 +16387,15 @@
   </w:style>
   <w:style w:type="paragraph" w:customStyle="1" w:styleId="KopfFett">
     <w:name w:val="KopfFett"/>
-    <w:basedOn w:val="Kopfzeile"/>
-    <w:next w:val="Kopfzeile"/>
+    <w:basedOn w:val="Header"/>
+    <w:next w:val="Header"/>
     <w:rPr>
       <w:b/>
     </w:rPr>
   </w:style>
   <w:style w:type="paragraph" w:customStyle="1" w:styleId="KopfDept">
     <w:name w:val="KopfDept"/>
-    <w:basedOn w:val="Kopfzeile"/>
+    <w:basedOn w:val="Header"/>
     <w:next w:val="KopfFett"/>
     <w:pPr>
       <w:spacing w:after="100"/>
@@ -15566,7 +16413,7 @@
   </w:style>
   <w:style w:type="numbering" w:customStyle="1" w:styleId="FormatvorlageNummerierteListe10pt">
     <w:name w:val="Formatvorlage Nummerierte Liste 10 pt"/>
-    <w:basedOn w:val="KeineListe"/>
+    <w:basedOn w:val="NoList"/>
     <w:pPr>
       <w:numPr>
         <w:numId w:val="1"/>
@@ -15592,7 +16439,7 @@
   </w:style>
   <w:style w:type="paragraph" w:customStyle="1" w:styleId="APKberschriftEbene2">
     <w:name w:val="APK Überschrift Ebene 2"/>
-    <w:basedOn w:val="Standard"/>
+    <w:basedOn w:val="Normal"/>
     <w:link w:val="APKberschriftEbene2Zchn"/>
     <w:autoRedefine/>
     <w:pPr>
@@ -15613,7 +16460,7 @@
   </w:style>
   <w:style w:type="paragraph" w:customStyle="1" w:styleId="Pfad">
     <w:name w:val="Pfad"/>
-    <w:next w:val="Fuzeile"/>
+    <w:next w:val="Footer"/>
     <w:pPr>
       <w:spacing w:line="160" w:lineRule="exact"/>
     </w:pPr>
@@ -15627,7 +16474,7 @@
   </w:style>
   <w:style w:type="paragraph" w:customStyle="1" w:styleId="APKberschriftEbene1">
     <w:name w:val="APK Überschrift Ebene 1"/>
-    <w:basedOn w:val="Standard"/>
+    <w:basedOn w:val="Normal"/>
     <w:autoRedefine/>
     <w:pPr>
       <w:overflowPunct w:val="0"/>
@@ -15647,7 +16494,7 @@
   </w:style>
   <w:style w:type="paragraph" w:customStyle="1" w:styleId="Seite">
     <w:name w:val="Seite"/>
-    <w:basedOn w:val="Standard"/>
+    <w:basedOn w:val="Normal"/>
     <w:pPr>
       <w:suppressAutoHyphens/>
       <w:spacing w:line="200" w:lineRule="exact"/>
@@ -15660,8 +16507,8 @@
   </w:style>
   <w:style w:type="paragraph" w:customStyle="1" w:styleId="Platzhalter">
     <w:name w:val="Platzhalter"/>
-    <w:basedOn w:val="Standard"/>
-    <w:next w:val="Standard"/>
+    <w:basedOn w:val="Normal"/>
+    <w:next w:val="Normal"/>
     <w:rPr>
       <w:sz w:val="2"/>
       <w:szCs w:val="2"/>
@@ -15669,7 +16516,7 @@
   </w:style>
   <w:style w:type="paragraph" w:customStyle="1" w:styleId="APKberschriftEbene3">
     <w:name w:val="APK Überschrift Ebene 3"/>
-    <w:basedOn w:val="Standard"/>
+    <w:basedOn w:val="Normal"/>
     <w:link w:val="APKberschriftEbene3Zchn"/>
     <w:autoRedefine/>
     <w:pPr>
@@ -15690,7 +16537,7 @@
   </w:style>
   <w:style w:type="paragraph" w:customStyle="1" w:styleId="FormatvorlageVor5ptNach5pt">
     <w:name w:val="Formatvorlage Vor:  5 pt Nach:  5 pt"/>
-    <w:basedOn w:val="Standard"/>
+    <w:basedOn w:val="Normal"/>
     <w:pPr>
       <w:overflowPunct w:val="0"/>
       <w:autoSpaceDE w:val="0"/>
@@ -15707,7 +16554,7 @@
   </w:style>
   <w:style w:type="character" w:customStyle="1" w:styleId="APKberschriftEbene3Zchn">
     <w:name w:val="APK Überschrift Ebene 3 Zchn"/>
-    <w:basedOn w:val="Absatz-Standardschriftart"/>
+    <w:basedOn w:val="DefaultParagraphFont"/>
     <w:link w:val="APKberschriftEbene3"/>
     <w:rPr>
       <w:i/>
@@ -15718,7 +16565,7 @@
   </w:style>
   <w:style w:type="character" w:customStyle="1" w:styleId="APKberschriftEbene2Zchn">
     <w:name w:val="APK Überschrift Ebene 2 Zchn"/>
-    <w:basedOn w:val="Absatz-Standardschriftart"/>
+    <w:basedOn w:val="DefaultParagraphFont"/>
     <w:link w:val="APKberschriftEbene2"/>
     <w:rPr>
       <w:rFonts w:ascii="Arial" w:hAnsi="Arial"/>
@@ -15730,7 +16577,7 @@
   </w:style>
   <w:style w:type="table" w:customStyle="1" w:styleId="Tabellengitternetz">
     <w:name w:val="Tabellengitternetz"/>
-    <w:basedOn w:val="NormaleTabelle"/>
+    <w:basedOn w:val="TableNormal"/>
     <w:tblPr>
       <w:tblBorders>
         <w:top w:val="single" w:sz="4" w:space="0" w:color="auto"/>
@@ -15742,9 +16589,9 @@
       </w:tblBorders>
     </w:tblPr>
   </w:style>
-  <w:style w:type="paragraph" w:styleId="Sprechblasentext">
+  <w:style w:type="paragraph" w:styleId="BalloonText">
     <w:name w:val="Balloon Text"/>
-    <w:basedOn w:val="Standard"/>
+    <w:basedOn w:val="Normal"/>
     <w:semiHidden/>
     <w:rPr>
       <w:rFonts w:ascii="Tahoma" w:hAnsi="Tahoma" w:cs="Tahoma"/>
@@ -15752,10 +16599,10 @@
       <w:szCs w:val="16"/>
     </w:rPr>
   </w:style>
-  <w:style w:type="paragraph" w:styleId="z-Formularbeginn">
+  <w:style w:type="paragraph" w:styleId="z-TopofForm">
     <w:name w:val="HTML Top of Form"/>
-    <w:basedOn w:val="Standard"/>
-    <w:next w:val="Standard"/>
+    <w:basedOn w:val="Normal"/>
+    <w:next w:val="Normal"/>
     <w:hidden/>
     <w:pPr>
       <w:pBdr>
@@ -15770,10 +16617,10 @@
       <w:szCs w:val="16"/>
     </w:rPr>
   </w:style>
-  <w:style w:type="paragraph" w:styleId="z-Formularende">
+  <w:style w:type="paragraph" w:styleId="z-BottomofForm">
     <w:name w:val="HTML Bottom of Form"/>
-    <w:basedOn w:val="Standard"/>
-    <w:next w:val="Standard"/>
+    <w:basedOn w:val="Normal"/>
+    <w:next w:val="Normal"/>
     <w:hidden/>
     <w:pPr>
       <w:pBdr>
@@ -15788,17 +16635,17 @@
       <w:szCs w:val="16"/>
     </w:rPr>
   </w:style>
-  <w:style w:type="paragraph" w:styleId="Funotentext">
+  <w:style w:type="paragraph" w:styleId="FootnoteText">
     <w:name w:val="footnote text"/>
-    <w:basedOn w:val="Standard"/>
+    <w:basedOn w:val="Normal"/>
     <w:semiHidden/>
     <w:rPr>
       <w:sz w:val="20"/>
     </w:rPr>
   </w:style>
-  <w:style w:type="character" w:styleId="Funotenzeichen">
+  <w:style w:type="character" w:styleId="FootnoteReference">
     <w:name w:val="footnote reference"/>
-    <w:basedOn w:val="Absatz-Standardschriftart"/>
+    <w:basedOn w:val="DefaultParagraphFont"/>
     <w:semiHidden/>
     <w:rPr>
       <w:vertAlign w:val="superscript"/>
@@ -15819,9 +16666,9 @@
       <w:lang w:val="de-CH" w:eastAsia="de-CH"/>
     </w:rPr>
   </w:style>
-  <w:style w:type="paragraph" w:styleId="Listenabsatz">
+  <w:style w:type="paragraph" w:styleId="ListParagraph">
     <w:name w:val="List Paragraph"/>
-    <w:basedOn w:val="Standard"/>
+    <w:basedOn w:val="Normal"/>
     <w:uiPriority w:val="34"/>
     <w:qFormat/>
     <w:pPr>
@@ -15835,7 +16682,7 @@
   </w:style>
   <w:style w:type="paragraph" w:customStyle="1" w:styleId="A1">
     <w:name w:val="A1"/>
-    <w:basedOn w:val="Standard"/>
+    <w:basedOn w:val="Normal"/>
     <w:pPr>
       <w:tabs>
         <w:tab w:val="left" w:pos="431"/>
@@ -15853,34 +16700,34 @@
       <w:lang w:eastAsia="de-DE"/>
     </w:rPr>
   </w:style>
-  <w:style w:type="character" w:styleId="Kommentarzeichen">
+  <w:style w:type="character" w:styleId="CommentReference">
     <w:name w:val="annotation reference"/>
-    <w:basedOn w:val="Absatz-Standardschriftart"/>
+    <w:basedOn w:val="DefaultParagraphFont"/>
     <w:rPr>
       <w:sz w:val="16"/>
       <w:szCs w:val="16"/>
     </w:rPr>
   </w:style>
-  <w:style w:type="paragraph" w:styleId="Kommentartext">
+  <w:style w:type="paragraph" w:styleId="CommentText">
     <w:name w:val="annotation text"/>
-    <w:basedOn w:val="Standard"/>
-    <w:link w:val="KommentartextZchn"/>
+    <w:basedOn w:val="Normal"/>
+    <w:link w:val="CommentTextChar"/>
     <w:rPr>
       <w:sz w:val="20"/>
     </w:rPr>
   </w:style>
-  <w:style w:type="character" w:customStyle="1" w:styleId="KommentartextZchn">
-    <w:name w:val="Kommentartext Zchn"/>
-    <w:basedOn w:val="Absatz-Standardschriftart"/>
-    <w:link w:val="Kommentartext"/>
+  <w:style w:type="character" w:customStyle="1" w:styleId="CommentTextChar">
+    <w:name w:val="Comment Text Char"/>
+    <w:basedOn w:val="DefaultParagraphFont"/>
+    <w:link w:val="CommentText"/>
     <w:rPr>
       <w:rFonts w:ascii="Arial" w:hAnsi="Arial"/>
     </w:rPr>
   </w:style>
   <w:style w:type="paragraph" w:customStyle="1" w:styleId="Post">
     <w:name w:val="Post"/>
-    <w:basedOn w:val="Standard"/>
-    <w:next w:val="Standard"/>
+    <w:basedOn w:val="Normal"/>
+    <w:next w:val="Normal"/>
     <w:pPr>
       <w:spacing w:after="140" w:line="200" w:lineRule="exact"/>
     </w:pPr>
@@ -15891,7 +16738,7 @@
   </w:style>
   <w:style w:type="paragraph" w:customStyle="1" w:styleId="Tabkrper49pt">
     <w:name w:val="Tabkörper 4/9pt"/>
-    <w:basedOn w:val="Standard"/>
+    <w:basedOn w:val="Normal"/>
     <w:pPr>
       <w:spacing w:before="80" w:line="200" w:lineRule="exact"/>
     </w:pPr>
@@ -15901,20 +16748,20 @@
       <w:lang w:eastAsia="de-DE"/>
     </w:rPr>
   </w:style>
-  <w:style w:type="paragraph" w:styleId="Kommentarthema">
+  <w:style w:type="paragraph" w:styleId="CommentSubject">
     <w:name w:val="annotation subject"/>
-    <w:basedOn w:val="Kommentartext"/>
-    <w:next w:val="Kommentartext"/>
-    <w:link w:val="KommentarthemaZchn"/>
+    <w:basedOn w:val="CommentText"/>
+    <w:next w:val="CommentText"/>
+    <w:link w:val="CommentSubjectChar"/>
     <w:rPr>
       <w:b/>
       <w:bCs/>
     </w:rPr>
   </w:style>
-  <w:style w:type="character" w:customStyle="1" w:styleId="KommentarthemaZchn">
-    <w:name w:val="Kommentarthema Zchn"/>
-    <w:basedOn w:val="KommentartextZchn"/>
-    <w:link w:val="Kommentarthema"/>
+  <w:style w:type="character" w:customStyle="1" w:styleId="CommentSubjectChar">
+    <w:name w:val="Comment Subject Char"/>
+    <w:basedOn w:val="CommentTextChar"/>
+    <w:link w:val="CommentSubject"/>
     <w:rPr>
       <w:rFonts w:ascii="Arial" w:hAnsi="Arial"/>
       <w:b/>
@@ -15923,7 +16770,7 @@
   </w:style>
   <w:style w:type="paragraph" w:customStyle="1" w:styleId="ZchnZchn1">
     <w:name w:val="Zchn Zchn1"/>
-    <w:basedOn w:val="Standard"/>
+    <w:basedOn w:val="Normal"/>
     <w:pPr>
       <w:spacing w:after="160" w:line="240" w:lineRule="exact"/>
     </w:pPr>
@@ -15933,10 +16780,10 @@
       <w:lang w:val="en-US"/>
     </w:rPr>
   </w:style>
-  <w:style w:type="paragraph" w:styleId="Inhaltsverzeichnisberschrift">
+  <w:style w:type="paragraph" w:styleId="TOCHeading">
     <w:name w:val="TOC Heading"/>
-    <w:basedOn w:val="berschrift1"/>
-    <w:next w:val="Standard"/>
+    <w:basedOn w:val="Heading1"/>
+    <w:next w:val="Normal"/>
     <w:uiPriority w:val="39"/>
     <w:unhideWhenUsed/>
     <w:qFormat/>
@@ -15956,10 +16803,10 @@
       <w:lang w:val="de-DE" w:eastAsia="en-US"/>
     </w:rPr>
   </w:style>
-  <w:style w:type="paragraph" w:styleId="Verzeichnis3">
+  <w:style w:type="paragraph" w:styleId="TOC3">
     <w:name w:val="toc 3"/>
-    <w:basedOn w:val="Standard"/>
-    <w:next w:val="Standard"/>
+    <w:basedOn w:val="Normal"/>
+    <w:next w:val="Normal"/>
     <w:autoRedefine/>
     <w:uiPriority w:val="39"/>
     <w:pPr>
@@ -15970,10 +16817,10 @@
       <w:sz w:val="20"/>
     </w:rPr>
   </w:style>
-  <w:style w:type="paragraph" w:styleId="Verzeichnis1">
+  <w:style w:type="paragraph" w:styleId="TOC1">
     <w:name w:val="toc 1"/>
-    <w:basedOn w:val="Standard"/>
-    <w:next w:val="Standard"/>
+    <w:basedOn w:val="Normal"/>
+    <w:next w:val="Normal"/>
     <w:autoRedefine/>
     <w:uiPriority w:val="39"/>
     <w:unhideWhenUsed/>
@@ -15990,10 +16837,10 @@
       <w:sz w:val="20"/>
     </w:rPr>
   </w:style>
-  <w:style w:type="paragraph" w:styleId="Verzeichnis2">
+  <w:style w:type="paragraph" w:styleId="TOC2">
     <w:name w:val="toc 2"/>
-    <w:basedOn w:val="Standard"/>
-    <w:next w:val="Standard"/>
+    <w:basedOn w:val="Normal"/>
+    <w:next w:val="Normal"/>
     <w:autoRedefine/>
     <w:uiPriority w:val="39"/>
     <w:unhideWhenUsed/>
@@ -16007,10 +16854,10 @@
       <w:sz w:val="20"/>
     </w:rPr>
   </w:style>
-  <w:style w:type="paragraph" w:styleId="Verzeichnis4">
+  <w:style w:type="paragraph" w:styleId="TOC4">
     <w:name w:val="toc 4"/>
-    <w:basedOn w:val="Standard"/>
-    <w:next w:val="Standard"/>
+    <w:basedOn w:val="Normal"/>
+    <w:next w:val="Normal"/>
     <w:autoRedefine/>
     <w:uiPriority w:val="39"/>
     <w:unhideWhenUsed/>
@@ -16022,10 +16869,10 @@
       <w:sz w:val="20"/>
     </w:rPr>
   </w:style>
-  <w:style w:type="paragraph" w:styleId="Verzeichnis5">
+  <w:style w:type="paragraph" w:styleId="TOC5">
     <w:name w:val="toc 5"/>
-    <w:basedOn w:val="Standard"/>
-    <w:next w:val="Standard"/>
+    <w:basedOn w:val="Normal"/>
+    <w:next w:val="Normal"/>
     <w:autoRedefine/>
     <w:uiPriority w:val="39"/>
     <w:unhideWhenUsed/>
@@ -16037,10 +16884,10 @@
       <w:sz w:val="20"/>
     </w:rPr>
   </w:style>
-  <w:style w:type="paragraph" w:styleId="Verzeichnis6">
+  <w:style w:type="paragraph" w:styleId="TOC6">
     <w:name w:val="toc 6"/>
-    <w:basedOn w:val="Standard"/>
-    <w:next w:val="Standard"/>
+    <w:basedOn w:val="Normal"/>
+    <w:next w:val="Normal"/>
     <w:autoRedefine/>
     <w:uiPriority w:val="39"/>
     <w:unhideWhenUsed/>
@@ -16052,10 +16899,10 @@
       <w:sz w:val="20"/>
     </w:rPr>
   </w:style>
-  <w:style w:type="paragraph" w:styleId="Verzeichnis7">
+  <w:style w:type="paragraph" w:styleId="TOC7">
     <w:name w:val="toc 7"/>
-    <w:basedOn w:val="Standard"/>
-    <w:next w:val="Standard"/>
+    <w:basedOn w:val="Normal"/>
+    <w:next w:val="Normal"/>
     <w:autoRedefine/>
     <w:uiPriority w:val="39"/>
     <w:unhideWhenUsed/>
@@ -16067,10 +16914,10 @@
       <w:sz w:val="20"/>
     </w:rPr>
   </w:style>
-  <w:style w:type="paragraph" w:styleId="Verzeichnis8">
+  <w:style w:type="paragraph" w:styleId="TOC8">
     <w:name w:val="toc 8"/>
-    <w:basedOn w:val="Standard"/>
-    <w:next w:val="Standard"/>
+    <w:basedOn w:val="Normal"/>
+    <w:next w:val="Normal"/>
     <w:autoRedefine/>
     <w:uiPriority w:val="39"/>
     <w:unhideWhenUsed/>
@@ -16082,10 +16929,10 @@
       <w:sz w:val="20"/>
     </w:rPr>
   </w:style>
-  <w:style w:type="paragraph" w:styleId="Verzeichnis9">
+  <w:style w:type="paragraph" w:styleId="TOC9">
     <w:name w:val="toc 9"/>
-    <w:basedOn w:val="Standard"/>
-    <w:next w:val="Standard"/>
+    <w:basedOn w:val="Normal"/>
+    <w:next w:val="Normal"/>
     <w:autoRedefine/>
     <w:uiPriority w:val="39"/>
     <w:unhideWhenUsed/>
@@ -16099,7 +16946,7 @@
   </w:style>
   <w:style w:type="character" w:styleId="Hyperlink">
     <w:name w:val="Hyperlink"/>
-    <w:basedOn w:val="Absatz-Standardschriftart"/>
+    <w:basedOn w:val="DefaultParagraphFont"/>
     <w:uiPriority w:val="99"/>
     <w:unhideWhenUsed/>
     <w:rPr>
@@ -16107,9 +16954,9 @@
       <w:u w:val="single"/>
     </w:rPr>
   </w:style>
-  <w:style w:type="paragraph" w:styleId="StandardWeb">
+  <w:style w:type="paragraph" w:styleId="NormalWeb">
     <w:name w:val="Normal (Web)"/>
-    <w:basedOn w:val="Standard"/>
+    <w:basedOn w:val="Normal"/>
     <w:uiPriority w:val="99"/>
     <w:unhideWhenUsed/>
     <w:pPr>
@@ -16120,10 +16967,10 @@
       <w:szCs w:val="24"/>
     </w:rPr>
   </w:style>
-  <w:style w:type="character" w:customStyle="1" w:styleId="berschrift4Zchn">
-    <w:name w:val="Überschrift 4 Zchn"/>
-    <w:basedOn w:val="Absatz-Standardschriftart"/>
-    <w:link w:val="berschrift4"/>
+  <w:style w:type="character" w:customStyle="1" w:styleId="Heading4Char">
+    <w:name w:val="Heading 4 Char"/>
+    <w:basedOn w:val="DefaultParagraphFont"/>
+    <w:link w:val="Heading4"/>
     <w:semiHidden/>
     <w:rPr>
       <w:rFonts w:asciiTheme="majorHAnsi" w:eastAsiaTheme="majorEastAsia" w:hAnsiTheme="majorHAnsi" w:cstheme="majorBidi"/>
@@ -16134,10 +16981,10 @@
       <w:lang w:val="de-CH" w:eastAsia="de-CH"/>
     </w:rPr>
   </w:style>
-  <w:style w:type="character" w:customStyle="1" w:styleId="berschrift5Zchn">
-    <w:name w:val="Überschrift 5 Zchn"/>
-    <w:basedOn w:val="Absatz-Standardschriftart"/>
-    <w:link w:val="berschrift5"/>
+  <w:style w:type="character" w:customStyle="1" w:styleId="Heading5Char">
+    <w:name w:val="Heading 5 Char"/>
+    <w:basedOn w:val="DefaultParagraphFont"/>
+    <w:link w:val="Heading5"/>
     <w:semiHidden/>
     <w:rPr>
       <w:rFonts w:asciiTheme="majorHAnsi" w:eastAsiaTheme="majorEastAsia" w:hAnsiTheme="majorHAnsi" w:cstheme="majorBidi"/>
@@ -16146,10 +16993,10 @@
       <w:lang w:val="de-CH" w:eastAsia="de-CH"/>
     </w:rPr>
   </w:style>
-  <w:style w:type="character" w:customStyle="1" w:styleId="berschrift6Zchn">
-    <w:name w:val="Überschrift 6 Zchn"/>
-    <w:basedOn w:val="Absatz-Standardschriftart"/>
-    <w:link w:val="berschrift6"/>
+  <w:style w:type="character" w:customStyle="1" w:styleId="Heading6Char">
+    <w:name w:val="Heading 6 Char"/>
+    <w:basedOn w:val="DefaultParagraphFont"/>
+    <w:link w:val="Heading6"/>
     <w:semiHidden/>
     <w:rPr>
       <w:rFonts w:asciiTheme="majorHAnsi" w:eastAsiaTheme="majorEastAsia" w:hAnsiTheme="majorHAnsi" w:cstheme="majorBidi"/>
@@ -16158,10 +17005,10 @@
       <w:lang w:val="de-CH" w:eastAsia="de-CH"/>
     </w:rPr>
   </w:style>
-  <w:style w:type="character" w:customStyle="1" w:styleId="berschrift7Zchn">
-    <w:name w:val="Überschrift 7 Zchn"/>
-    <w:basedOn w:val="Absatz-Standardschriftart"/>
-    <w:link w:val="berschrift7"/>
+  <w:style w:type="character" w:customStyle="1" w:styleId="Heading7Char">
+    <w:name w:val="Heading 7 Char"/>
+    <w:basedOn w:val="DefaultParagraphFont"/>
+    <w:link w:val="Heading7"/>
     <w:semiHidden/>
     <w:rPr>
       <w:rFonts w:asciiTheme="majorHAnsi" w:eastAsiaTheme="majorEastAsia" w:hAnsiTheme="majorHAnsi" w:cstheme="majorBidi"/>
@@ -16172,10 +17019,10 @@
       <w:lang w:val="de-CH" w:eastAsia="de-CH"/>
     </w:rPr>
   </w:style>
-  <w:style w:type="character" w:customStyle="1" w:styleId="berschrift8Zchn">
-    <w:name w:val="Überschrift 8 Zchn"/>
-    <w:basedOn w:val="Absatz-Standardschriftart"/>
-    <w:link w:val="berschrift8"/>
+  <w:style w:type="character" w:customStyle="1" w:styleId="Heading8Char">
+    <w:name w:val="Heading 8 Char"/>
+    <w:basedOn w:val="DefaultParagraphFont"/>
+    <w:link w:val="Heading8"/>
     <w:semiHidden/>
     <w:rPr>
       <w:rFonts w:asciiTheme="majorHAnsi" w:eastAsiaTheme="majorEastAsia" w:hAnsiTheme="majorHAnsi" w:cstheme="majorBidi"/>
@@ -16185,10 +17032,10 @@
       <w:lang w:val="de-CH" w:eastAsia="de-CH"/>
     </w:rPr>
   </w:style>
-  <w:style w:type="character" w:customStyle="1" w:styleId="berschrift9Zchn">
-    <w:name w:val="Überschrift 9 Zchn"/>
-    <w:basedOn w:val="Absatz-Standardschriftart"/>
-    <w:link w:val="berschrift9"/>
+  <w:style w:type="character" w:customStyle="1" w:styleId="Heading9Char">
+    <w:name w:val="Heading 9 Char"/>
+    <w:basedOn w:val="DefaultParagraphFont"/>
+    <w:link w:val="Heading9"/>
     <w:semiHidden/>
     <w:rPr>
       <w:rFonts w:asciiTheme="majorHAnsi" w:eastAsiaTheme="majorEastAsia" w:hAnsiTheme="majorHAnsi" w:cstheme="majorBidi"/>
@@ -16200,10 +17047,10 @@
       <w:lang w:val="de-CH" w:eastAsia="de-CH"/>
     </w:rPr>
   </w:style>
-  <w:style w:type="character" w:customStyle="1" w:styleId="berschrift3Zchn">
-    <w:name w:val="Überschrift 3 Zchn"/>
-    <w:basedOn w:val="Absatz-Standardschriftart"/>
-    <w:link w:val="berschrift3"/>
+  <w:style w:type="character" w:customStyle="1" w:styleId="Heading3Char">
+    <w:name w:val="Heading 3 Char"/>
+    <w:basedOn w:val="DefaultParagraphFont"/>
+    <w:link w:val="Heading3"/>
     <w:rPr>
       <w:rFonts w:ascii="Arial" w:hAnsi="Arial" w:cs="Arial"/>
       <w:b/>
@@ -16215,7 +17062,7 @@
   </w:style>
   <w:style w:type="paragraph" w:customStyle="1" w:styleId="AllgemeineMassnahme">
     <w:name w:val="AllgemeineMassnahme"/>
-    <w:basedOn w:val="Standard"/>
+    <w:basedOn w:val="Normal"/>
     <w:qFormat/>
     <w:pPr>
       <w:spacing w:before="60"/>
@@ -16228,7 +17075,7 @@
   </w:style>
   <w:style w:type="paragraph" w:customStyle="1" w:styleId="Gremium">
     <w:name w:val="Gremium"/>
-    <w:basedOn w:val="Standard"/>
+    <w:basedOn w:val="Normal"/>
     <w:qFormat/>
     <w:pPr>
       <w:keepNext/>
@@ -16268,9 +17115,9 @@
       <w:lang w:val="de-CH" w:eastAsia="de-DE"/>
     </w:rPr>
   </w:style>
-  <w:style w:type="character" w:styleId="Fett">
+  <w:style w:type="character" w:styleId="Strong">
     <w:name w:val="Strong"/>
-    <w:basedOn w:val="Absatz-Standardschriftart"/>
+    <w:basedOn w:val="DefaultParagraphFont"/>
     <w:qFormat/>
     <w:rsid w:val="00C22DBF"/>
     <w:rPr>
@@ -16278,10 +17125,10 @@
       <w:bCs/>
     </w:rPr>
   </w:style>
-  <w:style w:type="character" w:customStyle="1" w:styleId="berschrift2Zchn">
-    <w:name w:val="Überschrift 2 Zchn"/>
-    <w:basedOn w:val="Absatz-Standardschriftart"/>
-    <w:link w:val="berschrift2"/>
+  <w:style w:type="character" w:customStyle="1" w:styleId="Heading2Char">
+    <w:name w:val="Heading 2 Char"/>
+    <w:basedOn w:val="DefaultParagraphFont"/>
+    <w:link w:val="Heading2"/>
     <w:rsid w:val="00E91B27"/>
     <w:rPr>
       <w:rFonts w:ascii="Arial" w:hAnsi="Arial" w:cs="Arial"/>
@@ -16294,10 +17141,10 @@
       <w:lang w:val="de-CH" w:eastAsia="de-CH"/>
     </w:rPr>
   </w:style>
-  <w:style w:type="character" w:customStyle="1" w:styleId="berschrift1Zchn">
-    <w:name w:val="Überschrift 1 Zchn"/>
-    <w:basedOn w:val="Absatz-Standardschriftart"/>
-    <w:link w:val="berschrift1"/>
+  <w:style w:type="character" w:customStyle="1" w:styleId="Heading1Char">
+    <w:name w:val="Heading 1 Char"/>
+    <w:basedOn w:val="DefaultParagraphFont"/>
+    <w:link w:val="Heading1"/>
     <w:rsid w:val="00AD55C2"/>
     <w:rPr>
       <w:rFonts w:ascii="Arial" w:hAnsi="Arial" w:cs="Arial"/>
@@ -16309,9 +17156,9 @@
       <w:lang w:val="de-CH" w:eastAsia="de-CH"/>
     </w:rPr>
   </w:style>
-  <w:style w:type="character" w:styleId="NichtaufgelsteErwhnung">
+  <w:style w:type="character" w:styleId="UnresolvedMention">
     <w:name w:val="Unresolved Mention"/>
-    <w:basedOn w:val="Absatz-Standardschriftart"/>
+    <w:basedOn w:val="DefaultParagraphFont"/>
     <w:uiPriority w:val="99"/>
     <w:semiHidden/>
     <w:unhideWhenUsed/>
@@ -16321,9 +17168,9 @@
       <w:shd w:val="clear" w:color="auto" w:fill="E1DFDD"/>
     </w:rPr>
   </w:style>
-  <w:style w:type="table" w:styleId="Tabellenraster">
+  <w:style w:type="table" w:styleId="TableGrid">
     <w:name w:val="Table Grid"/>
-    <w:basedOn w:val="NormaleTabelle"/>
+    <w:basedOn w:val="TableNormal"/>
     <w:rsid w:val="0039385B"/>
     <w:tblPr>
       <w:tblBorders>

</xml_diff>

<commit_message>
feat: add different selection according to filter #BKDO-3693
</commit_message>
<xml_diff>
--- a/src/Bk.APG.Api/Templates/Appendix_FederalCouncil_French.docx
+++ b/src/Bk.APG.Api/Templates/Appendix_FederalCouncil_French.docx
@@ -9,7 +9,7 @@
         <w:rPr>
           <w:rFonts w:ascii="Times New Roman" w:hAnsi="Times New Roman"/>
           <w:szCs w:val="15"/>
-          <w:lang w:val="fr-CH"/>
+          <w:lang w:val="en-US"/>
         </w:rPr>
       </w:pPr>
       <w:r>
@@ -32,7 +32,7 @@
         <w:rPr>
           <w:rFonts w:ascii="Times New Roman" w:hAnsi="Times New Roman"/>
           <w:szCs w:val="15"/>
-          <w:lang w:val="fr-CH"/>
+          <w:lang w:val="en-US"/>
         </w:rPr>
         <w:instrText xml:space="preserve"> FORMTEXT </w:instrText>
       </w:r>
@@ -53,7 +53,7 @@
         <w:rPr>
           <w:rFonts w:ascii="Times New Roman" w:hAnsi="Times New Roman"/>
           <w:szCs w:val="15"/>
-          <w:lang w:val="fr-CH"/>
+          <w:lang w:val="en-US"/>
         </w:rPr>
         <w:t>Chancellerie fédérale ChF</w:t>
       </w:r>
@@ -68,9 +68,106 @@
         <w:rPr>
           <w:rFonts w:ascii="Times New Roman" w:hAnsi="Times New Roman"/>
           <w:szCs w:val="15"/>
-          <w:lang w:val="fr-CH"/>
+          <w:lang w:val="en-US"/>
         </w:rPr>
         <w:t xml:space="preserve"> </w:t>
+      </w:r>
+    </w:p>
+    <w:p>
+      <w:pPr>
+        <w:pBdr>
+          <w:bottom w:val="single" w:sz="4" w:space="1" w:color="auto"/>
+        </w:pBdr>
+        <w:jc w:val="both"/>
+        <w:rPr>
+          <w:rFonts w:ascii="Times New Roman" w:hAnsi="Times New Roman"/>
+          <w:b/>
+          <w:bCs/>
+          <w:szCs w:val="24"/>
+          <w:lang w:val="en-US"/>
+        </w:rPr>
+      </w:pPr>
+      <w:r>
+        <w:rPr>
+          <w:rFonts w:ascii="Times New Roman" w:hAnsi="Times New Roman"/>
+          <w:szCs w:val="24"/>
+          <w:lang w:val="en-US"/>
+        </w:rPr>
+        <w:t xml:space="preserve">&lt;&lt;if </w:t>
+      </w:r>
+      <w:r>
+        <w:rPr>
+          <w:rFonts w:ascii="Times New Roman" w:hAnsi="Times New Roman"/>
+          <w:szCs w:val="24"/>
+          <w:lang w:val="en-US"/>
+        </w:rPr>
+        <w:t>[!</w:t>
+      </w:r>
+      <w:r>
+        <w:rPr>
+          <w:rFonts w:ascii="Times New Roman" w:hAnsi="Times New Roman"/>
+          <w:szCs w:val="24"/>
+          <w:lang w:val="en-US"/>
+        </w:rPr>
+        <w:t>appendixReport.OnlyReleased]&gt;&gt;</w:t>
+      </w:r>
+      <w:r>
+        <w:rPr>
+          <w:rFonts w:ascii="Times New Roman" w:hAnsi="Times New Roman"/>
+          <w:b/>
+          <w:bCs/>
+          <w:szCs w:val="24"/>
+          <w:highlight w:val="yellow"/>
+          <w:lang w:val="en-US"/>
+        </w:rPr>
+        <w:t>Document de travail</w:t>
+      </w:r>
+      <w:r>
+        <w:rPr>
+          <w:rFonts w:ascii="Times New Roman" w:hAnsi="Times New Roman"/>
+          <w:b/>
+          <w:bCs/>
+          <w:szCs w:val="24"/>
+          <w:highlight w:val="yellow"/>
+          <w:lang w:val="en-US"/>
+        </w:rPr>
+        <w:t>!</w:t>
+      </w:r>
+    </w:p>
+    <w:p>
+      <w:pPr>
+        <w:pBdr>
+          <w:bottom w:val="single" w:sz="4" w:space="1" w:color="auto"/>
+        </w:pBdr>
+        <w:jc w:val="both"/>
+        <w:rPr>
+          <w:rFonts w:ascii="Times New Roman" w:hAnsi="Times New Roman"/>
+          <w:b/>
+          <w:bCs/>
+          <w:szCs w:val="24"/>
+          <w:lang w:val="en-US"/>
+        </w:rPr>
+      </w:pPr>
+    </w:p>
+    <w:p>
+      <w:pPr>
+        <w:pBdr>
+          <w:bottom w:val="single" w:sz="4" w:space="1" w:color="auto"/>
+        </w:pBdr>
+        <w:jc w:val="both"/>
+        <w:rPr>
+          <w:rFonts w:ascii="Times New Roman" w:hAnsi="Times New Roman"/>
+          <w:szCs w:val="24"/>
+          <w:lang w:val="en-US"/>
+        </w:rPr>
+      </w:pPr>
+      <w:r>
+        <w:rPr>
+          <w:rFonts w:ascii="Times New Roman" w:hAnsi="Times New Roman"/>
+          <w:szCs w:val="24"/>
+          <w:lang w:val="en-US"/>
+        </w:rPr>
+        <w:t>&lt;&lt;/if&gt;&gt;</w:t>
       </w:r>
     </w:p>
     <w:p>
@@ -6944,17 +7041,7 @@
           <w:szCs w:val="24"/>
           <w:lang w:val="en-US"/>
         </w:rPr>
-        <w:t>C</w:t>
-      </w:r>
-      <w:r>
-        <w:rPr>
-          <w:rFonts w:ascii="Times New Roman" w:hAnsi="Times New Roman"/>
-          <w:bCs/>
-          <w:sz w:val="24"/>
-          <w:szCs w:val="24"/>
-          <w:lang w:val="en-US"/>
-        </w:rPr>
-        <w:t>ommunautés francophone et italophone non représentées</w:t>
+        <w:t>Communautés francophone et italophone non représentées</w:t>
       </w:r>
       <w:r>
         <w:rPr>
@@ -6974,37 +7061,7 @@
           <w:szCs w:val="24"/>
           <w:lang w:val="en-US"/>
         </w:rPr>
-        <w:t xml:space="preserve">Communauté </w:t>
-      </w:r>
-      <w:r>
-        <w:rPr>
-          <w:rFonts w:ascii="Times New Roman" w:hAnsi="Times New Roman"/>
-          <w:bCs/>
-          <w:sz w:val="24"/>
-          <w:szCs w:val="24"/>
-          <w:lang w:val="en-US"/>
-        </w:rPr>
-        <w:t>franco</w:t>
-      </w:r>
-      <w:r>
-        <w:rPr>
-          <w:rFonts w:ascii="Times New Roman" w:hAnsi="Times New Roman"/>
-          <w:bCs/>
-          <w:sz w:val="24"/>
-          <w:szCs w:val="24"/>
-          <w:lang w:val="en-US"/>
-        </w:rPr>
-        <w:t>phone non représentée</w:t>
-      </w:r>
-      <w:r>
-        <w:rPr>
-          <w:rFonts w:ascii="Times New Roman" w:hAnsi="Times New Roman"/>
-          <w:bCs/>
-          <w:sz w:val="24"/>
-          <w:szCs w:val="24"/>
-          <w:lang w:val="en-US"/>
-        </w:rPr>
-        <w:t xml:space="preserve"> </w:t>
+        <w:t xml:space="preserve">Communauté francophone non représentée </w:t>
       </w:r>
       <w:r>
         <w:rPr>
@@ -7024,17 +7081,7 @@
           <w:szCs w:val="24"/>
           <w:lang w:val="en-US"/>
         </w:rPr>
-        <w:t>C</w:t>
-      </w:r>
-      <w:r>
-        <w:rPr>
-          <w:rFonts w:ascii="Times New Roman" w:hAnsi="Times New Roman"/>
-          <w:bCs/>
-          <w:sz w:val="24"/>
-          <w:szCs w:val="24"/>
-          <w:lang w:val="en-US"/>
-        </w:rPr>
-        <w:t>ommunauté italophone non représentée</w:t>
+        <w:t>Communauté italophone non représentée</w:t>
       </w:r>
       <w:r>
         <w:rPr>
@@ -7612,29 +7659,7 @@
           <w:szCs w:val="24"/>
           <w:lang w:val="en-US" w:eastAsia="de-DE"/>
         </w:rPr>
-        <w:t>: &lt;&lt;[committee.memberCount]&gt;&gt; membre</w:t>
-      </w:r>
-      <w:r>
-        <w:rPr>
-          <w:rFonts w:ascii="Times New Roman" w:eastAsia="Times New Roman" w:hAnsi="Times New Roman"/>
-          <w:i/>
-          <w:iCs/>
-          <w:sz w:val="24"/>
-          <w:szCs w:val="24"/>
-          <w:lang w:val="en-US" w:eastAsia="de-DE"/>
-        </w:rPr>
-        <w:t>/</w:t>
-      </w:r>
-      <w:r>
-        <w:rPr>
-          <w:rFonts w:ascii="Times New Roman" w:eastAsia="Times New Roman" w:hAnsi="Times New Roman"/>
-          <w:i/>
-          <w:iCs/>
-          <w:sz w:val="24"/>
-          <w:szCs w:val="24"/>
-          <w:lang w:val="en-US" w:eastAsia="de-DE"/>
-        </w:rPr>
-        <w:t>s</w:t>
+        <w:t>: &lt;&lt;[committee.memberCount]&gt;&gt; membre/s</w:t>
       </w:r>
     </w:p>
     <w:p>
@@ -16374,6 +16399,7 @@
   <w:style w:type="character" w:default="1" w:styleId="Absatz-Standardschriftart">
     <w:name w:val="Default Paragraph Font"/>
     <w:uiPriority w:val="1"/>
+    <w:semiHidden/>
     <w:unhideWhenUsed/>
   </w:style>
   <w:style w:type="table" w:default="1" w:styleId="NormaleTabelle">

</xml_diff>